<commit_message>
Add annual KPI goals
</commit_message>
<xml_diff>
--- a/reports/CPL_Master_Report.docx
+++ b/reports/CPL_Master_Report.docx
@@ -1191,7 +1191,7 @@
                 <w:sz w:val="20"/>
                 <w:szCs w:val="20"/>
               </w:rPr>
-              <w:t xml:space="preserve">—</w:t>
+              <w:t xml:space="preserve">1</w:t>
             </w:r>
           </w:p>
         </w:tc>
@@ -1224,7 +1224,7 @@
                 <w:sz w:val="20"/>
                 <w:szCs w:val="20"/>
               </w:rPr>
-              <w:t xml:space="preserve">—</w:t>
+              <w:t xml:space="preserve">1</w:t>
             </w:r>
           </w:p>
         </w:tc>
@@ -1257,7 +1257,7 @@
                 <w:sz w:val="20"/>
                 <w:szCs w:val="20"/>
               </w:rPr>
-              <w:t xml:space="preserve">—</w:t>
+              <w:t xml:space="preserve">1</w:t>
             </w:r>
           </w:p>
         </w:tc>
@@ -1727,7 +1727,7 @@
                 <w:sz w:val="20"/>
                 <w:szCs w:val="20"/>
               </w:rPr>
-              <w:t xml:space="preserve">—</w:t>
+              <w:t xml:space="preserve">2</w:t>
             </w:r>
           </w:p>
         </w:tc>
@@ -1760,7 +1760,7 @@
                 <w:sz w:val="20"/>
                 <w:szCs w:val="20"/>
               </w:rPr>
-              <w:t xml:space="preserve">—</w:t>
+              <w:t xml:space="preserve">2</w:t>
             </w:r>
           </w:p>
         </w:tc>
@@ -1793,7 +1793,7 @@
                 <w:sz w:val="20"/>
                 <w:szCs w:val="20"/>
               </w:rPr>
-              <w:t xml:space="preserve">—</w:t>
+              <w:t xml:space="preserve">3</w:t>
             </w:r>
           </w:p>
         </w:tc>
@@ -2263,7 +2263,7 @@
                 <w:sz w:val="20"/>
                 <w:szCs w:val="20"/>
               </w:rPr>
-              <w:t xml:space="preserve">20000</w:t>
+              <w:t xml:space="preserve">1</w:t>
             </w:r>
           </w:p>
         </w:tc>
@@ -2296,7 +2296,7 @@
                 <w:sz w:val="20"/>
                 <w:szCs w:val="20"/>
               </w:rPr>
-              <w:t xml:space="preserve">—</w:t>
+              <w:t xml:space="preserve">1</w:t>
             </w:r>
           </w:p>
         </w:tc>
@@ -2329,7 +2329,7 @@
                 <w:sz w:val="20"/>
                 <w:szCs w:val="20"/>
               </w:rPr>
-              <w:t xml:space="preserve">—</w:t>
+              <w:t xml:space="preserve">1</w:t>
             </w:r>
           </w:p>
         </w:tc>
@@ -2799,7 +2799,7 @@
                 <w:sz w:val="20"/>
                 <w:szCs w:val="20"/>
               </w:rPr>
-              <w:t xml:space="preserve">250</w:t>
+              <w:t xml:space="preserve">100</w:t>
             </w:r>
           </w:p>
         </w:tc>
@@ -2832,7 +2832,7 @@
                 <w:sz w:val="20"/>
                 <w:szCs w:val="20"/>
               </w:rPr>
-              <w:t xml:space="preserve">—</w:t>
+              <w:t xml:space="preserve">250</w:t>
             </w:r>
           </w:p>
         </w:tc>
@@ -2865,7 +2865,7 @@
                 <w:sz w:val="20"/>
                 <w:szCs w:val="20"/>
               </w:rPr>
-              <w:t xml:space="preserve">—</w:t>
+              <w:t xml:space="preserve">400</w:t>
             </w:r>
           </w:p>
         </w:tc>
@@ -5161,7 +5161,7 @@
                 <w:sz w:val="20"/>
                 <w:szCs w:val="20"/>
               </w:rPr>
-              <w:t xml:space="preserve">1000</w:t>
+              <w:t xml:space="preserve">225</w:t>
             </w:r>
           </w:p>
         </w:tc>
@@ -5194,7 +5194,7 @@
                 <w:sz w:val="20"/>
                 <w:szCs w:val="20"/>
               </w:rPr>
-              <w:t xml:space="preserve">650</w:t>
+              <w:t xml:space="preserve">100</w:t>
             </w:r>
           </w:p>
         </w:tc>
@@ -5227,7 +5227,7 @@
                 <w:sz w:val="20"/>
                 <w:szCs w:val="20"/>
               </w:rPr>
-              <w:t xml:space="preserve">—</w:t>
+              <w:t xml:space="preserve">150</w:t>
             </w:r>
           </w:p>
         </w:tc>
@@ -5697,7 +5697,7 @@
                 <w:sz w:val="20"/>
                 <w:szCs w:val="20"/>
               </w:rPr>
-              <w:t xml:space="preserve">25</w:t>
+              <w:t xml:space="preserve">15</w:t>
             </w:r>
           </w:p>
         </w:tc>
@@ -5730,7 +5730,7 @@
                 <w:sz w:val="20"/>
                 <w:szCs w:val="20"/>
               </w:rPr>
-              <w:t xml:space="preserve">15</w:t>
+              <w:t xml:space="preserve">10</w:t>
             </w:r>
           </w:p>
         </w:tc>
@@ -5763,7 +5763,7 @@
                 <w:sz w:val="20"/>
                 <w:szCs w:val="20"/>
               </w:rPr>
-              <w:t xml:space="preserve">—</w:t>
+              <w:t xml:space="preserve">15</w:t>
             </w:r>
           </w:p>
         </w:tc>
@@ -6233,7 +6233,7 @@
                 <w:sz w:val="20"/>
                 <w:szCs w:val="20"/>
               </w:rPr>
-              <w:t xml:space="preserve">250</w:t>
+              <w:t xml:space="preserve">1</w:t>
             </w:r>
           </w:p>
         </w:tc>
@@ -6266,7 +6266,7 @@
                 <w:sz w:val="20"/>
                 <w:szCs w:val="20"/>
               </w:rPr>
-              <w:t xml:space="preserve">20</w:t>
+              <w:t xml:space="preserve">1</w:t>
             </w:r>
           </w:p>
         </w:tc>
@@ -6299,7 +6299,7 @@
                 <w:sz w:val="20"/>
                 <w:szCs w:val="20"/>
               </w:rPr>
-              <w:t xml:space="preserve">—</w:t>
+              <w:t xml:space="preserve">1</w:t>
             </w:r>
           </w:p>
         </w:tc>
@@ -6769,7 +6769,7 @@
                 <w:sz w:val="20"/>
                 <w:szCs w:val="20"/>
               </w:rPr>
-              <w:t xml:space="preserve">250</w:t>
+              <w:t xml:space="preserve">0</w:t>
             </w:r>
           </w:p>
         </w:tc>
@@ -6802,7 +6802,7 @@
                 <w:sz w:val="20"/>
                 <w:szCs w:val="20"/>
               </w:rPr>
-              <w:t xml:space="preserve">—</w:t>
+              <w:t xml:space="preserve">1</w:t>
             </w:r>
           </w:p>
         </w:tc>
@@ -6835,7 +6835,7 @@
                 <w:sz w:val="20"/>
                 <w:szCs w:val="20"/>
               </w:rPr>
-              <w:t xml:space="preserve">—</w:t>
+              <w:t xml:space="preserve">1</w:t>
             </w:r>
           </w:p>
         </w:tc>
@@ -7477,7 +7477,7 @@
                 <w:sz w:val="20"/>
                 <w:szCs w:val="20"/>
               </w:rPr>
-              <w:t xml:space="preserve">250000</w:t>
+              <w:t xml:space="preserve">250,000</w:t>
             </w:r>
           </w:p>
         </w:tc>
@@ -7510,7 +7510,7 @@
                 <w:sz w:val="20"/>
                 <w:szCs w:val="20"/>
               </w:rPr>
-              <w:t xml:space="preserve">35000</w:t>
+              <w:t xml:space="preserve">40,000</w:t>
             </w:r>
           </w:p>
         </w:tc>
@@ -7543,7 +7543,7 @@
                 <w:sz w:val="20"/>
                 <w:szCs w:val="20"/>
               </w:rPr>
-              <w:t xml:space="preserve">—</w:t>
+              <w:t xml:space="preserve">80,000</w:t>
             </w:r>
           </w:p>
         </w:tc>
@@ -8024,7 +8024,7 @@
                 <w:sz w:val="20"/>
                 <w:szCs w:val="20"/>
               </w:rPr>
-              <w:t xml:space="preserve">—</w:t>
+              <w:t xml:space="preserve">750,000</w:t>
             </w:r>
           </w:p>
         </w:tc>
@@ -8057,7 +8057,7 @@
                 <w:sz w:val="20"/>
                 <w:szCs w:val="20"/>
               </w:rPr>
-              <w:t xml:space="preserve">85000</w:t>
+              <w:t xml:space="preserve">50,000</w:t>
             </w:r>
           </w:p>
         </w:tc>
@@ -8090,7 +8090,7 @@
                 <w:sz w:val="20"/>
                 <w:szCs w:val="20"/>
               </w:rPr>
-              <w:t xml:space="preserve">—</w:t>
+              <w:t xml:space="preserve">75,000</w:t>
             </w:r>
           </w:p>
         </w:tc>
@@ -8604,7 +8604,7 @@
                 <w:sz w:val="20"/>
                 <w:szCs w:val="20"/>
               </w:rPr>
-              <w:t xml:space="preserve">50</w:t>
+              <w:t xml:space="preserve">90</w:t>
             </w:r>
           </w:p>
         </w:tc>
@@ -8637,7 +8637,7 @@
                 <w:sz w:val="20"/>
                 <w:szCs w:val="20"/>
               </w:rPr>
-              <w:t xml:space="preserve">—</w:t>
+              <w:t xml:space="preserve">95</w:t>
             </w:r>
           </w:p>
         </w:tc>
@@ -9107,7 +9107,7 @@
                 <w:sz w:val="20"/>
                 <w:szCs w:val="20"/>
               </w:rPr>
-              <w:t xml:space="preserve">—</w:t>
+              <w:t xml:space="preserve">500</w:t>
             </w:r>
           </w:p>
         </w:tc>
@@ -9140,7 +9140,7 @@
                 <w:sz w:val="20"/>
                 <w:szCs w:val="20"/>
               </w:rPr>
-              <w:t xml:space="preserve">—</w:t>
+              <w:t xml:space="preserve">100</w:t>
             </w:r>
           </w:p>
         </w:tc>
@@ -9173,7 +9173,7 @@
                 <w:sz w:val="20"/>
                 <w:szCs w:val="20"/>
               </w:rPr>
-              <w:t xml:space="preserve">—</w:t>
+              <w:t xml:space="preserve">200</w:t>
             </w:r>
           </w:p>
         </w:tc>
@@ -14179,7 +14179,7 @@
                 <w:sz w:val="20"/>
                 <w:szCs w:val="20"/>
               </w:rPr>
-              <w:t xml:space="preserve">20</w:t>
+              <w:t xml:space="preserve">7.5</w:t>
             </w:r>
           </w:p>
         </w:tc>
@@ -14212,7 +14212,7 @@
                 <w:sz w:val="20"/>
                 <w:szCs w:val="20"/>
               </w:rPr>
-              <w:t xml:space="preserve">20</w:t>
+              <w:t xml:space="preserve">3</w:t>
             </w:r>
           </w:p>
         </w:tc>
@@ -14245,7 +14245,7 @@
                 <w:sz w:val="20"/>
                 <w:szCs w:val="20"/>
               </w:rPr>
-              <w:t xml:space="preserve">—</w:t>
+              <w:t xml:space="preserve">4</w:t>
             </w:r>
           </w:p>
         </w:tc>
@@ -14726,7 +14726,7 @@
                 <w:sz w:val="20"/>
                 <w:szCs w:val="20"/>
               </w:rPr>
-              <w:t xml:space="preserve">—</w:t>
+              <w:t xml:space="preserve">100</w:t>
             </w:r>
           </w:p>
         </w:tc>
@@ -14759,7 +14759,7 @@
                 <w:sz w:val="20"/>
                 <w:szCs w:val="20"/>
               </w:rPr>
-              <w:t xml:space="preserve">20</w:t>
+              <w:t xml:space="preserve">200</w:t>
             </w:r>
           </w:p>
         </w:tc>
@@ -14792,7 +14792,7 @@
                 <w:sz w:val="20"/>
                 <w:szCs w:val="20"/>
               </w:rPr>
-              <w:t xml:space="preserve">—</w:t>
+              <w:t xml:space="preserve">300</w:t>
             </w:r>
           </w:p>
         </w:tc>
@@ -15262,7 +15262,7 @@
                 <w:sz w:val="20"/>
                 <w:szCs w:val="20"/>
               </w:rPr>
-              <w:t xml:space="preserve">—</w:t>
+              <w:t xml:space="preserve">40</w:t>
             </w:r>
           </w:p>
         </w:tc>
@@ -15295,7 +15295,7 @@
                 <w:sz w:val="20"/>
                 <w:szCs w:val="20"/>
               </w:rPr>
-              <w:t xml:space="preserve">—</w:t>
+              <w:t xml:space="preserve">30</w:t>
             </w:r>
           </w:p>
         </w:tc>
@@ -15328,7 +15328,7 @@
                 <w:sz w:val="20"/>
                 <w:szCs w:val="20"/>
               </w:rPr>
-              <w:t xml:space="preserve">—</w:t>
+              <w:t xml:space="preserve">40</w:t>
             </w:r>
           </w:p>
         </w:tc>
@@ -15798,7 +15798,7 @@
                 <w:sz w:val="20"/>
                 <w:szCs w:val="20"/>
               </w:rPr>
-              <w:t xml:space="preserve">89000000</w:t>
+              <w:t xml:space="preserve">2</w:t>
             </w:r>
           </w:p>
         </w:tc>
@@ -15831,7 +15831,7 @@
                 <w:sz w:val="20"/>
                 <w:szCs w:val="20"/>
               </w:rPr>
-              <w:t xml:space="preserve">—</w:t>
+              <w:t xml:space="preserve">2</w:t>
             </w:r>
           </w:p>
         </w:tc>
@@ -15864,7 +15864,7 @@
                 <w:sz w:val="20"/>
                 <w:szCs w:val="20"/>
               </w:rPr>
-              <w:t xml:space="preserve">—</w:t>
+              <w:t xml:space="preserve">3</w:t>
             </w:r>
           </w:p>
         </w:tc>
@@ -18224,7 +18224,7 @@
                 <w:sz w:val="18"/>
                 <w:szCs w:val="18"/>
               </w:rPr>
-              <w:t xml:space="preserve">—</w:t>
+              <w:t xml:space="preserve">1</w:t>
             </w:r>
           </w:p>
         </w:tc>
@@ -18396,7 +18396,7 @@
                 <w:sz w:val="18"/>
                 <w:szCs w:val="18"/>
               </w:rPr>
-              <w:t xml:space="preserve">—</w:t>
+              <w:t xml:space="preserve">2</w:t>
             </w:r>
           </w:p>
         </w:tc>
@@ -18568,7 +18568,7 @@
                 <w:sz w:val="18"/>
                 <w:szCs w:val="18"/>
               </w:rPr>
-              <w:t xml:space="preserve">—</w:t>
+              <w:t xml:space="preserve">1</w:t>
             </w:r>
           </w:p>
         </w:tc>
@@ -18740,7 +18740,7 @@
                 <w:sz w:val="18"/>
                 <w:szCs w:val="18"/>
               </w:rPr>
-              <w:t xml:space="preserve">—</w:t>
+              <w:t xml:space="preserve">250</w:t>
             </w:r>
           </w:p>
         </w:tc>
@@ -19464,7 +19464,7 @@
                 <w:sz w:val="18"/>
                 <w:szCs w:val="18"/>
               </w:rPr>
-              <w:t xml:space="preserve">650</w:t>
+              <w:t xml:space="preserve">100</w:t>
             </w:r>
           </w:p>
         </w:tc>
@@ -19636,7 +19636,7 @@
                 <w:sz w:val="18"/>
                 <w:szCs w:val="18"/>
               </w:rPr>
-              <w:t xml:space="preserve">15</w:t>
+              <w:t xml:space="preserve">10</w:t>
             </w:r>
           </w:p>
         </w:tc>
@@ -19808,7 +19808,7 @@
                 <w:sz w:val="18"/>
                 <w:szCs w:val="18"/>
               </w:rPr>
-              <w:t xml:space="preserve">20</w:t>
+              <w:t xml:space="preserve">1</w:t>
             </w:r>
           </w:p>
         </w:tc>
@@ -19980,7 +19980,7 @@
                 <w:sz w:val="18"/>
                 <w:szCs w:val="18"/>
               </w:rPr>
-              <w:t xml:space="preserve">—</w:t>
+              <w:t xml:space="preserve">1</w:t>
             </w:r>
           </w:p>
         </w:tc>
@@ -20188,7 +20188,7 @@
                 <w:sz w:val="18"/>
                 <w:szCs w:val="18"/>
               </w:rPr>
-              <w:t xml:space="preserve">35000</w:t>
+              <w:t xml:space="preserve">40,000</w:t>
             </w:r>
           </w:p>
         </w:tc>
@@ -20360,7 +20360,7 @@
                 <w:sz w:val="18"/>
                 <w:szCs w:val="18"/>
               </w:rPr>
-              <w:t xml:space="preserve">85000</w:t>
+              <w:t xml:space="preserve">50,000</w:t>
             </w:r>
           </w:p>
         </w:tc>
@@ -20532,7 +20532,7 @@
                 <w:sz w:val="18"/>
                 <w:szCs w:val="18"/>
               </w:rPr>
-              <w:t xml:space="preserve">50</w:t>
+              <w:t xml:space="preserve">90</w:t>
             </w:r>
           </w:p>
         </w:tc>
@@ -20704,7 +20704,7 @@
                 <w:sz w:val="18"/>
                 <w:szCs w:val="18"/>
               </w:rPr>
-              <w:t xml:space="preserve">—</w:t>
+              <w:t xml:space="preserve">100</w:t>
             </w:r>
           </w:p>
         </w:tc>
@@ -22288,7 +22288,7 @@
                 <w:sz w:val="18"/>
                 <w:szCs w:val="18"/>
               </w:rPr>
-              <w:t xml:space="preserve">20</w:t>
+              <w:t xml:space="preserve">3</w:t>
             </w:r>
           </w:p>
         </w:tc>
@@ -22460,7 +22460,7 @@
                 <w:sz w:val="18"/>
                 <w:szCs w:val="18"/>
               </w:rPr>
-              <w:t xml:space="preserve">20</w:t>
+              <w:t xml:space="preserve">200</w:t>
             </w:r>
           </w:p>
         </w:tc>
@@ -22632,7 +22632,7 @@
                 <w:sz w:val="18"/>
                 <w:szCs w:val="18"/>
               </w:rPr>
-              <w:t xml:space="preserve">—</w:t>
+              <w:t xml:space="preserve">30</w:t>
             </w:r>
           </w:p>
         </w:tc>
@@ -22804,7 +22804,7 @@
                 <w:sz w:val="18"/>
                 <w:szCs w:val="18"/>
               </w:rPr>
-              <w:t xml:space="preserve">—</w:t>
+              <w:t xml:space="preserve">2</w:t>
             </w:r>
           </w:p>
         </w:tc>

</xml_diff>

<commit_message>
Daily dashboard update — 2026-07-03
</commit_message>
<xml_diff>
--- a/reports/CPL_Master_Report.docx
+++ b/reports/CPL_Master_Report.docx
@@ -141,7 +141,7 @@
           <w:szCs w:val="22"/>
           <w:rFonts w:ascii="Cambria" w:cs="Cambria" w:eastAsia="Cambria" w:hAnsi="Cambria"/>
         </w:rPr>
-        <w:t xml:space="preserve">As of July 2, 2026, the CPL initiative is ahead of schedule, with most 2025–2026 targets met or exceeded and core infrastructure nearing completion. The work has expanded student access, increased transcripted units, and established the foundation for a permanent, statewide CPL service under Vision 2030.</w:t>
+        <w:t xml:space="preserve">As of July 3, 2026, the CPL initiative is ahead of schedule, with most 2025–2026 targets met or exceeded and core infrastructure nearing completion. The work has expanded student access, increased transcripted units, and established the foundation for a permanent, statewide CPL service under Vision 2030.</w:t>
       </w:r>
     </w:p>
     <w:p>
@@ -167,7 +167,7 @@
           <w:szCs w:val="21"/>
           <w:rFonts w:ascii="Cambria" w:cs="Cambria" w:eastAsia="Cambria" w:hAnsi="Cambria"/>
         </w:rPr>
-        <w:t xml:space="preserve">48,425 cumulative students served with CPL awards, surpassing annual targets.</w:t>
+        <w:t xml:space="preserve">48,428 cumulative students served with CPL awards, surpassing annual targets.</w:t>
       </w:r>
     </w:p>
     <w:p>
@@ -221,7 +221,7 @@
           <w:szCs w:val="21"/>
           <w:rFonts w:ascii="Cambria" w:cs="Cambria" w:eastAsia="Cambria" w:hAnsi="Cambria"/>
         </w:rPr>
-        <w:t xml:space="preserve">12,622 statewide credit recommendations, driven by faculty discipline workgroups spanning high-demand fields.</w:t>
+        <w:t xml:space="preserve">12,624 statewide credit recommendations, driven by faculty discipline workgroups spanning high-demand fields.</w:t>
       </w:r>
     </w:p>
     <w:p>
@@ -424,7 +424,7 @@
                 <w:szCs w:val="20"/>
                 <w:rFonts w:ascii="Cambria" w:cs="Cambria" w:eastAsia="Cambria" w:hAnsi="Cambria"/>
               </w:rPr>
-              <w:t xml:space="preserve">48,425</w:t>
+              <w:t xml:space="preserve">48,428</w:t>
             </w:r>
           </w:p>
         </w:tc>
@@ -564,7 +564,7 @@
                 <w:szCs w:val="20"/>
                 <w:rFonts w:ascii="Cambria" w:cs="Cambria" w:eastAsia="Cambria" w:hAnsi="Cambria"/>
               </w:rPr>
-              <w:t xml:space="preserve">12,622</w:t>
+              <w:t xml:space="preserve">12,624</w:t>
             </w:r>
           </w:p>
         </w:tc>
@@ -15689,7 +15689,7 @@
                 <w:szCs w:val="20"/>
                 <w:rFonts w:ascii="Cambria" w:cs="Cambria" w:eastAsia="Cambria" w:hAnsi="Cambria"/>
               </w:rPr>
-              <w:t xml:space="preserve">RP Group Contract is being sent to the RCCD Board of Trustees on the August 2026 meeting.</w:t>
+              <w:t xml:space="preserve">The RP Group CPL Field Survey will employ a mixed-methods research study combining quantitative analysis of student outcomes with qualitative data from institutional interviews, focus groups, and/or student surveys to examine how Credit for Prior Learning influences student success and institutional effectiveness across participating California Community Colleges. The study will analyze CPL's impact on certificate and degree completion, compare outcomes between CPL recipients and non-CPL students with attention to historically underserved populations, and assess institutional implementation practices to provide evidence-based recommendations for strengthening statewide CPL implementation and promoting equitable student success.</w:t>
             </w:r>
           </w:p>
           <w:p>
@@ -17286,7 +17286,7 @@
                 <w:szCs w:val="20"/>
                 <w:rFonts w:ascii="Cambria" w:cs="Cambria" w:eastAsia="Cambria" w:hAnsi="Cambria"/>
               </w:rPr>
-              <w:t xml:space="preserve">All four Sprints or Demo Projects are well underway. Much work and effort must be placed in the Veterans Sprint and STAT efforts yet the Apprenticeship and 29 Palms MCB Sprints are exceeding expectations.</w:t>
+              <w:t xml:space="preserve">The Apprenticeship Sprint is building CPL infrastructure to convert registered apprenticeship training into college credit at scale across construction, fire science, and corrections disciplines, building on existing articulation records across 34 colleges and active partnerships with Futuro Health, DSP/DDS, Cal-JAC, Iron Workers, IBEW, and Western Carpenters. Year 1 (FY 2026–27) targets include 10,000 apprenticeship students uploaded into MAP, 200 CPL exhibits developed across 35 colleges articulating 1,000 course sections, and completion of a statewide outreach plan.</w:t>
             </w:r>
           </w:p>
           <w:p>
@@ -18662,7 +18662,7 @@
                 <w:szCs w:val="20"/>
                 <w:rFonts w:ascii="Cambria" w:cs="Cambria" w:eastAsia="Cambria" w:hAnsi="Cambria"/>
               </w:rPr>
-              <w:t xml:space="preserve">678 apprentice students documented; 6,000 units; DAS partnership active; Cal-JAC early partner for 14,000 first responders</w:t>
+              <w:t xml:space="preserve">The Apprenticeship Sprint, launched in February 2026 through the MAP Initiative, is building statewide CPL infrastructure to connect registered apprentices and journey persons with college credit across California Community Colleges. Year 1 (FY 2026–27) focuses on uploading 10,000 apprenticeship students into the MAP platform, creating 200 CPL exhibits across 1,000 articulated course sections at 35 colleges (prioritizing construction, fire science, and corrections), and completing an execution-ready statewide outreach plan for full deployment in Year 2. The Sprint builds on existing foundations—1,088 apprenticeship CPL articulation records across 34 colleges, the Cal-JAC fire-service crosswalk (12 colleges, 90 courses), active partnerships with Futuro Health, Cal-JAC, Iron Workers, IBEW, Western Carpenters, and DSP/DDS, and established policy/funding support through AB 123 and Title 5 §55050—positioning California to scale toward 70,000+ apprenticeship students and near-statewide participation by FY 2029–30.</w:t>
             </w:r>
           </w:p>
           <w:p>
@@ -30498,7 +30498,7 @@
           <w:szCs w:val="22"/>
           <w:rFonts w:ascii="Cambria" w:cs="Cambria" w:eastAsia="Cambria" w:hAnsi="Cambria"/>
         </w:rPr>
-        <w:t xml:space="preserve">The CPL Initiative has moved from pilot to scale, demonstrating measurable impact in student access, credit attainment, and system engagement. With 48,425 students served, 12,622 statewide credit recommendations, and 100 actively participating colleges, the initiative has surpassed most 2025–26 benchmarks ahead of schedule.</w:t>
+        <w:t xml:space="preserve">The CPL Initiative has moved from pilot to scale, demonstrating measurable impact in student access, credit attainment, and system engagement. With 48,428 students served, 12,624 statewide credit recommendations, and 100 actively participating colleges, the initiative has surpassed most 2025–26 benchmarks ahead of schedule.</w:t>
       </w:r>
     </w:p>
     <w:p>
@@ -30549,7 +30549,7 @@
           <w:szCs w:val="20"/>
           <w:rFonts w:ascii="Cambria" w:cs="Cambria" w:eastAsia="Cambria" w:hAnsi="Cambria"/>
         </w:rPr>
-        <w:t xml:space="preserve">July 2, 2026</w:t>
+        <w:t xml:space="preserve">July 3, 2026</w:t>
       </w:r>
     </w:p>
     <w:sectPr>
@@ -30586,7 +30586,7 @@
         <w:szCs w:val="14"/>
         <w:rFonts w:ascii="Cambria" w:cs="Cambria" w:eastAsia="Cambria" w:hAnsi="Cambria"/>
       </w:rPr>
-      <w:t xml:space="preserve">Generated July 2, 2026  |  California Community Colleges  |  MAP Initiative</w:t>
+      <w:t xml:space="preserve">Generated July 3, 2026  |  California Community Colleges  |  MAP Initiative</w:t>
     </w:r>
     <w:r>
       <w:rPr>

</xml_diff>

<commit_message>
Daily dashboard update — 2026-07-04
</commit_message>
<xml_diff>
--- a/reports/CPL_Master_Report.docx
+++ b/reports/CPL_Master_Report.docx
@@ -141,7 +141,7 @@
           <w:szCs w:val="22"/>
           <w:rFonts w:ascii="Cambria" w:cs="Cambria" w:eastAsia="Cambria" w:hAnsi="Cambria"/>
         </w:rPr>
-        <w:t xml:space="preserve">As of July 3, 2026, the CPL initiative is ahead of schedule, with most 2025–2026 targets met or exceeded and core infrastructure nearing completion. The work has expanded student access, increased transcripted units, and established the foundation for a permanent, statewide CPL service under Vision 2030.</w:t>
+        <w:t xml:space="preserve">As of July 4, 2026, the CPL initiative is ahead of schedule, with most 2025–2026 targets met or exceeded and core infrastructure nearing completion. The work has expanded student access, increased transcripted units, and established the foundation for a permanent, statewide CPL service under Vision 2030.</w:t>
       </w:r>
     </w:p>
     <w:p>
@@ -30549,7 +30549,7 @@
           <w:szCs w:val="20"/>
           <w:rFonts w:ascii="Cambria" w:cs="Cambria" w:eastAsia="Cambria" w:hAnsi="Cambria"/>
         </w:rPr>
-        <w:t xml:space="preserve">July 3, 2026</w:t>
+        <w:t xml:space="preserve">July 4, 2026</w:t>
       </w:r>
     </w:p>
     <w:sectPr>
@@ -30586,7 +30586,7 @@
         <w:szCs w:val="14"/>
         <w:rFonts w:ascii="Cambria" w:cs="Cambria" w:eastAsia="Cambria" w:hAnsi="Cambria"/>
       </w:rPr>
-      <w:t xml:space="preserve">Generated July 3, 2026  |  California Community Colleges  |  CPL Initiative</w:t>
+      <w:t xml:space="preserve">Generated July 4, 2026  |  California Community Colleges  |  CPL Initiative</w:t>
     </w:r>
     <w:r>
       <w:rPr>

</xml_diff>

<commit_message>
Daily dashboard update — 2026-07-05
</commit_message>
<xml_diff>
--- a/reports/CPL_Master_Report.docx
+++ b/reports/CPL_Master_Report.docx
@@ -141,7 +141,7 @@
           <w:szCs w:val="22"/>
           <w:rFonts w:ascii="Cambria" w:cs="Cambria" w:eastAsia="Cambria" w:hAnsi="Cambria"/>
         </w:rPr>
-        <w:t xml:space="preserve">As of July 4, 2026, the CPL initiative is ahead of schedule, with most 2025–2026 targets met or exceeded and core infrastructure nearing completion. The work has expanded student access, increased transcripted units, and established the foundation for a permanent, statewide CPL service under Vision 2030.</w:t>
+        <w:t xml:space="preserve">As of July 5, 2026, the CPL initiative is ahead of schedule, with most 2025–2026 targets met or exceeded and core infrastructure nearing completion. The work has expanded student access, increased transcripted units, and established the foundation for a permanent, statewide CPL service under Vision 2030.</w:t>
       </w:r>
     </w:p>
     <w:p>
@@ -30549,7 +30549,7 @@
           <w:szCs w:val="20"/>
           <w:rFonts w:ascii="Cambria" w:cs="Cambria" w:eastAsia="Cambria" w:hAnsi="Cambria"/>
         </w:rPr>
-        <w:t xml:space="preserve">July 4, 2026</w:t>
+        <w:t xml:space="preserve">July 5, 2026</w:t>
       </w:r>
     </w:p>
     <w:sectPr>
@@ -30586,7 +30586,7 @@
         <w:szCs w:val="14"/>
         <w:rFonts w:ascii="Cambria" w:cs="Cambria" w:eastAsia="Cambria" w:hAnsi="Cambria"/>
       </w:rPr>
-      <w:t xml:space="preserve">Generated July 4, 2026  |  California Community Colleges  |  CPL Initiative</w:t>
+      <w:t xml:space="preserve">Generated July 5, 2026  |  California Community Colleges  |  CPL Initiative</w:t>
     </w:r>
     <w:r>
       <w:rPr>

</xml_diff>

<commit_message>
Daily dashboard update — 2026-07-06
</commit_message>
<xml_diff>
--- a/reports/CPL_Master_Report.docx
+++ b/reports/CPL_Master_Report.docx
@@ -141,7 +141,7 @@
           <w:szCs w:val="22"/>
           <w:rFonts w:ascii="Cambria" w:cs="Cambria" w:eastAsia="Cambria" w:hAnsi="Cambria"/>
         </w:rPr>
-        <w:t xml:space="preserve">As of July 5, 2026, the CPL initiative is ahead of schedule, with most 2025–2026 targets met or exceeded and core infrastructure nearing completion. The work has expanded student access, increased transcripted units, and established the foundation for a permanent, statewide CPL service under Vision 2030.</w:t>
+        <w:t xml:space="preserve">As of July 6, 2026, the CPL initiative is ahead of schedule, with most 2025–2026 targets met or exceeded and core infrastructure nearing completion. The work has expanded student access, increased transcripted units, and established the foundation for a permanent, statewide CPL service under Vision 2030.</w:t>
       </w:r>
     </w:p>
     <w:p>
@@ -30549,7 +30549,7 @@
           <w:szCs w:val="20"/>
           <w:rFonts w:ascii="Cambria" w:cs="Cambria" w:eastAsia="Cambria" w:hAnsi="Cambria"/>
         </w:rPr>
-        <w:t xml:space="preserve">July 5, 2026</w:t>
+        <w:t xml:space="preserve">July 6, 2026</w:t>
       </w:r>
     </w:p>
     <w:sectPr>
@@ -30586,7 +30586,7 @@
         <w:szCs w:val="14"/>
         <w:rFonts w:ascii="Cambria" w:cs="Cambria" w:eastAsia="Cambria" w:hAnsi="Cambria"/>
       </w:rPr>
-      <w:t xml:space="preserve">Generated July 5, 2026  |  California Community Colleges  |  CPL Initiative</w:t>
+      <w:t xml:space="preserve">Generated July 6, 2026  |  California Community Colleges  |  CPL Initiative</w:t>
     </w:r>
     <w:r>
       <w:rPr>

</xml_diff>

<commit_message>
Daily dashboard update — 2026-07-07
</commit_message>
<xml_diff>
--- a/reports/CPL_Master_Report.docx
+++ b/reports/CPL_Master_Report.docx
@@ -141,7 +141,7 @@
           <w:szCs w:val="22"/>
           <w:rFonts w:ascii="Cambria" w:cs="Cambria" w:eastAsia="Cambria" w:hAnsi="Cambria"/>
         </w:rPr>
-        <w:t xml:space="preserve">As of July 6, 2026, the CPL initiative is ahead of schedule, with most 2025–2026 targets met or exceeded and core infrastructure nearing completion. The work has expanded student access, increased transcripted units, and established the foundation for a permanent, statewide CPL service under Vision 2030.</w:t>
+        <w:t xml:space="preserve">As of July 7, 2026, the CPL initiative is ahead of schedule, with most 2025–2026 targets met or exceeded and core infrastructure nearing completion. The work has expanded student access, increased transcripted units, and established the foundation for a permanent, statewide CPL service under Vision 2030.</w:t>
       </w:r>
     </w:p>
     <w:p>
@@ -167,7 +167,7 @@
           <w:szCs w:val="21"/>
           <w:rFonts w:ascii="Cambria" w:cs="Cambria" w:eastAsia="Cambria" w:hAnsi="Cambria"/>
         </w:rPr>
-        <w:t xml:space="preserve">48,450 cumulative students served with CPL awards, surpassing annual targets.</w:t>
+        <w:t xml:space="preserve">48,586 cumulative students served with CPL awards, surpassing annual targets.</w:t>
       </w:r>
     </w:p>
     <w:p>
@@ -221,7 +221,7 @@
           <w:szCs w:val="21"/>
           <w:rFonts w:ascii="Cambria" w:cs="Cambria" w:eastAsia="Cambria" w:hAnsi="Cambria"/>
         </w:rPr>
-        <w:t xml:space="preserve">12,623 statewide credit recommendations, driven by faculty discipline workgroups spanning high-demand fields.</w:t>
+        <w:t xml:space="preserve">12,639 statewide credit recommendations, driven by faculty discipline workgroups spanning high-demand fields.</w:t>
       </w:r>
     </w:p>
     <w:p>
@@ -424,7 +424,7 @@
                 <w:szCs w:val="20"/>
                 <w:rFonts w:ascii="Cambria" w:cs="Cambria" w:eastAsia="Cambria" w:hAnsi="Cambria"/>
               </w:rPr>
-              <w:t xml:space="preserve">48,450</w:t>
+              <w:t xml:space="preserve">48,586</w:t>
             </w:r>
           </w:p>
         </w:tc>
@@ -564,7 +564,7 @@
                 <w:szCs w:val="20"/>
                 <w:rFonts w:ascii="Cambria" w:cs="Cambria" w:eastAsia="Cambria" w:hAnsi="Cambria"/>
               </w:rPr>
-              <w:t xml:space="preserve">12,623</w:t>
+              <w:t xml:space="preserve">12,639</w:t>
             </w:r>
           </w:p>
         </w:tc>
@@ -30498,7 +30498,7 @@
           <w:szCs w:val="22"/>
           <w:rFonts w:ascii="Cambria" w:cs="Cambria" w:eastAsia="Cambria" w:hAnsi="Cambria"/>
         </w:rPr>
-        <w:t xml:space="preserve">The CPL Initiative has moved from pilot to scale, demonstrating measurable impact in student access, credit attainment, and system engagement. With 48,450 students served, 12,623 statewide credit recommendations, and 102 actively participating colleges, the initiative has surpassed most 2025–26 benchmarks ahead of schedule.</w:t>
+        <w:t xml:space="preserve">The CPL Initiative has moved from pilot to scale, demonstrating measurable impact in student access, credit attainment, and system engagement. With 48,586 students served, 12,639 statewide credit recommendations, and 102 actively participating colleges, the initiative has surpassed most 2025–26 benchmarks ahead of schedule.</w:t>
       </w:r>
     </w:p>
     <w:p>
@@ -30549,7 +30549,7 @@
           <w:szCs w:val="20"/>
           <w:rFonts w:ascii="Cambria" w:cs="Cambria" w:eastAsia="Cambria" w:hAnsi="Cambria"/>
         </w:rPr>
-        <w:t xml:space="preserve">July 6, 2026</w:t>
+        <w:t xml:space="preserve">July 7, 2026</w:t>
       </w:r>
     </w:p>
     <w:sectPr>
@@ -30586,7 +30586,7 @@
         <w:szCs w:val="14"/>
         <w:rFonts w:ascii="Cambria" w:cs="Cambria" w:eastAsia="Cambria" w:hAnsi="Cambria"/>
       </w:rPr>
-      <w:t xml:space="preserve">Generated July 6, 2026  |  California Community Colleges  |  CPL Initiative</w:t>
+      <w:t xml:space="preserve">Generated July 7, 2026  |  California Community Colleges  |  CPL Initiative</w:t>
     </w:r>
     <w:r>
       <w:rPr>

</xml_diff>

<commit_message>
Daily dashboard update — 2026-07-08
</commit_message>
<xml_diff>
--- a/reports/CPL_Master_Report.docx
+++ b/reports/CPL_Master_Report.docx
@@ -141,7 +141,7 @@
           <w:szCs w:val="22"/>
           <w:rFonts w:ascii="Cambria" w:cs="Cambria" w:eastAsia="Cambria" w:hAnsi="Cambria"/>
         </w:rPr>
-        <w:t xml:space="preserve">As of July 7, 2026, the CPL initiative is ahead of schedule, with most 2025–2026 targets met or exceeded and core infrastructure nearing completion. The work has expanded student access, increased transcripted units, and established the foundation for a permanent, statewide CPL service under Vision 2030.</w:t>
+        <w:t xml:space="preserve">As of July 8, 2026, the CPL initiative is ahead of schedule, with most 2025–2026 targets met or exceeded and core infrastructure nearing completion. The work has expanded student access, increased transcripted units, and established the foundation for a permanent, statewide CPL service under Vision 2030.</w:t>
       </w:r>
     </w:p>
     <w:p>
@@ -167,7 +167,7 @@
           <w:szCs w:val="21"/>
           <w:rFonts w:ascii="Cambria" w:cs="Cambria" w:eastAsia="Cambria" w:hAnsi="Cambria"/>
         </w:rPr>
-        <w:t xml:space="preserve">48,801 cumulative students served with CPL awards, surpassing annual targets.</w:t>
+        <w:t xml:space="preserve">48,812 cumulative students served with CPL awards, surpassing annual targets.</w:t>
       </w:r>
     </w:p>
     <w:p>
@@ -239,7 +239,7 @@
           <w:szCs w:val="21"/>
           <w:rFonts w:ascii="Cambria" w:cs="Cambria" w:eastAsia="Cambria" w:hAnsi="Cambria"/>
         </w:rPr>
-        <w:t xml:space="preserve">The Veteran Sprint has uploaded 51 JSTs to MAP, with estimated student savings of $323M and projected 20-year economic impact of $1.31B.</w:t>
+        <w:t xml:space="preserve">The Veteran Sprint has uploaded 52 JSTs to MAP, with estimated student savings of $323M and projected 20-year economic impact of $1.31B.</w:t>
       </w:r>
     </w:p>
     <w:p>
@@ -424,7 +424,7 @@
                 <w:szCs w:val="20"/>
                 <w:rFonts w:ascii="Cambria" w:cs="Cambria" w:eastAsia="Cambria" w:hAnsi="Cambria"/>
               </w:rPr>
-              <w:t xml:space="preserve">48,801</w:t>
+              <w:t xml:space="preserve">48,812</w:t>
             </w:r>
           </w:p>
         </w:tc>
@@ -704,7 +704,7 @@
                 <w:szCs w:val="20"/>
                 <w:rFonts w:ascii="Cambria" w:cs="Cambria" w:eastAsia="Cambria" w:hAnsi="Cambria"/>
               </w:rPr>
-              <w:t xml:space="preserve">51</w:t>
+              <w:t xml:space="preserve">52</w:t>
             </w:r>
           </w:p>
         </w:tc>
@@ -30498,7 +30498,7 @@
           <w:szCs w:val="22"/>
           <w:rFonts w:ascii="Cambria" w:cs="Cambria" w:eastAsia="Cambria" w:hAnsi="Cambria"/>
         </w:rPr>
-        <w:t xml:space="preserve">The CPL Initiative has moved from pilot to scale, demonstrating measurable impact in student access, credit attainment, and system engagement. With 48,801 students served, 12,670 statewide credit recommendations, and 102 actively participating colleges, the initiative has surpassed most 2025–26 benchmarks ahead of schedule.</w:t>
+        <w:t xml:space="preserve">The CPL Initiative has moved from pilot to scale, demonstrating measurable impact in student access, credit attainment, and system engagement. With 48,812 students served, 12,670 statewide credit recommendations, and 102 actively participating colleges, the initiative has surpassed most 2025–26 benchmarks ahead of schedule.</w:t>
       </w:r>
     </w:p>
     <w:p>
@@ -30549,7 +30549,7 @@
           <w:szCs w:val="20"/>
           <w:rFonts w:ascii="Cambria" w:cs="Cambria" w:eastAsia="Cambria" w:hAnsi="Cambria"/>
         </w:rPr>
-        <w:t xml:space="preserve">July 7, 2026</w:t>
+        <w:t xml:space="preserve">July 8, 2026</w:t>
       </w:r>
     </w:p>
     <w:sectPr>
@@ -30586,7 +30586,7 @@
         <w:szCs w:val="14"/>
         <w:rFonts w:ascii="Cambria" w:cs="Cambria" w:eastAsia="Cambria" w:hAnsi="Cambria"/>
       </w:rPr>
-      <w:t xml:space="preserve">Generated July 7, 2026  |  California Community Colleges  |  CPL Initiative</w:t>
+      <w:t xml:space="preserve">Generated July 8, 2026  |  California Community Colleges  |  CPL Initiative</w:t>
     </w:r>
     <w:r>
       <w:rPr>

</xml_diff>

<commit_message>
Daily dashboard update — 2026-07-09
</commit_message>
<xml_diff>
--- a/reports/CPL_Master_Report.docx
+++ b/reports/CPL_Master_Report.docx
@@ -141,7 +141,7 @@
           <w:szCs w:val="22"/>
           <w:rFonts w:ascii="Cambria" w:cs="Cambria" w:eastAsia="Cambria" w:hAnsi="Cambria"/>
         </w:rPr>
-        <w:t xml:space="preserve">As of July 8, 2026, the CPL initiative is ahead of schedule, with most 2025–2026 targets met or exceeded and core infrastructure nearing completion. The work has expanded student access, increased transcripted units, and established the foundation for a permanent, statewide CPL service under Vision 2030.</w:t>
+        <w:t xml:space="preserve">As of July 9, 2026, the CPL initiative is ahead of schedule, with most 2025–2026 targets met or exceeded and core infrastructure nearing completion. The work has expanded student access, increased transcripted units, and established the foundation for a permanent, statewide CPL service under Vision 2030.</w:t>
       </w:r>
     </w:p>
     <w:p>
@@ -167,7 +167,7 @@
           <w:szCs w:val="21"/>
           <w:rFonts w:ascii="Cambria" w:cs="Cambria" w:eastAsia="Cambria" w:hAnsi="Cambria"/>
         </w:rPr>
-        <w:t xml:space="preserve">48,917 cumulative students served with CPL awards, surpassing annual targets.</w:t>
+        <w:t xml:space="preserve">49,020 cumulative students served with CPL awards, surpassing annual targets.</w:t>
       </w:r>
     </w:p>
     <w:p>
@@ -239,7 +239,7 @@
           <w:szCs w:val="21"/>
           <w:rFonts w:ascii="Cambria" w:cs="Cambria" w:eastAsia="Cambria" w:hAnsi="Cambria"/>
         </w:rPr>
-        <w:t xml:space="preserve">The Veteran Sprint has uploaded 52 JSTs to MAP, with estimated student savings of $323M and projected 20-year economic impact of $1.31B.</w:t>
+        <w:t xml:space="preserve">The Veteran Sprint has uploaded 53 JSTs to MAP, with estimated student savings of $323M and projected 20-year economic impact of $1.31B.</w:t>
       </w:r>
     </w:p>
     <w:p>
@@ -424,7 +424,7 @@
                 <w:szCs w:val="20"/>
                 <w:rFonts w:ascii="Cambria" w:cs="Cambria" w:eastAsia="Cambria" w:hAnsi="Cambria"/>
               </w:rPr>
-              <w:t xml:space="preserve">48,917</w:t>
+              <w:t xml:space="preserve">49,020</w:t>
             </w:r>
           </w:p>
         </w:tc>
@@ -704,7 +704,7 @@
                 <w:szCs w:val="20"/>
                 <w:rFonts w:ascii="Cambria" w:cs="Cambria" w:eastAsia="Cambria" w:hAnsi="Cambria"/>
               </w:rPr>
-              <w:t xml:space="preserve">52</w:t>
+              <w:t xml:space="preserve">53</w:t>
             </w:r>
           </w:p>
         </w:tc>
@@ -30498,7 +30498,7 @@
           <w:szCs w:val="22"/>
           <w:rFonts w:ascii="Cambria" w:cs="Cambria" w:eastAsia="Cambria" w:hAnsi="Cambria"/>
         </w:rPr>
-        <w:t xml:space="preserve">The CPL Initiative has moved from pilot to scale, demonstrating measurable impact in student access, credit attainment, and system engagement. With 48,917 students served, 12,714 statewide credit recommendations, and 102 actively participating colleges, the initiative has surpassed most 2025–26 benchmarks ahead of schedule.</w:t>
+        <w:t xml:space="preserve">The CPL Initiative has moved from pilot to scale, demonstrating measurable impact in student access, credit attainment, and system engagement. With 49,020 students served, 12,714 statewide credit recommendations, and 102 actively participating colleges, the initiative has surpassed most 2025–26 benchmarks ahead of schedule.</w:t>
       </w:r>
     </w:p>
     <w:p>
@@ -30549,7 +30549,7 @@
           <w:szCs w:val="20"/>
           <w:rFonts w:ascii="Cambria" w:cs="Cambria" w:eastAsia="Cambria" w:hAnsi="Cambria"/>
         </w:rPr>
-        <w:t xml:space="preserve">July 8, 2026</w:t>
+        <w:t xml:space="preserve">July 9, 2026</w:t>
       </w:r>
     </w:p>
     <w:sectPr>
@@ -30586,7 +30586,7 @@
         <w:szCs w:val="14"/>
         <w:rFonts w:ascii="Cambria" w:cs="Cambria" w:eastAsia="Cambria" w:hAnsi="Cambria"/>
       </w:rPr>
-      <w:t xml:space="preserve">Generated July 8, 2026  |  California Community Colleges  |  CPL Initiative</w:t>
+      <w:t xml:space="preserve">Generated July 9, 2026  |  California Community Colleges  |  CPL Initiative</w:t>
     </w:r>
     <w:r>
       <w:rPr>

</xml_diff>

<commit_message>
Daily dashboard update — 2026-07-10
</commit_message>
<xml_diff>
--- a/reports/CPL_Master_Report.docx
+++ b/reports/CPL_Master_Report.docx
@@ -141,7 +141,7 @@
           <w:szCs w:val="22"/>
           <w:rFonts w:ascii="Cambria" w:cs="Cambria" w:eastAsia="Cambria" w:hAnsi="Cambria"/>
         </w:rPr>
-        <w:t xml:space="preserve">As of July 9, 2026, the CPL initiative is ahead of schedule, with most 2025–2026 targets met or exceeded and core infrastructure nearing completion. The work has expanded student access, increased transcripted units, and established the foundation for a permanent, statewide CPL service under Vision 2030.</w:t>
+        <w:t xml:space="preserve">As of July 10, 2026, the CPL initiative is ahead of schedule, with most 2025–2026 targets met or exceeded and core infrastructure nearing completion. The work has expanded student access, increased transcripted units, and established the foundation for a permanent, statewide CPL service under Vision 2030.</w:t>
       </w:r>
     </w:p>
     <w:p>
@@ -167,7 +167,7 @@
           <w:szCs w:val="21"/>
           <w:rFonts w:ascii="Cambria" w:cs="Cambria" w:eastAsia="Cambria" w:hAnsi="Cambria"/>
         </w:rPr>
-        <w:t xml:space="preserve">49,229 cumulative students served with CPL awards, surpassing annual targets.</w:t>
+        <w:t xml:space="preserve">49,231 cumulative students served with CPL awards, surpassing annual targets.</w:t>
       </w:r>
     </w:p>
     <w:p>
@@ -424,7 +424,7 @@
                 <w:szCs w:val="20"/>
                 <w:rFonts w:ascii="Cambria" w:cs="Cambria" w:eastAsia="Cambria" w:hAnsi="Cambria"/>
               </w:rPr>
-              <w:t xml:space="preserve">49,229</w:t>
+              <w:t xml:space="preserve">49,231</w:t>
             </w:r>
           </w:p>
         </w:tc>
@@ -30498,7 +30498,7 @@
           <w:szCs w:val="22"/>
           <w:rFonts w:ascii="Cambria" w:cs="Cambria" w:eastAsia="Cambria" w:hAnsi="Cambria"/>
         </w:rPr>
-        <w:t xml:space="preserve">The CPL Initiative has moved from pilot to scale, demonstrating measurable impact in student access, credit attainment, and system engagement. With 49,229 students served, 12,749 statewide credit recommendations, and 102 actively participating colleges, the initiative has surpassed most 2025–26 benchmarks ahead of schedule.</w:t>
+        <w:t xml:space="preserve">The CPL Initiative has moved from pilot to scale, demonstrating measurable impact in student access, credit attainment, and system engagement. With 49,231 students served, 12,749 statewide credit recommendations, and 102 actively participating colleges, the initiative has surpassed most 2025–26 benchmarks ahead of schedule.</w:t>
       </w:r>
     </w:p>
     <w:p>
@@ -30549,7 +30549,7 @@
           <w:szCs w:val="20"/>
           <w:rFonts w:ascii="Cambria" w:cs="Cambria" w:eastAsia="Cambria" w:hAnsi="Cambria"/>
         </w:rPr>
-        <w:t xml:space="preserve">July 9, 2026</w:t>
+        <w:t xml:space="preserve">July 10, 2026</w:t>
       </w:r>
     </w:p>
     <w:sectPr>
@@ -30586,7 +30586,7 @@
         <w:szCs w:val="14"/>
         <w:rFonts w:ascii="Cambria" w:cs="Cambria" w:eastAsia="Cambria" w:hAnsi="Cambria"/>
       </w:rPr>
-      <w:t xml:space="preserve">Generated July 9, 2026  |  California Community Colleges  |  CPL Initiative</w:t>
+      <w:t xml:space="preserve">Generated July 10, 2026  |  California Community Colleges  |  CPL Initiative</w:t>
     </w:r>
     <w:r>
       <w:rPr>

</xml_diff>

<commit_message>
Daily dashboard update — 2026-07-11
</commit_message>
<xml_diff>
--- a/reports/CPL_Master_Report.docx
+++ b/reports/CPL_Master_Report.docx
@@ -141,7 +141,7 @@
           <w:szCs w:val="22"/>
           <w:rFonts w:ascii="Cambria" w:cs="Cambria" w:eastAsia="Cambria" w:hAnsi="Cambria"/>
         </w:rPr>
-        <w:t xml:space="preserve">As of July 10, 2026, the CPL initiative is ahead of schedule, with most 2025–2026 targets met or exceeded and core infrastructure nearing completion. The work has expanded student access, increased transcripted units, and established the foundation for a permanent, statewide CPL service under Vision 2030.</w:t>
+        <w:t xml:space="preserve">As of July 11, 2026, the CPL initiative is ahead of schedule, with most 2025–2026 targets met or exceeded and core infrastructure nearing completion. The work has expanded student access, increased transcripted units, and established the foundation for a permanent, statewide CPL service under Vision 2030.</w:t>
       </w:r>
     </w:p>
     <w:p>
@@ -167,7 +167,7 @@
           <w:szCs w:val="21"/>
           <w:rFonts w:ascii="Cambria" w:cs="Cambria" w:eastAsia="Cambria" w:hAnsi="Cambria"/>
         </w:rPr>
-        <w:t xml:space="preserve">49,243 cumulative students served with CPL awards, surpassing annual targets.</w:t>
+        <w:t xml:space="preserve">49,347 cumulative students served with CPL awards, surpassing annual targets.</w:t>
       </w:r>
     </w:p>
     <w:p>
@@ -221,7 +221,7 @@
           <w:szCs w:val="21"/>
           <w:rFonts w:ascii="Cambria" w:cs="Cambria" w:eastAsia="Cambria" w:hAnsi="Cambria"/>
         </w:rPr>
-        <w:t xml:space="preserve">12,749 statewide credit recommendations, driven by faculty discipline workgroups spanning high-demand fields.</w:t>
+        <w:t xml:space="preserve">12,786 statewide credit recommendations, driven by faculty discipline workgroups spanning high-demand fields.</w:t>
       </w:r>
     </w:p>
     <w:p>
@@ -239,7 +239,7 @@
           <w:szCs w:val="21"/>
           <w:rFonts w:ascii="Cambria" w:cs="Cambria" w:eastAsia="Cambria" w:hAnsi="Cambria"/>
         </w:rPr>
-        <w:t xml:space="preserve">The Veteran Sprint has uploaded 53 JSTs to MAP, with estimated student savings of $323M and projected 20-year economic impact of $1.31B.</w:t>
+        <w:t xml:space="preserve">The Veteran Sprint has uploaded 54 JSTs to MAP, with estimated student savings of $323M and projected 20-year economic impact of $1.31B.</w:t>
       </w:r>
     </w:p>
     <w:p>
@@ -424,7 +424,7 @@
                 <w:szCs w:val="20"/>
                 <w:rFonts w:ascii="Cambria" w:cs="Cambria" w:eastAsia="Cambria" w:hAnsi="Cambria"/>
               </w:rPr>
-              <w:t xml:space="preserve">49,243</w:t>
+              <w:t xml:space="preserve">49,347</w:t>
             </w:r>
           </w:p>
         </w:tc>
@@ -564,7 +564,7 @@
                 <w:szCs w:val="20"/>
                 <w:rFonts w:ascii="Cambria" w:cs="Cambria" w:eastAsia="Cambria" w:hAnsi="Cambria"/>
               </w:rPr>
-              <w:t xml:space="preserve">12,749</w:t>
+              <w:t xml:space="preserve">12,786</w:t>
             </w:r>
           </w:p>
         </w:tc>
@@ -704,7 +704,7 @@
                 <w:szCs w:val="20"/>
                 <w:rFonts w:ascii="Cambria" w:cs="Cambria" w:eastAsia="Cambria" w:hAnsi="Cambria"/>
               </w:rPr>
-              <w:t xml:space="preserve">53</w:t>
+              <w:t xml:space="preserve">54</w:t>
             </w:r>
           </w:p>
         </w:tc>
@@ -30498,7 +30498,7 @@
           <w:szCs w:val="22"/>
           <w:rFonts w:ascii="Cambria" w:cs="Cambria" w:eastAsia="Cambria" w:hAnsi="Cambria"/>
         </w:rPr>
-        <w:t xml:space="preserve">The CPL Initiative has moved from pilot to scale, demonstrating measurable impact in student access, credit attainment, and system engagement. With 49,243 students served, 12,749 statewide credit recommendations, and 102 actively participating colleges, the initiative has surpassed most 2025–26 benchmarks ahead of schedule.</w:t>
+        <w:t xml:space="preserve">The CPL Initiative has moved from pilot to scale, demonstrating measurable impact in student access, credit attainment, and system engagement. With 49,347 students served, 12,786 statewide credit recommendations, and 102 actively participating colleges, the initiative has surpassed most 2025–26 benchmarks ahead of schedule.</w:t>
       </w:r>
     </w:p>
     <w:p>
@@ -30549,7 +30549,7 @@
           <w:szCs w:val="20"/>
           <w:rFonts w:ascii="Cambria" w:cs="Cambria" w:eastAsia="Cambria" w:hAnsi="Cambria"/>
         </w:rPr>
-        <w:t xml:space="preserve">July 10, 2026</w:t>
+        <w:t xml:space="preserve">July 11, 2026</w:t>
       </w:r>
     </w:p>
     <w:sectPr>
@@ -30586,7 +30586,7 @@
         <w:szCs w:val="14"/>
         <w:rFonts w:ascii="Cambria" w:cs="Cambria" w:eastAsia="Cambria" w:hAnsi="Cambria"/>
       </w:rPr>
-      <w:t xml:space="preserve">Generated July 10, 2026  |  California Community Colleges  |  CPL Initiative</w:t>
+      <w:t xml:space="preserve">Generated July 11, 2026  |  California Community Colleges  |  CPL Initiative</w:t>
     </w:r>
     <w:r>
       <w:rPr>

</xml_diff>

<commit_message>
Daily dashboard update — 2026-07-12
</commit_message>
<xml_diff>
--- a/reports/CPL_Master_Report.docx
+++ b/reports/CPL_Master_Report.docx
@@ -141,7 +141,7 @@
           <w:szCs w:val="22"/>
           <w:rFonts w:ascii="Cambria" w:cs="Cambria" w:eastAsia="Cambria" w:hAnsi="Cambria"/>
         </w:rPr>
-        <w:t xml:space="preserve">As of July 11, 2026, the CPL initiative is ahead of schedule, with most 2025–2026 targets met or exceeded and core infrastructure nearing completion. The work has expanded student access, increased transcripted units, and established the foundation for a permanent, statewide CPL service under Vision 2030.</w:t>
+        <w:t xml:space="preserve">As of July 12, 2026, the CPL initiative is ahead of schedule, with most 2025–2026 targets met or exceeded and core infrastructure nearing completion. The work has expanded student access, increased transcripted units, and established the foundation for a permanent, statewide CPL service under Vision 2030.</w:t>
       </w:r>
     </w:p>
     <w:p>
@@ -221,7 +221,7 @@
           <w:szCs w:val="21"/>
           <w:rFonts w:ascii="Cambria" w:cs="Cambria" w:eastAsia="Cambria" w:hAnsi="Cambria"/>
         </w:rPr>
-        <w:t xml:space="preserve">12,786 statewide credit recommendations, driven by faculty discipline workgroups spanning high-demand fields.</w:t>
+        <w:t xml:space="preserve">12,795 statewide credit recommendations, driven by faculty discipline workgroups spanning high-demand fields.</w:t>
       </w:r>
     </w:p>
     <w:p>
@@ -564,7 +564,7 @@
                 <w:szCs w:val="20"/>
                 <w:rFonts w:ascii="Cambria" w:cs="Cambria" w:eastAsia="Cambria" w:hAnsi="Cambria"/>
               </w:rPr>
-              <w:t xml:space="preserve">12,786</w:t>
+              <w:t xml:space="preserve">12,795</w:t>
             </w:r>
           </w:p>
         </w:tc>
@@ -30498,7 +30498,7 @@
           <w:szCs w:val="22"/>
           <w:rFonts w:ascii="Cambria" w:cs="Cambria" w:eastAsia="Cambria" w:hAnsi="Cambria"/>
         </w:rPr>
-        <w:t xml:space="preserve">The CPL Initiative has moved from pilot to scale, demonstrating measurable impact in student access, credit attainment, and system engagement. With 49,347 students served, 12,786 statewide credit recommendations, and 102 actively participating colleges, the initiative has surpassed most 2025–26 benchmarks ahead of schedule.</w:t>
+        <w:t xml:space="preserve">The CPL Initiative has moved from pilot to scale, demonstrating measurable impact in student access, credit attainment, and system engagement. With 49,347 students served, 12,795 statewide credit recommendations, and 102 actively participating colleges, the initiative has surpassed most 2025–26 benchmarks ahead of schedule.</w:t>
       </w:r>
     </w:p>
     <w:p>
@@ -30549,7 +30549,7 @@
           <w:szCs w:val="20"/>
           <w:rFonts w:ascii="Cambria" w:cs="Cambria" w:eastAsia="Cambria" w:hAnsi="Cambria"/>
         </w:rPr>
-        <w:t xml:space="preserve">July 11, 2026</w:t>
+        <w:t xml:space="preserve">July 12, 2026</w:t>
       </w:r>
     </w:p>
     <w:sectPr>
@@ -30586,7 +30586,7 @@
         <w:szCs w:val="14"/>
         <w:rFonts w:ascii="Cambria" w:cs="Cambria" w:eastAsia="Cambria" w:hAnsi="Cambria"/>
       </w:rPr>
-      <w:t xml:space="preserve">Generated July 11, 2026  |  California Community Colleges  |  CPL Initiative</w:t>
+      <w:t xml:space="preserve">Generated July 12, 2026  |  California Community Colleges  |  CPL Initiative</w:t>
     </w:r>
     <w:r>
       <w:rPr>

</xml_diff>

<commit_message>
Daily dashboard update — 2026-07-13
</commit_message>
<xml_diff>
--- a/reports/CPL_Master_Report.docx
+++ b/reports/CPL_Master_Report.docx
@@ -141,7 +141,7 @@
           <w:szCs w:val="22"/>
           <w:rFonts w:ascii="Cambria" w:cs="Cambria" w:eastAsia="Cambria" w:hAnsi="Cambria"/>
         </w:rPr>
-        <w:t xml:space="preserve">As of July 12, 2026, the CPL initiative is ahead of schedule, with most 2025–2026 targets met or exceeded and core infrastructure nearing completion. The work has expanded student access, increased transcripted units, and established the foundation for a permanent, statewide CPL service under Vision 2030.</w:t>
+        <w:t xml:space="preserve">As of July 13, 2026, the CPL initiative is ahead of schedule, with most 2025–2026 targets met or exceeded and core infrastructure nearing completion. The work has expanded student access, increased transcripted units, and established the foundation for a permanent, statewide CPL service under Vision 2030.</w:t>
       </w:r>
     </w:p>
     <w:p>
@@ -167,7 +167,7 @@
           <w:szCs w:val="21"/>
           <w:rFonts w:ascii="Cambria" w:cs="Cambria" w:eastAsia="Cambria" w:hAnsi="Cambria"/>
         </w:rPr>
-        <w:t xml:space="preserve">49,347 cumulative students served with CPL awards, surpassing annual targets.</w:t>
+        <w:t xml:space="preserve">49,348 cumulative students served with CPL awards, surpassing annual targets.</w:t>
       </w:r>
     </w:p>
     <w:p>
@@ -221,7 +221,7 @@
           <w:szCs w:val="21"/>
           <w:rFonts w:ascii="Cambria" w:cs="Cambria" w:eastAsia="Cambria" w:hAnsi="Cambria"/>
         </w:rPr>
-        <w:t xml:space="preserve">12,795 statewide credit recommendations, driven by faculty discipline workgroups spanning high-demand fields.</w:t>
+        <w:t xml:space="preserve">12,818 statewide credit recommendations, driven by faculty discipline workgroups spanning high-demand fields.</w:t>
       </w:r>
     </w:p>
     <w:p>
@@ -424,7 +424,7 @@
                 <w:szCs w:val="20"/>
                 <w:rFonts w:ascii="Cambria" w:cs="Cambria" w:eastAsia="Cambria" w:hAnsi="Cambria"/>
               </w:rPr>
-              <w:t xml:space="preserve">49,347</w:t>
+              <w:t xml:space="preserve">49,348</w:t>
             </w:r>
           </w:p>
         </w:tc>
@@ -564,7 +564,7 @@
                 <w:szCs w:val="20"/>
                 <w:rFonts w:ascii="Cambria" w:cs="Cambria" w:eastAsia="Cambria" w:hAnsi="Cambria"/>
               </w:rPr>
-              <w:t xml:space="preserve">12,795</w:t>
+              <w:t xml:space="preserve">12,818</w:t>
             </w:r>
           </w:p>
         </w:tc>
@@ -30498,7 +30498,7 @@
           <w:szCs w:val="22"/>
           <w:rFonts w:ascii="Cambria" w:cs="Cambria" w:eastAsia="Cambria" w:hAnsi="Cambria"/>
         </w:rPr>
-        <w:t xml:space="preserve">The CPL Initiative has moved from pilot to scale, demonstrating measurable impact in student access, credit attainment, and system engagement. With 49,347 students served, 12,795 statewide credit recommendations, and 102 actively participating colleges, the initiative has surpassed most 2025–26 benchmarks ahead of schedule.</w:t>
+        <w:t xml:space="preserve">The CPL Initiative has moved from pilot to scale, demonstrating measurable impact in student access, credit attainment, and system engagement. With 49,348 students served, 12,818 statewide credit recommendations, and 102 actively participating colleges, the initiative has surpassed most 2025–26 benchmarks ahead of schedule.</w:t>
       </w:r>
     </w:p>
     <w:p>
@@ -30549,7 +30549,7 @@
           <w:szCs w:val="20"/>
           <w:rFonts w:ascii="Cambria" w:cs="Cambria" w:eastAsia="Cambria" w:hAnsi="Cambria"/>
         </w:rPr>
-        <w:t xml:space="preserve">July 12, 2026</w:t>
+        <w:t xml:space="preserve">July 13, 2026</w:t>
       </w:r>
     </w:p>
     <w:sectPr>
@@ -30586,7 +30586,7 @@
         <w:szCs w:val="14"/>
         <w:rFonts w:ascii="Cambria" w:cs="Cambria" w:eastAsia="Cambria" w:hAnsi="Cambria"/>
       </w:rPr>
-      <w:t xml:space="preserve">Generated July 12, 2026  |  California Community Colleges  |  CPL Initiative</w:t>
+      <w:t xml:space="preserve">Generated July 13, 2026  |  California Community Colleges  |  CPL Initiative</w:t>
     </w:r>
     <w:r>
       <w:rPr>

</xml_diff>

<commit_message>
Daily dashboard update — 2026-07-14
</commit_message>
<xml_diff>
--- a/reports/CPL_Master_Report.docx
+++ b/reports/CPL_Master_Report.docx
@@ -141,7 +141,7 @@
           <w:szCs w:val="22"/>
           <w:rFonts w:ascii="Cambria" w:cs="Cambria" w:eastAsia="Cambria" w:hAnsi="Cambria"/>
         </w:rPr>
-        <w:t xml:space="preserve">As of July 13, 2026, the CPL initiative is ahead of schedule, with most 2025–2026 targets met or exceeded and core infrastructure nearing completion. The work has expanded student access, increased transcripted units, and established the foundation for a permanent, statewide CPL service under Vision 2030.</w:t>
+        <w:t xml:space="preserve">As of July 14, 2026, the CPL initiative is ahead of schedule, with most 2025–2026 targets met or exceeded and core infrastructure nearing completion. The work has expanded student access, increased transcripted units, and established the foundation for a permanent, statewide CPL service under Vision 2030.</w:t>
       </w:r>
     </w:p>
     <w:p>
@@ -167,7 +167,7 @@
           <w:szCs w:val="21"/>
           <w:rFonts w:ascii="Cambria" w:cs="Cambria" w:eastAsia="Cambria" w:hAnsi="Cambria"/>
         </w:rPr>
-        <w:t xml:space="preserve">49,385 cumulative students served with CPL awards, surpassing annual targets.</w:t>
+        <w:t xml:space="preserve">49,386 cumulative students served with CPL awards, surpassing annual targets.</w:t>
       </w:r>
     </w:p>
     <w:p>
@@ -185,7 +185,7 @@
           <w:szCs w:val="21"/>
           <w:rFonts w:ascii="Cambria" w:cs="Cambria" w:eastAsia="Cambria" w:hAnsi="Cambria"/>
         </w:rPr>
-        <w:t xml:space="preserve">233k CPL units transcripted across the system.</w:t>
+        <w:t xml:space="preserve">234k CPL units transcripted across the system.</w:t>
       </w:r>
     </w:p>
     <w:p>
@@ -221,7 +221,7 @@
           <w:szCs w:val="21"/>
           <w:rFonts w:ascii="Cambria" w:cs="Cambria" w:eastAsia="Cambria" w:hAnsi="Cambria"/>
         </w:rPr>
-        <w:t xml:space="preserve">12,844 statewide credit recommendations, driven by faculty discipline workgroups spanning high-demand fields.</w:t>
+        <w:t xml:space="preserve">12,845 statewide credit recommendations, driven by faculty discipline workgroups spanning high-demand fields.</w:t>
       </w:r>
     </w:p>
     <w:p>
@@ -239,7 +239,7 @@
           <w:szCs w:val="21"/>
           <w:rFonts w:ascii="Cambria" w:cs="Cambria" w:eastAsia="Cambria" w:hAnsi="Cambria"/>
         </w:rPr>
-        <w:t xml:space="preserve">The Veteran Sprint has uploaded 54 JSTs to MAP, with estimated student savings of $323M and projected 20-year economic impact of $1.31B.</w:t>
+        <w:t xml:space="preserve">The Veteran Sprint has uploaded 54 JSTs to MAP, with estimated student savings of $324M and projected 20-year economic impact of $1.31B.</w:t>
       </w:r>
     </w:p>
     <w:p>
@@ -424,7 +424,7 @@
                 <w:szCs w:val="20"/>
                 <w:rFonts w:ascii="Cambria" w:cs="Cambria" w:eastAsia="Cambria" w:hAnsi="Cambria"/>
               </w:rPr>
-              <w:t xml:space="preserve">49,385</w:t>
+              <w:t xml:space="preserve">49,386</w:t>
             </w:r>
           </w:p>
         </w:tc>
@@ -494,7 +494,7 @@
                 <w:szCs w:val="20"/>
                 <w:rFonts w:ascii="Cambria" w:cs="Cambria" w:eastAsia="Cambria" w:hAnsi="Cambria"/>
               </w:rPr>
-              <w:t xml:space="preserve">233k</w:t>
+              <w:t xml:space="preserve">234k</w:t>
             </w:r>
           </w:p>
         </w:tc>
@@ -564,7 +564,7 @@
                 <w:szCs w:val="20"/>
                 <w:rFonts w:ascii="Cambria" w:cs="Cambria" w:eastAsia="Cambria" w:hAnsi="Cambria"/>
               </w:rPr>
-              <w:t xml:space="preserve">12,844</w:t>
+              <w:t xml:space="preserve">12,845</w:t>
             </w:r>
           </w:p>
         </w:tc>
@@ -774,7 +774,7 @@
                 <w:szCs w:val="20"/>
                 <w:rFonts w:ascii="Cambria" w:cs="Cambria" w:eastAsia="Cambria" w:hAnsi="Cambria"/>
               </w:rPr>
-              <w:t xml:space="preserve">$323M</w:t>
+              <w:t xml:space="preserve">$324M</w:t>
             </w:r>
           </w:p>
         </w:tc>
@@ -30498,7 +30498,7 @@
           <w:szCs w:val="22"/>
           <w:rFonts w:ascii="Cambria" w:cs="Cambria" w:eastAsia="Cambria" w:hAnsi="Cambria"/>
         </w:rPr>
-        <w:t xml:space="preserve">The CPL Initiative has moved from pilot to scale, demonstrating measurable impact in student access, credit attainment, and system engagement. With 49,385 students served, 12,844 statewide credit recommendations, and 102 actively participating colleges, the initiative has surpassed most 2025–26 benchmarks ahead of schedule.</w:t>
+        <w:t xml:space="preserve">The CPL Initiative has moved from pilot to scale, demonstrating measurable impact in student access, credit attainment, and system engagement. With 49,386 students served, 12,845 statewide credit recommendations, and 102 actively participating colleges, the initiative has surpassed most 2025–26 benchmarks ahead of schedule.</w:t>
       </w:r>
     </w:p>
     <w:p>
@@ -30549,7 +30549,7 @@
           <w:szCs w:val="20"/>
           <w:rFonts w:ascii="Cambria" w:cs="Cambria" w:eastAsia="Cambria" w:hAnsi="Cambria"/>
         </w:rPr>
-        <w:t xml:space="preserve">July 13, 2026</w:t>
+        <w:t xml:space="preserve">July 14, 2026</w:t>
       </w:r>
     </w:p>
     <w:sectPr>
@@ -30586,7 +30586,7 @@
         <w:szCs w:val="14"/>
         <w:rFonts w:ascii="Cambria" w:cs="Cambria" w:eastAsia="Cambria" w:hAnsi="Cambria"/>
       </w:rPr>
-      <w:t xml:space="preserve">Generated July 13, 2026  |  California Community Colleges  |  CPL Initiative</w:t>
+      <w:t xml:space="preserve">Generated July 14, 2026  |  California Community Colleges  |  CPL Initiative</w:t>
     </w:r>
     <w:r>
       <w:rPr>

</xml_diff>

<commit_message>
Daily dashboard update — 2026-07-15
</commit_message>
<xml_diff>
--- a/reports/CPL_Master_Report.docx
+++ b/reports/CPL_Master_Report.docx
@@ -141,7 +141,7 @@
           <w:szCs w:val="22"/>
           <w:rFonts w:ascii="Cambria" w:cs="Cambria" w:eastAsia="Cambria" w:hAnsi="Cambria"/>
         </w:rPr>
-        <w:t xml:space="preserve">As of July 14, 2026, the CPL initiative is ahead of schedule, with most 2025–2026 targets met or exceeded and core infrastructure nearing completion. The work has expanded student access, increased transcripted units, and established the foundation for a permanent, statewide CPL service under Vision 2030.</w:t>
+        <w:t xml:space="preserve">As of July 15, 2026, the CPL initiative is ahead of schedule, with most 2025–2026 targets met or exceeded and core infrastructure nearing completion. The work has expanded student access, increased transcripted units, and established the foundation for a permanent, statewide CPL service under Vision 2030.</w:t>
       </w:r>
     </w:p>
     <w:p>
@@ -167,7 +167,7 @@
           <w:szCs w:val="21"/>
           <w:rFonts w:ascii="Cambria" w:cs="Cambria" w:eastAsia="Cambria" w:hAnsi="Cambria"/>
         </w:rPr>
-        <w:t xml:space="preserve">49,387 cumulative students served with CPL awards, surpassing annual targets.</w:t>
+        <w:t xml:space="preserve">49,455 cumulative students served with CPL awards, surpassing annual targets.</w:t>
       </w:r>
     </w:p>
     <w:p>
@@ -221,7 +221,7 @@
           <w:szCs w:val="21"/>
           <w:rFonts w:ascii="Cambria" w:cs="Cambria" w:eastAsia="Cambria" w:hAnsi="Cambria"/>
         </w:rPr>
-        <w:t xml:space="preserve">12,845 statewide credit recommendations, driven by faculty discipline workgroups spanning high-demand fields.</w:t>
+        <w:t xml:space="preserve">12,806 statewide credit recommendations, driven by faculty discipline workgroups spanning high-demand fields.</w:t>
       </w:r>
     </w:p>
     <w:p>
@@ -424,7 +424,7 @@
                 <w:szCs w:val="20"/>
                 <w:rFonts w:ascii="Cambria" w:cs="Cambria" w:eastAsia="Cambria" w:hAnsi="Cambria"/>
               </w:rPr>
-              <w:t xml:space="preserve">49,387</w:t>
+              <w:t xml:space="preserve">49,455</w:t>
             </w:r>
           </w:p>
         </w:tc>
@@ -564,7 +564,7 @@
                 <w:szCs w:val="20"/>
                 <w:rFonts w:ascii="Cambria" w:cs="Cambria" w:eastAsia="Cambria" w:hAnsi="Cambria"/>
               </w:rPr>
-              <w:t xml:space="preserve">12,845</w:t>
+              <w:t xml:space="preserve">12,806</w:t>
             </w:r>
           </w:p>
         </w:tc>
@@ -30498,7 +30498,7 @@
           <w:szCs w:val="22"/>
           <w:rFonts w:ascii="Cambria" w:cs="Cambria" w:eastAsia="Cambria" w:hAnsi="Cambria"/>
         </w:rPr>
-        <w:t xml:space="preserve">The CPL Initiative has moved from pilot to scale, demonstrating measurable impact in student access, credit attainment, and system engagement. With 49,387 students served, 12,845 statewide credit recommendations, and 102 actively participating colleges, the initiative has surpassed most 2025–26 benchmarks ahead of schedule.</w:t>
+        <w:t xml:space="preserve">The CPL Initiative has moved from pilot to scale, demonstrating measurable impact in student access, credit attainment, and system engagement. With 49,455 students served, 12,806 statewide credit recommendations, and 102 actively participating colleges, the initiative has surpassed most 2025–26 benchmarks ahead of schedule.</w:t>
       </w:r>
     </w:p>
     <w:p>
@@ -30549,7 +30549,7 @@
           <w:szCs w:val="20"/>
           <w:rFonts w:ascii="Cambria" w:cs="Cambria" w:eastAsia="Cambria" w:hAnsi="Cambria"/>
         </w:rPr>
-        <w:t xml:space="preserve">July 14, 2026</w:t>
+        <w:t xml:space="preserve">July 15, 2026</w:t>
       </w:r>
     </w:p>
     <w:sectPr>
@@ -30586,7 +30586,7 @@
         <w:szCs w:val="14"/>
         <w:rFonts w:ascii="Cambria" w:cs="Cambria" w:eastAsia="Cambria" w:hAnsi="Cambria"/>
       </w:rPr>
-      <w:t xml:space="preserve">Generated July 14, 2026  |  California Community Colleges  |  CPL Initiative</w:t>
+      <w:t xml:space="preserve">Generated July 15, 2026  |  California Community Colleges  |  CPL Initiative</w:t>
     </w:r>
     <w:r>
       <w:rPr>

</xml_diff>

<commit_message>
Daily dashboard update — 2026-07-16
</commit_message>
<xml_diff>
--- a/reports/CPL_Master_Report.docx
+++ b/reports/CPL_Master_Report.docx
@@ -141,7 +141,7 @@
           <w:szCs w:val="22"/>
           <w:rFonts w:ascii="Cambria" w:cs="Cambria" w:eastAsia="Cambria" w:hAnsi="Cambria"/>
         </w:rPr>
-        <w:t xml:space="preserve">As of July 15, 2026, the CPL initiative is ahead of schedule, with most 2025–2026 targets met or exceeded and core infrastructure nearing completion. The work has expanded student access, increased transcripted units, and established the foundation for a permanent, statewide CPL service under Vision 2030.</w:t>
+        <w:t xml:space="preserve">As of July 16, 2026, the CPL initiative is ahead of schedule, with most 2025–2026 targets met or exceeded and core infrastructure nearing completion. The work has expanded student access, increased transcripted units, and established the foundation for a permanent, statewide CPL service under Vision 2030.</w:t>
       </w:r>
     </w:p>
     <w:p>
@@ -167,7 +167,7 @@
           <w:szCs w:val="21"/>
           <w:rFonts w:ascii="Cambria" w:cs="Cambria" w:eastAsia="Cambria" w:hAnsi="Cambria"/>
         </w:rPr>
-        <w:t xml:space="preserve">50,135 cumulative students served with CPL awards, surpassing annual targets.</w:t>
+        <w:t xml:space="preserve">50,172 cumulative students served with CPL awards, surpassing annual targets.</w:t>
       </w:r>
     </w:p>
     <w:p>
@@ -185,7 +185,7 @@
           <w:szCs w:val="21"/>
           <w:rFonts w:ascii="Cambria" w:cs="Cambria" w:eastAsia="Cambria" w:hAnsi="Cambria"/>
         </w:rPr>
-        <w:t xml:space="preserve">235k CPL units transcripted across the system.</w:t>
+        <w:t xml:space="preserve">236k CPL units transcripted across the system.</w:t>
       </w:r>
     </w:p>
     <w:p>
@@ -221,7 +221,7 @@
           <w:szCs w:val="21"/>
           <w:rFonts w:ascii="Cambria" w:cs="Cambria" w:eastAsia="Cambria" w:hAnsi="Cambria"/>
         </w:rPr>
-        <w:t xml:space="preserve">12,840 statewide credit recommendations, driven by faculty discipline workgroups spanning high-demand fields.</w:t>
+        <w:t xml:space="preserve">12,690 statewide credit recommendations, driven by faculty discipline workgroups spanning high-demand fields.</w:t>
       </w:r>
     </w:p>
     <w:p>
@@ -239,7 +239,7 @@
           <w:szCs w:val="21"/>
           <w:rFonts w:ascii="Cambria" w:cs="Cambria" w:eastAsia="Cambria" w:hAnsi="Cambria"/>
         </w:rPr>
-        <w:t xml:space="preserve">The Veteran Sprint has uploaded 54 JSTs to MAP, with estimated student savings of $325M and projected 20-year economic impact of $1.32B.</w:t>
+        <w:t xml:space="preserve">The Veteran Sprint has uploaded 54 JSTs to MAP, with estimated student savings of $326M and projected 20-year economic impact of $1.32B.</w:t>
       </w:r>
     </w:p>
     <w:p>
@@ -424,7 +424,7 @@
                 <w:szCs w:val="20"/>
                 <w:rFonts w:ascii="Cambria" w:cs="Cambria" w:eastAsia="Cambria" w:hAnsi="Cambria"/>
               </w:rPr>
-              <w:t xml:space="preserve">50,135</w:t>
+              <w:t xml:space="preserve">50,172</w:t>
             </w:r>
           </w:p>
         </w:tc>
@@ -494,7 +494,7 @@
                 <w:szCs w:val="20"/>
                 <w:rFonts w:ascii="Cambria" w:cs="Cambria" w:eastAsia="Cambria" w:hAnsi="Cambria"/>
               </w:rPr>
-              <w:t xml:space="preserve">235k</w:t>
+              <w:t xml:space="preserve">236k</w:t>
             </w:r>
           </w:p>
         </w:tc>
@@ -564,7 +564,7 @@
                 <w:szCs w:val="20"/>
                 <w:rFonts w:ascii="Cambria" w:cs="Cambria" w:eastAsia="Cambria" w:hAnsi="Cambria"/>
               </w:rPr>
-              <w:t xml:space="preserve">12,840</w:t>
+              <w:t xml:space="preserve">12,690</w:t>
             </w:r>
           </w:p>
         </w:tc>
@@ -774,7 +774,7 @@
                 <w:szCs w:val="20"/>
                 <w:rFonts w:ascii="Cambria" w:cs="Cambria" w:eastAsia="Cambria" w:hAnsi="Cambria"/>
               </w:rPr>
-              <w:t xml:space="preserve">$325M</w:t>
+              <w:t xml:space="preserve">$326M</w:t>
             </w:r>
           </w:p>
         </w:tc>
@@ -30498,7 +30498,7 @@
           <w:szCs w:val="22"/>
           <w:rFonts w:ascii="Cambria" w:cs="Cambria" w:eastAsia="Cambria" w:hAnsi="Cambria"/>
         </w:rPr>
-        <w:t xml:space="preserve">The CPL Initiative has moved from pilot to scale, demonstrating measurable impact in student access, credit attainment, and system engagement. With 50,135 students served, 12,840 statewide credit recommendations, and 102 actively participating colleges, the initiative has surpassed most 2025–26 benchmarks ahead of schedule.</w:t>
+        <w:t xml:space="preserve">The CPL Initiative has moved from pilot to scale, demonstrating measurable impact in student access, credit attainment, and system engagement. With 50,172 students served, 12,690 statewide credit recommendations, and 102 actively participating colleges, the initiative has surpassed most 2025–26 benchmarks ahead of schedule.</w:t>
       </w:r>
     </w:p>
     <w:p>
@@ -30549,7 +30549,7 @@
           <w:szCs w:val="20"/>
           <w:rFonts w:ascii="Cambria" w:cs="Cambria" w:eastAsia="Cambria" w:hAnsi="Cambria"/>
         </w:rPr>
-        <w:t xml:space="preserve">July 15, 2026</w:t>
+        <w:t xml:space="preserve">July 16, 2026</w:t>
       </w:r>
     </w:p>
     <w:sectPr>
@@ -30586,7 +30586,7 @@
         <w:szCs w:val="14"/>
         <w:rFonts w:ascii="Cambria" w:cs="Cambria" w:eastAsia="Cambria" w:hAnsi="Cambria"/>
       </w:rPr>
-      <w:t xml:space="preserve">Generated July 15, 2026  |  California Community Colleges  |  CPL Initiative</w:t>
+      <w:t xml:space="preserve">Generated July 16, 2026  |  California Community Colleges  |  CPL Initiative</w:t>
     </w:r>
     <w:r>
       <w:rPr>

</xml_diff>

<commit_message>
Daily dashboard update — 2026-07-17
</commit_message>
<xml_diff>
--- a/reports/CPL_Master_Report.docx
+++ b/reports/CPL_Master_Report.docx
@@ -141,7 +141,7 @@
           <w:szCs w:val="22"/>
           <w:rFonts w:ascii="Cambria" w:cs="Cambria" w:eastAsia="Cambria" w:hAnsi="Cambria"/>
         </w:rPr>
-        <w:t xml:space="preserve">As of July 16, 2026, the CPL initiative is ahead of schedule, with most 2025–2026 targets met or exceeded and core infrastructure nearing completion. The work has expanded student access, increased transcripted units, and established the foundation for a permanent, statewide CPL service under Vision 2030.</w:t>
+        <w:t xml:space="preserve">As of July 17, 2026, the CPL initiative is ahead of schedule, with most 2025–2026 targets met or exceeded and core infrastructure nearing completion. The work has expanded student access, increased transcripted units, and established the foundation for a permanent, statewide CPL service under Vision 2030.</w:t>
       </w:r>
     </w:p>
     <w:p>
@@ -167,7 +167,7 @@
           <w:szCs w:val="21"/>
           <w:rFonts w:ascii="Cambria" w:cs="Cambria" w:eastAsia="Cambria" w:hAnsi="Cambria"/>
         </w:rPr>
-        <w:t xml:space="preserve">50,154 cumulative students served with CPL awards, surpassing annual targets.</w:t>
+        <w:t xml:space="preserve">50,399 cumulative students served with CPL awards, surpassing annual targets.</w:t>
       </w:r>
     </w:p>
     <w:p>
@@ -221,7 +221,7 @@
           <w:szCs w:val="21"/>
           <w:rFonts w:ascii="Cambria" w:cs="Cambria" w:eastAsia="Cambria" w:hAnsi="Cambria"/>
         </w:rPr>
-        <w:t xml:space="preserve">12,679 statewide credit recommendations, driven by faculty discipline workgroups spanning high-demand fields.</w:t>
+        <w:t xml:space="preserve">12,694 statewide credit recommendations, driven by faculty discipline workgroups spanning high-demand fields.</w:t>
       </w:r>
     </w:p>
     <w:p>
@@ -239,7 +239,7 @@
           <w:szCs w:val="21"/>
           <w:rFonts w:ascii="Cambria" w:cs="Cambria" w:eastAsia="Cambria" w:hAnsi="Cambria"/>
         </w:rPr>
-        <w:t xml:space="preserve">The Veteran Sprint has uploaded 54 JSTs to MAP, with estimated student savings of $326M and projected 20-year economic impact of $1.32B.</w:t>
+        <w:t xml:space="preserve">The Veteran Sprint has uploaded 55 JSTs to MAP, with estimated student savings of $326M and projected 20-year economic impact of $1.32B.</w:t>
       </w:r>
     </w:p>
     <w:p>
@@ -424,7 +424,7 @@
                 <w:szCs w:val="20"/>
                 <w:rFonts w:ascii="Cambria" w:cs="Cambria" w:eastAsia="Cambria" w:hAnsi="Cambria"/>
               </w:rPr>
-              <w:t xml:space="preserve">50,154</w:t>
+              <w:t xml:space="preserve">50,399</w:t>
             </w:r>
           </w:p>
         </w:tc>
@@ -564,7 +564,7 @@
                 <w:szCs w:val="20"/>
                 <w:rFonts w:ascii="Cambria" w:cs="Cambria" w:eastAsia="Cambria" w:hAnsi="Cambria"/>
               </w:rPr>
-              <w:t xml:space="preserve">12,679</w:t>
+              <w:t xml:space="preserve">12,694</w:t>
             </w:r>
           </w:p>
         </w:tc>
@@ -704,7 +704,7 @@
                 <w:szCs w:val="20"/>
                 <w:rFonts w:ascii="Cambria" w:cs="Cambria" w:eastAsia="Cambria" w:hAnsi="Cambria"/>
               </w:rPr>
-              <w:t xml:space="preserve">54</w:t>
+              <w:t xml:space="preserve">55</w:t>
             </w:r>
           </w:p>
         </w:tc>
@@ -30498,7 +30498,7 @@
           <w:szCs w:val="22"/>
           <w:rFonts w:ascii="Cambria" w:cs="Cambria" w:eastAsia="Cambria" w:hAnsi="Cambria"/>
         </w:rPr>
-        <w:t xml:space="preserve">The CPL Initiative has moved from pilot to scale, demonstrating measurable impact in student access, credit attainment, and system engagement. With 50,154 students served, 12,679 statewide credit recommendations, and 102 actively participating colleges, the initiative has surpassed most 2025–26 benchmarks ahead of schedule.</w:t>
+        <w:t xml:space="preserve">The CPL Initiative has moved from pilot to scale, demonstrating measurable impact in student access, credit attainment, and system engagement. With 50,399 students served, 12,694 statewide credit recommendations, and 102 actively participating colleges, the initiative has surpassed most 2025–26 benchmarks ahead of schedule.</w:t>
       </w:r>
     </w:p>
     <w:p>
@@ -30549,7 +30549,7 @@
           <w:szCs w:val="20"/>
           <w:rFonts w:ascii="Cambria" w:cs="Cambria" w:eastAsia="Cambria" w:hAnsi="Cambria"/>
         </w:rPr>
-        <w:t xml:space="preserve">July 16, 2026</w:t>
+        <w:t xml:space="preserve">July 17, 2026</w:t>
       </w:r>
     </w:p>
     <w:sectPr>
@@ -30586,7 +30586,7 @@
         <w:szCs w:val="14"/>
         <w:rFonts w:ascii="Cambria" w:cs="Cambria" w:eastAsia="Cambria" w:hAnsi="Cambria"/>
       </w:rPr>
-      <w:t xml:space="preserve">Generated July 16, 2026  |  California Community Colleges  |  CPL Initiative</w:t>
+      <w:t xml:space="preserve">Generated July 17, 2026  |  California Community Colleges  |  CPL Initiative</w:t>
     </w:r>
     <w:r>
       <w:rPr>

</xml_diff>

<commit_message>
Daily dashboard update — 2026-07-18
</commit_message>
<xml_diff>
--- a/reports/CPL_Master_Report.docx
+++ b/reports/CPL_Master_Report.docx
@@ -141,7 +141,7 @@
           <w:szCs w:val="22"/>
           <w:rFonts w:ascii="Cambria" w:cs="Cambria" w:eastAsia="Cambria" w:hAnsi="Cambria"/>
         </w:rPr>
-        <w:t xml:space="preserve">As of July 17, 2026, the CPL initiative is ahead of schedule, with most 2025–2026 targets met or exceeded and core infrastructure nearing completion. The work has expanded student access, increased transcripted units, and established the foundation for a permanent, statewide CPL service under Vision 2030.</w:t>
+        <w:t xml:space="preserve">As of July 18, 2026, the CPL initiative is ahead of schedule, with most 2025–2026 targets met or exceeded and core infrastructure nearing completion. The work has expanded student access, increased transcripted units, and established the foundation for a permanent, statewide CPL service under Vision 2030.</w:t>
       </w:r>
     </w:p>
     <w:p>
@@ -167,7 +167,7 @@
           <w:szCs w:val="21"/>
           <w:rFonts w:ascii="Cambria" w:cs="Cambria" w:eastAsia="Cambria" w:hAnsi="Cambria"/>
         </w:rPr>
-        <w:t xml:space="preserve">50,399 cumulative students served with CPL awards, surpassing annual targets.</w:t>
+        <w:t xml:space="preserve">50,402 cumulative students served with CPL awards, surpassing annual targets.</w:t>
       </w:r>
     </w:p>
     <w:p>
@@ -221,7 +221,7 @@
           <w:szCs w:val="21"/>
           <w:rFonts w:ascii="Cambria" w:cs="Cambria" w:eastAsia="Cambria" w:hAnsi="Cambria"/>
         </w:rPr>
-        <w:t xml:space="preserve">12,694 statewide credit recommendations, driven by faculty discipline workgroups spanning high-demand fields.</w:t>
+        <w:t xml:space="preserve">12,773 statewide credit recommendations, driven by faculty discipline workgroups spanning high-demand fields.</w:t>
       </w:r>
     </w:p>
     <w:p>
@@ -424,7 +424,7 @@
                 <w:szCs w:val="20"/>
                 <w:rFonts w:ascii="Cambria" w:cs="Cambria" w:eastAsia="Cambria" w:hAnsi="Cambria"/>
               </w:rPr>
-              <w:t xml:space="preserve">50,399</w:t>
+              <w:t xml:space="preserve">50,402</w:t>
             </w:r>
           </w:p>
         </w:tc>
@@ -564,7 +564,7 @@
                 <w:szCs w:val="20"/>
                 <w:rFonts w:ascii="Cambria" w:cs="Cambria" w:eastAsia="Cambria" w:hAnsi="Cambria"/>
               </w:rPr>
-              <w:t xml:space="preserve">12,694</w:t>
+              <w:t xml:space="preserve">12,773</w:t>
             </w:r>
           </w:p>
         </w:tc>
@@ -30498,7 +30498,7 @@
           <w:szCs w:val="22"/>
           <w:rFonts w:ascii="Cambria" w:cs="Cambria" w:eastAsia="Cambria" w:hAnsi="Cambria"/>
         </w:rPr>
-        <w:t xml:space="preserve">The CPL Initiative has moved from pilot to scale, demonstrating measurable impact in student access, credit attainment, and system engagement. With 50,399 students served, 12,694 statewide credit recommendations, and 102 actively participating colleges, the initiative has surpassed most 2025–26 benchmarks ahead of schedule.</w:t>
+        <w:t xml:space="preserve">The CPL Initiative has moved from pilot to scale, demonstrating measurable impact in student access, credit attainment, and system engagement. With 50,402 students served, 12,773 statewide credit recommendations, and 102 actively participating colleges, the initiative has surpassed most 2025–26 benchmarks ahead of schedule.</w:t>
       </w:r>
     </w:p>
     <w:p>
@@ -30549,7 +30549,7 @@
           <w:szCs w:val="20"/>
           <w:rFonts w:ascii="Cambria" w:cs="Cambria" w:eastAsia="Cambria" w:hAnsi="Cambria"/>
         </w:rPr>
-        <w:t xml:space="preserve">July 17, 2026</w:t>
+        <w:t xml:space="preserve">July 18, 2026</w:t>
       </w:r>
     </w:p>
     <w:sectPr>
@@ -30586,7 +30586,7 @@
         <w:szCs w:val="14"/>
         <w:rFonts w:ascii="Cambria" w:cs="Cambria" w:eastAsia="Cambria" w:hAnsi="Cambria"/>
       </w:rPr>
-      <w:t xml:space="preserve">Generated July 17, 2026  |  California Community Colleges  |  CPL Initiative</w:t>
+      <w:t xml:space="preserve">Generated July 18, 2026  |  California Community Colleges  |  CPL Initiative</w:t>
     </w:r>
     <w:r>
       <w:rPr>

</xml_diff>

<commit_message>
Daily dashboard update — 2026-07-19
</commit_message>
<xml_diff>
--- a/reports/CPL_Master_Report.docx
+++ b/reports/CPL_Master_Report.docx
@@ -141,7 +141,7 @@
           <w:szCs w:val="22"/>
           <w:rFonts w:ascii="Cambria" w:cs="Cambria" w:eastAsia="Cambria" w:hAnsi="Cambria"/>
         </w:rPr>
-        <w:t xml:space="preserve">As of July 18, 2026, the CPL initiative is ahead of schedule, with most 2025–2026 targets met or exceeded and core infrastructure nearing completion. The work has expanded student access, increased transcripted units, and established the foundation for a permanent, statewide CPL service under Vision 2030.</w:t>
+        <w:t xml:space="preserve">As of July 19, 2026, the CPL initiative is ahead of schedule, with most 2025–2026 targets met or exceeded and core infrastructure nearing completion. The work has expanded student access, increased transcripted units, and established the foundation for a permanent, statewide CPL service under Vision 2030.</w:t>
       </w:r>
     </w:p>
     <w:p>
@@ -30549,7 +30549,7 @@
           <w:szCs w:val="20"/>
           <w:rFonts w:ascii="Cambria" w:cs="Cambria" w:eastAsia="Cambria" w:hAnsi="Cambria"/>
         </w:rPr>
-        <w:t xml:space="preserve">July 18, 2026</w:t>
+        <w:t xml:space="preserve">July 19, 2026</w:t>
       </w:r>
     </w:p>
     <w:sectPr>
@@ -30586,7 +30586,7 @@
         <w:szCs w:val="14"/>
         <w:rFonts w:ascii="Cambria" w:cs="Cambria" w:eastAsia="Cambria" w:hAnsi="Cambria"/>
       </w:rPr>
-      <w:t xml:space="preserve">Generated July 18, 2026  |  California Community Colleges  |  CPL Initiative</w:t>
+      <w:t xml:space="preserve">Generated July 19, 2026  |  California Community Colleges  |  CPL Initiative</w:t>
     </w:r>
     <w:r>
       <w:rPr>

</xml_diff>

<commit_message>
Daily dashboard update — 2026-07-20
</commit_message>
<xml_diff>
--- a/reports/CPL_Master_Report.docx
+++ b/reports/CPL_Master_Report.docx
@@ -141,7 +141,7 @@
           <w:szCs w:val="22"/>
           <w:rFonts w:ascii="Cambria" w:cs="Cambria" w:eastAsia="Cambria" w:hAnsi="Cambria"/>
         </w:rPr>
-        <w:t xml:space="preserve">As of July 19, 2026, the CPL initiative is ahead of schedule, with most 2025–2026 targets met or exceeded and core infrastructure nearing completion. The work has expanded student access, increased transcripted units, and established the foundation for a permanent, statewide CPL service under Vision 2030.</w:t>
+        <w:t xml:space="preserve">As of July 20, 2026, the CPL initiative is ahead of schedule, with most 2025–2026 targets met or exceeded and core infrastructure nearing completion. The work has expanded student access, increased transcripted units, and established the foundation for a permanent, statewide CPL service under Vision 2030.</w:t>
       </w:r>
     </w:p>
     <w:p>
@@ -167,7 +167,7 @@
           <w:szCs w:val="21"/>
           <w:rFonts w:ascii="Cambria" w:cs="Cambria" w:eastAsia="Cambria" w:hAnsi="Cambria"/>
         </w:rPr>
-        <w:t xml:space="preserve">50,402 cumulative students served with CPL awards, surpassing annual targets.</w:t>
+        <w:t xml:space="preserve">50,403 cumulative students served with CPL awards, surpassing annual targets.</w:t>
       </w:r>
     </w:p>
     <w:p>
@@ -424,7 +424,7 @@
                 <w:szCs w:val="20"/>
                 <w:rFonts w:ascii="Cambria" w:cs="Cambria" w:eastAsia="Cambria" w:hAnsi="Cambria"/>
               </w:rPr>
-              <w:t xml:space="preserve">50,402</w:t>
+              <w:t xml:space="preserve">50,403</w:t>
             </w:r>
           </w:p>
         </w:tc>
@@ -30498,7 +30498,7 @@
           <w:szCs w:val="22"/>
           <w:rFonts w:ascii="Cambria" w:cs="Cambria" w:eastAsia="Cambria" w:hAnsi="Cambria"/>
         </w:rPr>
-        <w:t xml:space="preserve">The CPL Initiative has moved from pilot to scale, demonstrating measurable impact in student access, credit attainment, and system engagement. With 50,402 students served, 12,773 statewide credit recommendations, and 102 actively participating colleges, the initiative has surpassed most 2025–26 benchmarks ahead of schedule.</w:t>
+        <w:t xml:space="preserve">The CPL Initiative has moved from pilot to scale, demonstrating measurable impact in student access, credit attainment, and system engagement. With 50,403 students served, 12,773 statewide credit recommendations, and 102 actively participating colleges, the initiative has surpassed most 2025–26 benchmarks ahead of schedule.</w:t>
       </w:r>
     </w:p>
     <w:p>
@@ -30549,7 +30549,7 @@
           <w:szCs w:val="20"/>
           <w:rFonts w:ascii="Cambria" w:cs="Cambria" w:eastAsia="Cambria" w:hAnsi="Cambria"/>
         </w:rPr>
-        <w:t xml:space="preserve">July 19, 2026</w:t>
+        <w:t xml:space="preserve">July 20, 2026</w:t>
       </w:r>
     </w:p>
     <w:sectPr>
@@ -30586,7 +30586,7 @@
         <w:szCs w:val="14"/>
         <w:rFonts w:ascii="Cambria" w:cs="Cambria" w:eastAsia="Cambria" w:hAnsi="Cambria"/>
       </w:rPr>
-      <w:t xml:space="preserve">Generated July 19, 2026  |  California Community Colleges  |  CPL Initiative</w:t>
+      <w:t xml:space="preserve">Generated July 20, 2026  |  California Community Colleges  |  CPL Initiative</w:t>
     </w:r>
     <w:r>
       <w:rPr>

</xml_diff>

<commit_message>
Daily dashboard update — 2026-07-21
</commit_message>
<xml_diff>
--- a/reports/CPL_Master_Report.docx
+++ b/reports/CPL_Master_Report.docx
@@ -141,7 +141,7 @@
           <w:szCs w:val="22"/>
           <w:rFonts w:ascii="Cambria" w:cs="Cambria" w:eastAsia="Cambria" w:hAnsi="Cambria"/>
         </w:rPr>
-        <w:t xml:space="preserve">As of July 20, 2026, the CPL initiative is ahead of schedule, with most 2025–2026 targets met or exceeded and core infrastructure nearing completion. The work has expanded student access, increased transcripted units, and established the foundation for a permanent, statewide CPL service under Vision 2030.</w:t>
+        <w:t xml:space="preserve">As of July 21, 2026, the CPL initiative is ahead of schedule, with most 2025–2026 targets met or exceeded and core infrastructure nearing completion. The work has expanded student access, increased transcripted units, and established the foundation for a permanent, statewide CPL service under Vision 2030.</w:t>
       </w:r>
     </w:p>
     <w:p>
@@ -167,7 +167,7 @@
           <w:szCs w:val="21"/>
           <w:rFonts w:ascii="Cambria" w:cs="Cambria" w:eastAsia="Cambria" w:hAnsi="Cambria"/>
         </w:rPr>
-        <w:t xml:space="preserve">50,403 cumulative students served with CPL awards, surpassing annual targets.</w:t>
+        <w:t xml:space="preserve">50,493 cumulative students served with CPL awards, surpassing annual targets.</w:t>
       </w:r>
     </w:p>
     <w:p>
@@ -185,7 +185,7 @@
           <w:szCs w:val="21"/>
           <w:rFonts w:ascii="Cambria" w:cs="Cambria" w:eastAsia="Cambria" w:hAnsi="Cambria"/>
         </w:rPr>
-        <w:t xml:space="preserve">238k CPL units transcripted across the system.</w:t>
+        <w:t xml:space="preserve">239k CPL units transcripted across the system.</w:t>
       </w:r>
     </w:p>
     <w:p>
@@ -221,7 +221,7 @@
           <w:szCs w:val="21"/>
           <w:rFonts w:ascii="Cambria" w:cs="Cambria" w:eastAsia="Cambria" w:hAnsi="Cambria"/>
         </w:rPr>
-        <w:t xml:space="preserve">12,773 statewide credit recommendations, driven by faculty discipline workgroups spanning high-demand fields.</w:t>
+        <w:t xml:space="preserve">12,770 statewide credit recommendations, driven by faculty discipline workgroups spanning high-demand fields.</w:t>
       </w:r>
     </w:p>
     <w:p>
@@ -239,7 +239,7 @@
           <w:szCs w:val="21"/>
           <w:rFonts w:ascii="Cambria" w:cs="Cambria" w:eastAsia="Cambria" w:hAnsi="Cambria"/>
         </w:rPr>
-        <w:t xml:space="preserve">The Veteran Sprint has uploaded 55 JSTs to MAP, with estimated student savings of $330M and projected 20-year economic impact of $1.33B.</w:t>
+        <w:t xml:space="preserve">The Veteran Sprint has uploaded 55 JSTs to MAP, with estimated student savings of $331M and projected 20-year economic impact of $1.34B.</w:t>
       </w:r>
     </w:p>
     <w:p>
@@ -424,7 +424,7 @@
                 <w:szCs w:val="20"/>
                 <w:rFonts w:ascii="Cambria" w:cs="Cambria" w:eastAsia="Cambria" w:hAnsi="Cambria"/>
               </w:rPr>
-              <w:t xml:space="preserve">50,403</w:t>
+              <w:t xml:space="preserve">50,493</w:t>
             </w:r>
           </w:p>
         </w:tc>
@@ -494,7 +494,7 @@
                 <w:szCs w:val="20"/>
                 <w:rFonts w:ascii="Cambria" w:cs="Cambria" w:eastAsia="Cambria" w:hAnsi="Cambria"/>
               </w:rPr>
-              <w:t xml:space="preserve">238k</w:t>
+              <w:t xml:space="preserve">239k</w:t>
             </w:r>
           </w:p>
         </w:tc>
@@ -564,7 +564,7 @@
                 <w:szCs w:val="20"/>
                 <w:rFonts w:ascii="Cambria" w:cs="Cambria" w:eastAsia="Cambria" w:hAnsi="Cambria"/>
               </w:rPr>
-              <w:t xml:space="preserve">12,773</w:t>
+              <w:t xml:space="preserve">12,770</w:t>
             </w:r>
           </w:p>
         </w:tc>
@@ -774,7 +774,7 @@
                 <w:szCs w:val="20"/>
                 <w:rFonts w:ascii="Cambria" w:cs="Cambria" w:eastAsia="Cambria" w:hAnsi="Cambria"/>
               </w:rPr>
-              <w:t xml:space="preserve">$330M</w:t>
+              <w:t xml:space="preserve">$331M</w:t>
             </w:r>
           </w:p>
         </w:tc>
@@ -844,7 +844,7 @@
                 <w:szCs w:val="20"/>
                 <w:rFonts w:ascii="Cambria" w:cs="Cambria" w:eastAsia="Cambria" w:hAnsi="Cambria"/>
               </w:rPr>
-              <w:t xml:space="preserve">$1.33B</w:t>
+              <w:t xml:space="preserve">$1.34B</w:t>
             </w:r>
           </w:p>
         </w:tc>
@@ -30498,7 +30498,7 @@
           <w:szCs w:val="22"/>
           <w:rFonts w:ascii="Cambria" w:cs="Cambria" w:eastAsia="Cambria" w:hAnsi="Cambria"/>
         </w:rPr>
-        <w:t xml:space="preserve">The CPL Initiative has moved from pilot to scale, demonstrating measurable impact in student access, credit attainment, and system engagement. With 50,403 students served, 12,773 statewide credit recommendations, and 102 actively participating colleges, the initiative has surpassed most 2025–26 benchmarks ahead of schedule.</w:t>
+        <w:t xml:space="preserve">The CPL Initiative has moved from pilot to scale, demonstrating measurable impact in student access, credit attainment, and system engagement. With 50,493 students served, 12,770 statewide credit recommendations, and 102 actively participating colleges, the initiative has surpassed most 2025–26 benchmarks ahead of schedule.</w:t>
       </w:r>
     </w:p>
     <w:p>
@@ -30549,7 +30549,7 @@
           <w:szCs w:val="20"/>
           <w:rFonts w:ascii="Cambria" w:cs="Cambria" w:eastAsia="Cambria" w:hAnsi="Cambria"/>
         </w:rPr>
-        <w:t xml:space="preserve">July 20, 2026</w:t>
+        <w:t xml:space="preserve">July 21, 2026</w:t>
       </w:r>
     </w:p>
     <w:sectPr>
@@ -30586,7 +30586,7 @@
         <w:szCs w:val="14"/>
         <w:rFonts w:ascii="Cambria" w:cs="Cambria" w:eastAsia="Cambria" w:hAnsi="Cambria"/>
       </w:rPr>
-      <w:t xml:space="preserve">Generated July 20, 2026  |  California Community Colleges  |  CPL Initiative</w:t>
+      <w:t xml:space="preserve">Generated July 21, 2026  |  California Community Colleges  |  CPL Initiative</w:t>
     </w:r>
     <w:r>
       <w:rPr>

</xml_diff>

<commit_message>
Daily dashboard update — 2026-07-22
</commit_message>
<xml_diff>
--- a/reports/CPL_Master_Report.docx
+++ b/reports/CPL_Master_Report.docx
@@ -141,7 +141,7 @@
           <w:szCs w:val="22"/>
           <w:rFonts w:ascii="Cambria" w:cs="Cambria" w:eastAsia="Cambria" w:hAnsi="Cambria"/>
         </w:rPr>
-        <w:t xml:space="preserve">As of July 21, 2026, the CPL initiative is ahead of schedule, with most 2025–2026 targets met or exceeded and core infrastructure nearing completion. The work has expanded student access, increased transcripted units, and established the foundation for a permanent, statewide CPL service under Vision 2030.</w:t>
+        <w:t xml:space="preserve">As of July 22, 2026, the CPL initiative is ahead of schedule, with most 2025–2026 targets met or exceeded and core infrastructure nearing completion. The work has expanded student access, increased transcripted units, and established the foundation for a permanent, statewide CPL service under Vision 2030.</w:t>
       </w:r>
     </w:p>
     <w:p>
@@ -167,7 +167,7 @@
           <w:szCs w:val="21"/>
           <w:rFonts w:ascii="Cambria" w:cs="Cambria" w:eastAsia="Cambria" w:hAnsi="Cambria"/>
         </w:rPr>
-        <w:t xml:space="preserve">50,496 cumulative students served with CPL awards, surpassing annual targets.</w:t>
+        <w:t xml:space="preserve">50,518 cumulative students served with CPL awards, surpassing annual targets.</w:t>
       </w:r>
     </w:p>
     <w:p>
@@ -185,7 +185,7 @@
           <w:szCs w:val="21"/>
           <w:rFonts w:ascii="Cambria" w:cs="Cambria" w:eastAsia="Cambria" w:hAnsi="Cambria"/>
         </w:rPr>
-        <w:t xml:space="preserve">239k CPL units transcripted across the system.</w:t>
+        <w:t xml:space="preserve">240k CPL units transcripted across the system.</w:t>
       </w:r>
     </w:p>
     <w:p>
@@ -221,7 +221,7 @@
           <w:szCs w:val="21"/>
           <w:rFonts w:ascii="Cambria" w:cs="Cambria" w:eastAsia="Cambria" w:hAnsi="Cambria"/>
         </w:rPr>
-        <w:t xml:space="preserve">12,770 statewide credit recommendations, driven by faculty discipline workgroups spanning high-demand fields.</w:t>
+        <w:t xml:space="preserve">12,719 statewide credit recommendations, driven by faculty discipline workgroups spanning high-demand fields.</w:t>
       </w:r>
     </w:p>
     <w:p>
@@ -239,7 +239,7 @@
           <w:szCs w:val="21"/>
           <w:rFonts w:ascii="Cambria" w:cs="Cambria" w:eastAsia="Cambria" w:hAnsi="Cambria"/>
         </w:rPr>
-        <w:t xml:space="preserve">The Veteran Sprint has uploaded 55 JSTs to MAP, with estimated student savings of $331M and projected 20-year economic impact of $1.34B.</w:t>
+        <w:t xml:space="preserve">The Veteran Sprint has uploaded 55 JSTs to MAP, with estimated student savings of $333M and projected 20-year economic impact of $1.34B.</w:t>
       </w:r>
     </w:p>
     <w:p>
@@ -424,7 +424,7 @@
                 <w:szCs w:val="20"/>
                 <w:rFonts w:ascii="Cambria" w:cs="Cambria" w:eastAsia="Cambria" w:hAnsi="Cambria"/>
               </w:rPr>
-              <w:t xml:space="preserve">50,496</w:t>
+              <w:t xml:space="preserve">50,518</w:t>
             </w:r>
           </w:p>
         </w:tc>
@@ -494,7 +494,7 @@
                 <w:szCs w:val="20"/>
                 <w:rFonts w:ascii="Cambria" w:cs="Cambria" w:eastAsia="Cambria" w:hAnsi="Cambria"/>
               </w:rPr>
-              <w:t xml:space="preserve">239k</w:t>
+              <w:t xml:space="preserve">240k</w:t>
             </w:r>
           </w:p>
         </w:tc>
@@ -564,7 +564,7 @@
                 <w:szCs w:val="20"/>
                 <w:rFonts w:ascii="Cambria" w:cs="Cambria" w:eastAsia="Cambria" w:hAnsi="Cambria"/>
               </w:rPr>
-              <w:t xml:space="preserve">12,770</w:t>
+              <w:t xml:space="preserve">12,719</w:t>
             </w:r>
           </w:p>
         </w:tc>
@@ -774,7 +774,7 @@
                 <w:szCs w:val="20"/>
                 <w:rFonts w:ascii="Cambria" w:cs="Cambria" w:eastAsia="Cambria" w:hAnsi="Cambria"/>
               </w:rPr>
-              <w:t xml:space="preserve">$331M</w:t>
+              <w:t xml:space="preserve">$333M</w:t>
             </w:r>
           </w:p>
         </w:tc>
@@ -30498,7 +30498,7 @@
           <w:szCs w:val="22"/>
           <w:rFonts w:ascii="Cambria" w:cs="Cambria" w:eastAsia="Cambria" w:hAnsi="Cambria"/>
         </w:rPr>
-        <w:t xml:space="preserve">The CPL Initiative has moved from pilot to scale, demonstrating measurable impact in student access, credit attainment, and system engagement. With 50,496 students served, 12,770 statewide credit recommendations, and 102 actively participating colleges, the initiative has surpassed most 2025–26 benchmarks ahead of schedule.</w:t>
+        <w:t xml:space="preserve">The CPL Initiative has moved from pilot to scale, demonstrating measurable impact in student access, credit attainment, and system engagement. With 50,518 students served, 12,719 statewide credit recommendations, and 102 actively participating colleges, the initiative has surpassed most 2025–26 benchmarks ahead of schedule.</w:t>
       </w:r>
     </w:p>
     <w:p>
@@ -30549,7 +30549,7 @@
           <w:szCs w:val="20"/>
           <w:rFonts w:ascii="Cambria" w:cs="Cambria" w:eastAsia="Cambria" w:hAnsi="Cambria"/>
         </w:rPr>
-        <w:t xml:space="preserve">July 21, 2026</w:t>
+        <w:t xml:space="preserve">July 22, 2026</w:t>
       </w:r>
     </w:p>
     <w:sectPr>
@@ -30586,7 +30586,7 @@
         <w:szCs w:val="14"/>
         <w:rFonts w:ascii="Cambria" w:cs="Cambria" w:eastAsia="Cambria" w:hAnsi="Cambria"/>
       </w:rPr>
-      <w:t xml:space="preserve">Generated July 21, 2026  |  California Community Colleges  |  CPL Initiative</w:t>
+      <w:t xml:space="preserve">Generated July 22, 2026  |  California Community Colleges  |  CPL Initiative</w:t>
     </w:r>
     <w:r>
       <w:rPr>

</xml_diff>

<commit_message>
Daily dashboard update — 2026-07-23
</commit_message>
<xml_diff>
--- a/reports/CPL_Master_Report.docx
+++ b/reports/CPL_Master_Report.docx
@@ -141,7 +141,7 @@
           <w:szCs w:val="22"/>
           <w:rFonts w:ascii="Cambria" w:cs="Cambria" w:eastAsia="Cambria" w:hAnsi="Cambria"/>
         </w:rPr>
-        <w:t xml:space="preserve">As of July 22, 2026, the CPL initiative is ahead of schedule, with most 2025–2026 targets met or exceeded and core infrastructure nearing completion. The work has expanded student access, increased transcripted units, and established the foundation for a permanent, statewide CPL service under Vision 2030.</w:t>
+        <w:t xml:space="preserve">As of July 23, 2026, the CPL initiative is ahead of schedule, with most 2025–2026 targets met or exceeded and core infrastructure nearing completion. The work has expanded student access, increased transcripted units, and established the foundation for a permanent, statewide CPL service under Vision 2030.</w:t>
       </w:r>
     </w:p>
     <w:p>
@@ -167,7 +167,7 @@
           <w:szCs w:val="21"/>
           <w:rFonts w:ascii="Cambria" w:cs="Cambria" w:eastAsia="Cambria" w:hAnsi="Cambria"/>
         </w:rPr>
-        <w:t xml:space="preserve">50,518 cumulative students served with CPL awards, surpassing annual targets.</w:t>
+        <w:t xml:space="preserve">50,569 cumulative students served with CPL awards, surpassing annual targets.</w:t>
       </w:r>
     </w:p>
     <w:p>
@@ -185,7 +185,7 @@
           <w:szCs w:val="21"/>
           <w:rFonts w:ascii="Cambria" w:cs="Cambria" w:eastAsia="Cambria" w:hAnsi="Cambria"/>
         </w:rPr>
-        <w:t xml:space="preserve">240k CPL units transcripted across the system.</w:t>
+        <w:t xml:space="preserve">241k CPL units transcripted across the system.</w:t>
       </w:r>
     </w:p>
     <w:p>
@@ -221,7 +221,7 @@
           <w:szCs w:val="21"/>
           <w:rFonts w:ascii="Cambria" w:cs="Cambria" w:eastAsia="Cambria" w:hAnsi="Cambria"/>
         </w:rPr>
-        <w:t xml:space="preserve">12,719 statewide credit recommendations, driven by faculty discipline workgroups spanning high-demand fields.</w:t>
+        <w:t xml:space="preserve">12,701 statewide credit recommendations, driven by faculty discipline workgroups spanning high-demand fields.</w:t>
       </w:r>
     </w:p>
     <w:p>
@@ -239,7 +239,7 @@
           <w:szCs w:val="21"/>
           <w:rFonts w:ascii="Cambria" w:cs="Cambria" w:eastAsia="Cambria" w:hAnsi="Cambria"/>
         </w:rPr>
-        <w:t xml:space="preserve">The Veteran Sprint has uploaded 55 JSTs to MAP, with estimated student savings of $333M and projected 20-year economic impact of $1.34B.</w:t>
+        <w:t xml:space="preserve">The Veteran Sprint has uploaded 55 JSTs to MAP, with estimated student savings of $335M and projected 20-year economic impact of $1.35B.</w:t>
       </w:r>
     </w:p>
     <w:p>
@@ -424,7 +424,7 @@
                 <w:szCs w:val="20"/>
                 <w:rFonts w:ascii="Cambria" w:cs="Cambria" w:eastAsia="Cambria" w:hAnsi="Cambria"/>
               </w:rPr>
-              <w:t xml:space="preserve">50,518</w:t>
+              <w:t xml:space="preserve">50,569</w:t>
             </w:r>
           </w:p>
         </w:tc>
@@ -494,7 +494,7 @@
                 <w:szCs w:val="20"/>
                 <w:rFonts w:ascii="Cambria" w:cs="Cambria" w:eastAsia="Cambria" w:hAnsi="Cambria"/>
               </w:rPr>
-              <w:t xml:space="preserve">240k</w:t>
+              <w:t xml:space="preserve">241k</w:t>
             </w:r>
           </w:p>
         </w:tc>
@@ -564,7 +564,7 @@
                 <w:szCs w:val="20"/>
                 <w:rFonts w:ascii="Cambria" w:cs="Cambria" w:eastAsia="Cambria" w:hAnsi="Cambria"/>
               </w:rPr>
-              <w:t xml:space="preserve">12,719</w:t>
+              <w:t xml:space="preserve">12,701</w:t>
             </w:r>
           </w:p>
         </w:tc>
@@ -774,7 +774,7 @@
                 <w:szCs w:val="20"/>
                 <w:rFonts w:ascii="Cambria" w:cs="Cambria" w:eastAsia="Cambria" w:hAnsi="Cambria"/>
               </w:rPr>
-              <w:t xml:space="preserve">$333M</w:t>
+              <w:t xml:space="preserve">$335M</w:t>
             </w:r>
           </w:p>
         </w:tc>
@@ -844,7 +844,7 @@
                 <w:szCs w:val="20"/>
                 <w:rFonts w:ascii="Cambria" w:cs="Cambria" w:eastAsia="Cambria" w:hAnsi="Cambria"/>
               </w:rPr>
-              <w:t xml:space="preserve">$1.34B</w:t>
+              <w:t xml:space="preserve">$1.35B</w:t>
             </w:r>
           </w:p>
         </w:tc>
@@ -29472,7 +29472,7 @@
           <w:szCs w:val="22"/>
           <w:rFonts w:ascii="Cambria" w:cs="Cambria" w:eastAsia="Cambria" w:hAnsi="Cambria"/>
         </w:rPr>
-        <w:t xml:space="preserve">The CPL Initiative has moved from pilot to scale, demonstrating measurable impact in student access, credit attainment, and system engagement. With 50,518 students served, 12,719 statewide credit recommendations, and 102 actively participating colleges, the initiative has surpassed most 2025–26 benchmarks ahead of schedule.</w:t>
+        <w:t xml:space="preserve">The CPL Initiative has moved from pilot to scale, demonstrating measurable impact in student access, credit attainment, and system engagement. With 50,569 students served, 12,701 statewide credit recommendations, and 102 actively participating colleges, the initiative has surpassed most 2025–26 benchmarks ahead of schedule.</w:t>
       </w:r>
     </w:p>
     <w:p>
@@ -29523,7 +29523,7 @@
           <w:szCs w:val="20"/>
           <w:rFonts w:ascii="Cambria" w:cs="Cambria" w:eastAsia="Cambria" w:hAnsi="Cambria"/>
         </w:rPr>
-        <w:t xml:space="preserve">July 22, 2026</w:t>
+        <w:t xml:space="preserve">July 23, 2026</w:t>
       </w:r>
     </w:p>
     <w:sectPr>
@@ -29560,7 +29560,7 @@
         <w:szCs w:val="14"/>
         <w:rFonts w:ascii="Cambria" w:cs="Cambria" w:eastAsia="Cambria" w:hAnsi="Cambria"/>
       </w:rPr>
-      <w:t xml:space="preserve">Generated July 22, 2026  |  California Community Colleges  |  CPL Initiative</w:t>
+      <w:t xml:space="preserve">Generated July 23, 2026  |  California Community Colleges  |  CPL Initiative</w:t>
     </w:r>
     <w:r>
       <w:rPr>

</xml_diff>

<commit_message>
Daily dashboard update — 2026-07-24
</commit_message>
<xml_diff>
--- a/reports/CPL_Master_Report.docx
+++ b/reports/CPL_Master_Report.docx
@@ -141,7 +141,7 @@
           <w:szCs w:val="22"/>
           <w:rFonts w:ascii="Cambria" w:cs="Cambria" w:eastAsia="Cambria" w:hAnsi="Cambria"/>
         </w:rPr>
-        <w:t xml:space="preserve">As of July 23, 2026, the CPL initiative is ahead of schedule, with most 2025–2026 targets met or exceeded and core infrastructure nearing completion. The work has expanded student access, increased transcripted units, and established the foundation for a permanent, statewide CPL service under Vision 2030.</w:t>
+        <w:t xml:space="preserve">As of July 24, 2026, the CPL initiative is ahead of schedule, with most 2025–2026 targets met or exceeded and core infrastructure nearing completion. The work has expanded student access, increased transcripted units, and established the foundation for a permanent, statewide CPL service under Vision 2030.</w:t>
       </w:r>
     </w:p>
     <w:p>
@@ -167,7 +167,7 @@
           <w:szCs w:val="21"/>
           <w:rFonts w:ascii="Cambria" w:cs="Cambria" w:eastAsia="Cambria" w:hAnsi="Cambria"/>
         </w:rPr>
-        <w:t xml:space="preserve">50,570 cumulative students served with CPL awards, surpassing annual targets.</w:t>
+        <w:t xml:space="preserve">50,644 cumulative students served with CPL awards, surpassing annual targets.</w:t>
       </w:r>
     </w:p>
     <w:p>
@@ -221,7 +221,7 @@
           <w:szCs w:val="21"/>
           <w:rFonts w:ascii="Cambria" w:cs="Cambria" w:eastAsia="Cambria" w:hAnsi="Cambria"/>
         </w:rPr>
-        <w:t xml:space="preserve">12,701 statewide credit recommendations, driven by faculty discipline workgroups spanning high-demand fields.</w:t>
+        <w:t xml:space="preserve">12,698 statewide credit recommendations, driven by faculty discipline workgroups spanning high-demand fields.</w:t>
       </w:r>
     </w:p>
     <w:p>
@@ -424,7 +424,7 @@
                 <w:szCs w:val="20"/>
                 <w:rFonts w:ascii="Cambria" w:cs="Cambria" w:eastAsia="Cambria" w:hAnsi="Cambria"/>
               </w:rPr>
-              <w:t xml:space="preserve">50,570</w:t>
+              <w:t xml:space="preserve">50,644</w:t>
             </w:r>
           </w:p>
         </w:tc>
@@ -564,7 +564,7 @@
                 <w:szCs w:val="20"/>
                 <w:rFonts w:ascii="Cambria" w:cs="Cambria" w:eastAsia="Cambria" w:hAnsi="Cambria"/>
               </w:rPr>
-              <w:t xml:space="preserve">12,701</w:t>
+              <w:t xml:space="preserve">12,698</w:t>
             </w:r>
           </w:p>
         </w:tc>
@@ -22631,7 +22631,7 @@
                 <w:szCs w:val="20"/>
                 <w:rFonts w:ascii="Cambria" w:cs="Cambria" w:eastAsia="Cambria" w:hAnsi="Cambria"/>
               </w:rPr>
-              <w:t xml:space="preserve">A draft outcomes-based funding model has been developed using three key metrics to demonstrate funding potential for each college in the system. This model will support a future public dashboard enabling colleges to monitor their outcomes and funding performance in real-time.</w:t>
+              <w:t xml:space="preserve">SB 135 and AB 135 were enacted, providing $7 million in ongoing funding for CPL Initiative operations, technical assistance, faculty workgroups, technology development, partnerships, and intersegmental collaboration, plus $35 million to support college awards based on CPL outcomes, projects, and innovations. The Chancellor's Office has drafted a two-year college funding model, with finalization expected in August 2026, field deployment in October 2026, and first disbursements planned for November or December 2026. Link to bills: https://legiscan.com/CA/text/AB135/id/3044016</w:t>
             </w:r>
           </w:p>
           <w:p>
@@ -23303,7 +23303,8 @@
                 <w:szCs w:val="20"/>
                 <w:rFonts w:ascii="Cambria" w:cs="Cambria" w:eastAsia="Cambria" w:hAnsi="Cambria"/>
               </w:rPr>
-              <w:t xml:space="preserve">Proposed funding in Governor's budget; monitoring and providing evidence to support advancement</w:t>
+              <w:t xml:space="preserve">SB 135 and AB 135 were enacted, providing $7 million in ongoing funding for CPL Initiative operations, technical assistance, faculty workgroups, technology development, partnerships, and intersegmental collaboration, plus $35 million to support college awards based on CPL outcomes, projects, and innovations. The Chancellor's Office has drafted a two-year college funding model, with finalization expected in August 2026, field deployment in October 2026, and first disbursements planned for November or December 2026.
+Link to bills: https://legiscan.com/CA/text/AB135/id/3044016</w:t>
             </w:r>
           </w:p>
           <w:p>
@@ -29472,7 +29473,7 @@
           <w:szCs w:val="22"/>
           <w:rFonts w:ascii="Cambria" w:cs="Cambria" w:eastAsia="Cambria" w:hAnsi="Cambria"/>
         </w:rPr>
-        <w:t xml:space="preserve">The CPL Initiative has moved from pilot to scale, demonstrating measurable impact in student access, credit attainment, and system engagement. With 50,570 students served, 12,701 statewide credit recommendations, and 102 actively participating colleges, the initiative has surpassed most 2025–26 benchmarks ahead of schedule.</w:t>
+        <w:t xml:space="preserve">The CPL Initiative has moved from pilot to scale, demonstrating measurable impact in student access, credit attainment, and system engagement. With 50,644 students served, 12,698 statewide credit recommendations, and 102 actively participating colleges, the initiative has surpassed most 2025–26 benchmarks ahead of schedule.</w:t>
       </w:r>
     </w:p>
     <w:p>
@@ -29523,7 +29524,7 @@
           <w:szCs w:val="20"/>
           <w:rFonts w:ascii="Cambria" w:cs="Cambria" w:eastAsia="Cambria" w:hAnsi="Cambria"/>
         </w:rPr>
-        <w:t xml:space="preserve">July 23, 2026</w:t>
+        <w:t xml:space="preserve">July 24, 2026</w:t>
       </w:r>
     </w:p>
     <w:sectPr>
@@ -29560,7 +29561,7 @@
         <w:szCs w:val="14"/>
         <w:rFonts w:ascii="Cambria" w:cs="Cambria" w:eastAsia="Cambria" w:hAnsi="Cambria"/>
       </w:rPr>
-      <w:t xml:space="preserve">Generated July 23, 2026  |  California Community Colleges  |  CPL Initiative</w:t>
+      <w:t xml:space="preserve">Generated July 24, 2026  |  California Community Colleges  |  CPL Initiative</w:t>
     </w:r>
     <w:r>
       <w:rPr>

</xml_diff>

<commit_message>
Daily dashboard update — 2026-07-25
</commit_message>
<xml_diff>
--- a/reports/CPL_Master_Report.docx
+++ b/reports/CPL_Master_Report.docx
@@ -141,7 +141,7 @@
           <w:szCs w:val="22"/>
           <w:rFonts w:ascii="Cambria" w:cs="Cambria" w:eastAsia="Cambria" w:hAnsi="Cambria"/>
         </w:rPr>
-        <w:t xml:space="preserve">As of July 24, 2026, the CPL initiative is ahead of schedule, with most 2025–2026 targets met or exceeded and core infrastructure nearing completion. The work has expanded student access, increased transcripted units, and established the foundation for a permanent, statewide CPL service under Vision 2030.</w:t>
+        <w:t xml:space="preserve">As of July 25, 2026, the CPL initiative is ahead of schedule, with most 2025–2026 targets met or exceeded and core infrastructure nearing completion. The work has expanded student access, increased transcripted units, and established the foundation for a permanent, statewide CPL service under Vision 2030.</w:t>
       </w:r>
     </w:p>
     <w:p>
@@ -167,7 +167,7 @@
           <w:szCs w:val="21"/>
           <w:rFonts w:ascii="Cambria" w:cs="Cambria" w:eastAsia="Cambria" w:hAnsi="Cambria"/>
         </w:rPr>
-        <w:t xml:space="preserve">50,644 cumulative students served with CPL awards, surpassing annual targets.</w:t>
+        <w:t xml:space="preserve">50,717 cumulative students served with CPL awards, surpassing annual targets.</w:t>
       </w:r>
     </w:p>
     <w:p>
@@ -424,7 +424,7 @@
                 <w:szCs w:val="20"/>
                 <w:rFonts w:ascii="Cambria" w:cs="Cambria" w:eastAsia="Cambria" w:hAnsi="Cambria"/>
               </w:rPr>
-              <w:t xml:space="preserve">50,644</w:t>
+              <w:t xml:space="preserve">50,717</w:t>
             </w:r>
           </w:p>
         </w:tc>
@@ -29473,7 +29473,7 @@
           <w:szCs w:val="22"/>
           <w:rFonts w:ascii="Cambria" w:cs="Cambria" w:eastAsia="Cambria" w:hAnsi="Cambria"/>
         </w:rPr>
-        <w:t xml:space="preserve">The CPL Initiative has moved from pilot to scale, demonstrating measurable impact in student access, credit attainment, and system engagement. With 50,644 students served, 12,698 statewide credit recommendations, and 102 actively participating colleges, the initiative has surpassed most 2025–26 benchmarks ahead of schedule.</w:t>
+        <w:t xml:space="preserve">The CPL Initiative has moved from pilot to scale, demonstrating measurable impact in student access, credit attainment, and system engagement. With 50,717 students served, 12,698 statewide credit recommendations, and 102 actively participating colleges, the initiative has surpassed most 2025–26 benchmarks ahead of schedule.</w:t>
       </w:r>
     </w:p>
     <w:p>
@@ -29524,7 +29524,7 @@
           <w:szCs w:val="20"/>
           <w:rFonts w:ascii="Cambria" w:cs="Cambria" w:eastAsia="Cambria" w:hAnsi="Cambria"/>
         </w:rPr>
-        <w:t xml:space="preserve">July 24, 2026</w:t>
+        <w:t xml:space="preserve">July 25, 2026</w:t>
       </w:r>
     </w:p>
     <w:sectPr>
@@ -29561,7 +29561,7 @@
         <w:szCs w:val="14"/>
         <w:rFonts w:ascii="Cambria" w:cs="Cambria" w:eastAsia="Cambria" w:hAnsi="Cambria"/>
       </w:rPr>
-      <w:t xml:space="preserve">Generated July 24, 2026  |  California Community Colleges  |  CPL Initiative</w:t>
+      <w:t xml:space="preserve">Generated July 25, 2026  |  California Community Colleges  |  CPL Initiative</w:t>
     </w:r>
     <w:r>
       <w:rPr>

</xml_diff>

<commit_message>
Daily dashboard update — 2026-07-26
</commit_message>
<xml_diff>
--- a/reports/CPL_Master_Report.docx
+++ b/reports/CPL_Master_Report.docx
@@ -141,7 +141,7 @@
           <w:szCs w:val="22"/>
           <w:rFonts w:ascii="Cambria" w:cs="Cambria" w:eastAsia="Cambria" w:hAnsi="Cambria"/>
         </w:rPr>
-        <w:t xml:space="preserve">As of July 25, 2026, the CPL initiative is ahead of schedule, with most 2025–2026 targets met or exceeded and core infrastructure nearing completion. The work has expanded student access, increased transcripted units, and established the foundation for a permanent, statewide CPL service under Vision 2030.</w:t>
+        <w:t xml:space="preserve">As of July 26, 2026, the CPL initiative is ahead of schedule, with most 2025–2026 targets met or exceeded and core infrastructure nearing completion. The work has expanded student access, increased transcripted units, and established the foundation for a permanent, statewide CPL service under Vision 2030.</w:t>
       </w:r>
     </w:p>
     <w:p>
@@ -29524,7 +29524,7 @@
           <w:szCs w:val="20"/>
           <w:rFonts w:ascii="Cambria" w:cs="Cambria" w:eastAsia="Cambria" w:hAnsi="Cambria"/>
         </w:rPr>
-        <w:t xml:space="preserve">July 25, 2026</w:t>
+        <w:t xml:space="preserve">July 26, 2026</w:t>
       </w:r>
     </w:p>
     <w:sectPr>
@@ -29561,7 +29561,7 @@
         <w:szCs w:val="14"/>
         <w:rFonts w:ascii="Cambria" w:cs="Cambria" w:eastAsia="Cambria" w:hAnsi="Cambria"/>
       </w:rPr>
-      <w:t xml:space="preserve">Generated July 25, 2026  |  California Community Colleges  |  CPL Initiative</w:t>
+      <w:t xml:space="preserve">Generated July 26, 2026  |  California Community Colleges  |  CPL Initiative</w:t>
     </w:r>
     <w:r>
       <w:rPr>

</xml_diff>

<commit_message>
Daily dashboard update — 2026-07-27
</commit_message>
<xml_diff>
--- a/reports/CPL_Master_Report.docx
+++ b/reports/CPL_Master_Report.docx
@@ -141,7 +141,7 @@
           <w:szCs w:val="22"/>
           <w:rFonts w:ascii="Cambria" w:cs="Cambria" w:eastAsia="Cambria" w:hAnsi="Cambria"/>
         </w:rPr>
-        <w:t xml:space="preserve">As of July 26, 2026, the CPL initiative is ahead of schedule, with most 2025–2026 targets met or exceeded and core infrastructure nearing completion. The work has expanded student access, increased transcripted units, and established the foundation for a permanent, statewide CPL service under Vision 2030.</w:t>
+        <w:t xml:space="preserve">As of July 27, 2026, the CPL initiative is ahead of schedule, with most 2025–2026 targets met or exceeded and core infrastructure nearing completion. The work has expanded student access, increased transcripted units, and established the foundation for a permanent, statewide CPL service under Vision 2030.</w:t>
       </w:r>
     </w:p>
     <w:p>
@@ -167,7 +167,7 @@
           <w:szCs w:val="21"/>
           <w:rFonts w:ascii="Cambria" w:cs="Cambria" w:eastAsia="Cambria" w:hAnsi="Cambria"/>
         </w:rPr>
-        <w:t xml:space="preserve">50,717 cumulative students served with CPL awards, surpassing annual targets.</w:t>
+        <w:t xml:space="preserve">50,722 cumulative students served with CPL awards, surpassing annual targets.</w:t>
       </w:r>
     </w:p>
     <w:p>
@@ -221,7 +221,7 @@
           <w:szCs w:val="21"/>
           <w:rFonts w:ascii="Cambria" w:cs="Cambria" w:eastAsia="Cambria" w:hAnsi="Cambria"/>
         </w:rPr>
-        <w:t xml:space="preserve">12,698 statewide credit recommendations, driven by faculty discipline workgroups spanning high-demand fields.</w:t>
+        <w:t xml:space="preserve">12,702 statewide credit recommendations, driven by faculty discipline workgroups spanning high-demand fields.</w:t>
       </w:r>
     </w:p>
     <w:p>
@@ -424,7 +424,7 @@
                 <w:szCs w:val="20"/>
                 <w:rFonts w:ascii="Cambria" w:cs="Cambria" w:eastAsia="Cambria" w:hAnsi="Cambria"/>
               </w:rPr>
-              <w:t xml:space="preserve">50,717</w:t>
+              <w:t xml:space="preserve">50,722</w:t>
             </w:r>
           </w:p>
         </w:tc>
@@ -564,7 +564,7 @@
                 <w:szCs w:val="20"/>
                 <w:rFonts w:ascii="Cambria" w:cs="Cambria" w:eastAsia="Cambria" w:hAnsi="Cambria"/>
               </w:rPr>
-              <w:t xml:space="preserve">12,698</w:t>
+              <w:t xml:space="preserve">12,702</w:t>
             </w:r>
           </w:p>
         </w:tc>
@@ -29473,7 +29473,7 @@
           <w:szCs w:val="22"/>
           <w:rFonts w:ascii="Cambria" w:cs="Cambria" w:eastAsia="Cambria" w:hAnsi="Cambria"/>
         </w:rPr>
-        <w:t xml:space="preserve">The CPL Initiative has moved from pilot to scale, demonstrating measurable impact in student access, credit attainment, and system engagement. With 50,717 students served, 12,698 statewide credit recommendations, and 102 actively participating colleges, the initiative has surpassed most 2025–26 benchmarks ahead of schedule.</w:t>
+        <w:t xml:space="preserve">The CPL Initiative has moved from pilot to scale, demonstrating measurable impact in student access, credit attainment, and system engagement. With 50,722 students served, 12,702 statewide credit recommendations, and 102 actively participating colleges, the initiative has surpassed most 2025–26 benchmarks ahead of schedule.</w:t>
       </w:r>
     </w:p>
     <w:p>
@@ -29524,7 +29524,7 @@
           <w:szCs w:val="20"/>
           <w:rFonts w:ascii="Cambria" w:cs="Cambria" w:eastAsia="Cambria" w:hAnsi="Cambria"/>
         </w:rPr>
-        <w:t xml:space="preserve">July 26, 2026</w:t>
+        <w:t xml:space="preserve">July 27, 2026</w:t>
       </w:r>
     </w:p>
     <w:sectPr>
@@ -29561,7 +29561,7 @@
         <w:szCs w:val="14"/>
         <w:rFonts w:ascii="Cambria" w:cs="Cambria" w:eastAsia="Cambria" w:hAnsi="Cambria"/>
       </w:rPr>
-      <w:t xml:space="preserve">Generated July 26, 2026  |  California Community Colleges  |  CPL Initiative</w:t>
+      <w:t xml:space="preserve">Generated July 27, 2026  |  California Community Colleges  |  CPL Initiative</w:t>
     </w:r>
     <w:r>
       <w:rPr>

</xml_diff>

<commit_message>
Daily dashboard update — 2026-07-28
</commit_message>
<xml_diff>
--- a/reports/CPL_Master_Report.docx
+++ b/reports/CPL_Master_Report.docx
@@ -141,7 +141,7 @@
           <w:szCs w:val="22"/>
           <w:rFonts w:ascii="Cambria" w:cs="Cambria" w:eastAsia="Cambria" w:hAnsi="Cambria"/>
         </w:rPr>
-        <w:t xml:space="preserve">As of July 27, 2026, the CPL initiative is ahead of schedule, with most 2025–2026 targets met or exceeded and core infrastructure nearing completion. The work has expanded student access, increased transcripted units, and established the foundation for a permanent, statewide CPL service under Vision 2030.</w:t>
+        <w:t xml:space="preserve">As of July 28, 2026, the CPL initiative is ahead of schedule, with most 2025–2026 targets met or exceeded and core infrastructure nearing completion. The work has expanded student access, increased transcripted units, and established the foundation for a permanent, statewide CPL service under Vision 2030.</w:t>
       </w:r>
     </w:p>
     <w:p>
@@ -167,7 +167,7 @@
           <w:szCs w:val="21"/>
           <w:rFonts w:ascii="Cambria" w:cs="Cambria" w:eastAsia="Cambria" w:hAnsi="Cambria"/>
         </w:rPr>
-        <w:t xml:space="preserve">51,280 cumulative students served with CPL awards, surpassing annual targets.</w:t>
+        <w:t xml:space="preserve">51,288 cumulative students served with CPL awards, surpassing annual targets.</w:t>
       </w:r>
     </w:p>
     <w:p>
@@ -239,7 +239,7 @@
           <w:szCs w:val="21"/>
           <w:rFonts w:ascii="Cambria" w:cs="Cambria" w:eastAsia="Cambria" w:hAnsi="Cambria"/>
         </w:rPr>
-        <w:t xml:space="preserve">The Veteran Sprint has uploaded 55 JSTs to MAP, with estimated student savings of $337M and projected 20-year economic impact of $1.36B.</w:t>
+        <w:t xml:space="preserve">The Veteran Sprint has uploaded 55 JSTs to MAP, with estimated student savings of $338M and projected 20-year economic impact of $1.36B.</w:t>
       </w:r>
     </w:p>
     <w:p>
@@ -424,7 +424,7 @@
                 <w:szCs w:val="20"/>
                 <w:rFonts w:ascii="Cambria" w:cs="Cambria" w:eastAsia="Cambria" w:hAnsi="Cambria"/>
               </w:rPr>
-              <w:t xml:space="preserve">51,280</w:t>
+              <w:t xml:space="preserve">51,288</w:t>
             </w:r>
           </w:p>
         </w:tc>
@@ -774,7 +774,7 @@
                 <w:szCs w:val="20"/>
                 <w:rFonts w:ascii="Cambria" w:cs="Cambria" w:eastAsia="Cambria" w:hAnsi="Cambria"/>
               </w:rPr>
-              <w:t xml:space="preserve">$337M</w:t>
+              <w:t xml:space="preserve">$338M</w:t>
             </w:r>
           </w:p>
         </w:tc>
@@ -29608,7 +29608,7 @@
           <w:szCs w:val="22"/>
           <w:rFonts w:ascii="Cambria" w:cs="Cambria" w:eastAsia="Cambria" w:hAnsi="Cambria"/>
         </w:rPr>
-        <w:t xml:space="preserve">The CPL Initiative has moved from pilot to scale, demonstrating measurable impact in student access, credit attainment, and system engagement. With 51,280 students served, 12,713 statewide credit recommendations, and 102 actively participating colleges, the initiative has surpassed most 2025–26 benchmarks ahead of schedule.</w:t>
+        <w:t xml:space="preserve">The CPL Initiative has moved from pilot to scale, demonstrating measurable impact in student access, credit attainment, and system engagement. With 51,288 students served, 12,713 statewide credit recommendations, and 102 actively participating colleges, the initiative has surpassed most 2025–26 benchmarks ahead of schedule.</w:t>
       </w:r>
     </w:p>
     <w:p>
@@ -29659,7 +29659,7 @@
           <w:szCs w:val="20"/>
           <w:rFonts w:ascii="Cambria" w:cs="Cambria" w:eastAsia="Cambria" w:hAnsi="Cambria"/>
         </w:rPr>
-        <w:t xml:space="preserve">July 27, 2026</w:t>
+        <w:t xml:space="preserve">July 28, 2026</w:t>
       </w:r>
     </w:p>
     <w:sectPr>
@@ -29696,7 +29696,7 @@
         <w:szCs w:val="14"/>
         <w:rFonts w:ascii="Cambria" w:cs="Cambria" w:eastAsia="Cambria" w:hAnsi="Cambria"/>
       </w:rPr>
-      <w:t xml:space="preserve">Generated July 27, 2026  |  California Community Colleges  |  CPL Initiative</w:t>
+      <w:t xml:space="preserve">Generated July 28, 2026  |  California Community Colleges  |  CPL Initiative</w:t>
     </w:r>
     <w:r>
       <w:rPr>

</xml_diff>

<commit_message>
Daily dashboard update — 2026-07-29
</commit_message>
<xml_diff>
--- a/reports/CPL_Master_Report.docx
+++ b/reports/CPL_Master_Report.docx
@@ -141,7 +141,7 @@
           <w:szCs w:val="22"/>
           <w:rFonts w:ascii="Cambria" w:cs="Cambria" w:eastAsia="Cambria" w:hAnsi="Cambria"/>
         </w:rPr>
-        <w:t xml:space="preserve">As of July 28, 2026, the CPL initiative is ahead of schedule, with most 2025–2026 targets met or exceeded and core infrastructure nearing completion. The work has expanded student access, increased transcripted units, and established the foundation for a permanent, statewide CPL service under Vision 2030.</w:t>
+        <w:t xml:space="preserve">As of July 29, 2026, the CPL initiative is ahead of schedule, with most 2025–2026 targets met or exceeded and core infrastructure nearing completion. The work has expanded student access, increased transcripted units, and established the foundation for a permanent, statewide CPL service under Vision 2030.</w:t>
       </w:r>
     </w:p>
     <w:p>
@@ -167,7 +167,7 @@
           <w:szCs w:val="21"/>
           <w:rFonts w:ascii="Cambria" w:cs="Cambria" w:eastAsia="Cambria" w:hAnsi="Cambria"/>
         </w:rPr>
-        <w:t xml:space="preserve">51,294 cumulative students served with CPL awards, surpassing annual targets.</w:t>
+        <w:t xml:space="preserve">50,808 cumulative students served with CPL awards, surpassing annual targets.</w:t>
       </w:r>
     </w:p>
     <w:p>
@@ -221,7 +221,7 @@
           <w:szCs w:val="21"/>
           <w:rFonts w:ascii="Cambria" w:cs="Cambria" w:eastAsia="Cambria" w:hAnsi="Cambria"/>
         </w:rPr>
-        <w:t xml:space="preserve">12,713 statewide credit recommendations, driven by faculty discipline workgroups spanning high-demand fields.</w:t>
+        <w:t xml:space="preserve">12,698 statewide credit recommendations, driven by faculty discipline workgroups spanning high-demand fields.</w:t>
       </w:r>
     </w:p>
     <w:p>
@@ -239,7 +239,7 @@
           <w:szCs w:val="21"/>
           <w:rFonts w:ascii="Cambria" w:cs="Cambria" w:eastAsia="Cambria" w:hAnsi="Cambria"/>
         </w:rPr>
-        <w:t xml:space="preserve">The Veteran Sprint has uploaded 55 JSTs to MAP, with estimated student savings of $338M and projected 20-year economic impact of $1.36B.</w:t>
+        <w:t xml:space="preserve">The Veteran Sprint has uploaded 55 JSTs to MAP, with estimated student savings of $336M and projected 20-year economic impact of $1.36B.</w:t>
       </w:r>
     </w:p>
     <w:p>
@@ -424,7 +424,7 @@
                 <w:szCs w:val="20"/>
                 <w:rFonts w:ascii="Cambria" w:cs="Cambria" w:eastAsia="Cambria" w:hAnsi="Cambria"/>
               </w:rPr>
-              <w:t xml:space="preserve">51,294</w:t>
+              <w:t xml:space="preserve">50,808</w:t>
             </w:r>
           </w:p>
         </w:tc>
@@ -564,7 +564,7 @@
                 <w:szCs w:val="20"/>
                 <w:rFonts w:ascii="Cambria" w:cs="Cambria" w:eastAsia="Cambria" w:hAnsi="Cambria"/>
               </w:rPr>
-              <w:t xml:space="preserve">12,713</w:t>
+              <w:t xml:space="preserve">12,698</w:t>
             </w:r>
           </w:p>
         </w:tc>
@@ -774,7 +774,7 @@
                 <w:szCs w:val="20"/>
                 <w:rFonts w:ascii="Cambria" w:cs="Cambria" w:eastAsia="Cambria" w:hAnsi="Cambria"/>
               </w:rPr>
-              <w:t xml:space="preserve">$338M</w:t>
+              <w:t xml:space="preserve">$336M</w:t>
             </w:r>
           </w:p>
         </w:tc>
@@ -29608,7 +29608,7 @@
           <w:szCs w:val="22"/>
           <w:rFonts w:ascii="Cambria" w:cs="Cambria" w:eastAsia="Cambria" w:hAnsi="Cambria"/>
         </w:rPr>
-        <w:t xml:space="preserve">The CPL Initiative has moved from pilot to scale, demonstrating measurable impact in student access, credit attainment, and system engagement. With 51,294 students served, 12,713 statewide credit recommendations, and 102 actively participating colleges, the initiative has surpassed most 2025–26 benchmarks ahead of schedule.</w:t>
+        <w:t xml:space="preserve">The CPL Initiative has moved from pilot to scale, demonstrating measurable impact in student access, credit attainment, and system engagement. With 50,808 students served, 12,698 statewide credit recommendations, and 102 actively participating colleges, the initiative has surpassed most 2025–26 benchmarks ahead of schedule.</w:t>
       </w:r>
     </w:p>
     <w:p>
@@ -29659,7 +29659,7 @@
           <w:szCs w:val="20"/>
           <w:rFonts w:ascii="Cambria" w:cs="Cambria" w:eastAsia="Cambria" w:hAnsi="Cambria"/>
         </w:rPr>
-        <w:t xml:space="preserve">July 28, 2026</w:t>
+        <w:t xml:space="preserve">July 29, 2026</w:t>
       </w:r>
     </w:p>
     <w:sectPr>
@@ -29696,7 +29696,7 @@
         <w:szCs w:val="14"/>
         <w:rFonts w:ascii="Cambria" w:cs="Cambria" w:eastAsia="Cambria" w:hAnsi="Cambria"/>
       </w:rPr>
-      <w:t xml:space="preserve">Generated July 28, 2026  |  California Community Colleges  |  CPL Initiative</w:t>
+      <w:t xml:space="preserve">Generated July 29, 2026  |  California Community Colleges  |  CPL Initiative</w:t>
     </w:r>
     <w:r>
       <w:rPr>

</xml_diff>

<commit_message>
Daily dashboard update — 2026-07-30
</commit_message>
<xml_diff>
--- a/reports/CPL_Master_Report.docx
+++ b/reports/CPL_Master_Report.docx
@@ -141,7 +141,7 @@
           <w:szCs w:val="22"/>
           <w:rFonts w:ascii="Cambria" w:cs="Cambria" w:eastAsia="Cambria" w:hAnsi="Cambria"/>
         </w:rPr>
-        <w:t xml:space="preserve">As of July 29, 2026, the CPL initiative is ahead of schedule, with most 2025–2026 targets met or exceeded and core infrastructure nearing completion. The work has expanded student access, increased transcripted units, and established the foundation for a permanent, statewide CPL service under Vision 2030.</w:t>
+        <w:t xml:space="preserve">As of July 30, 2026, the CPL initiative is ahead of schedule, with most 2025–2026 targets met or exceeded and core infrastructure nearing completion. The work has expanded student access, increased transcripted units, and established the foundation for a permanent, statewide CPL service under Vision 2030.</w:t>
       </w:r>
     </w:p>
     <w:p>
@@ -167,7 +167,7 @@
           <w:szCs w:val="21"/>
           <w:rFonts w:ascii="Cambria" w:cs="Cambria" w:eastAsia="Cambria" w:hAnsi="Cambria"/>
         </w:rPr>
-        <w:t xml:space="preserve">50,809 cumulative students served with CPL awards, surpassing annual targets.</w:t>
+        <w:t xml:space="preserve">50,862 cumulative students served with CPL awards, surpassing annual targets.</w:t>
       </w:r>
     </w:p>
     <w:p>
@@ -203,7 +203,7 @@
           <w:szCs w:val="21"/>
           <w:rFonts w:ascii="Cambria" w:cs="Cambria" w:eastAsia="Cambria" w:hAnsi="Cambria"/>
         </w:rPr>
-        <w:t xml:space="preserve">102 colleges meeting active participation thresholds, exceeding the goal of 50.</w:t>
+        <w:t xml:space="preserve">103 colleges meeting active participation thresholds, exceeding the goal of 50.</w:t>
       </w:r>
     </w:p>
     <w:p>
@@ -221,7 +221,7 @@
           <w:szCs w:val="21"/>
           <w:rFonts w:ascii="Cambria" w:cs="Cambria" w:eastAsia="Cambria" w:hAnsi="Cambria"/>
         </w:rPr>
-        <w:t xml:space="preserve">12,698 statewide credit recommendations, driven by faculty discipline workgroups spanning high-demand fields.</w:t>
+        <w:t xml:space="preserve">12,712 statewide credit recommendations, driven by faculty discipline workgroups spanning high-demand fields.</w:t>
       </w:r>
     </w:p>
     <w:p>
@@ -239,7 +239,7 @@
           <w:szCs w:val="21"/>
           <w:rFonts w:ascii="Cambria" w:cs="Cambria" w:eastAsia="Cambria" w:hAnsi="Cambria"/>
         </w:rPr>
-        <w:t xml:space="preserve">The Veteran Sprint has uploaded 55 JSTs to MAP, with estimated student savings of $336M and projected 20-year economic impact of $1.36B.</w:t>
+        <w:t xml:space="preserve">The Veteran Sprint has uploaded 55 JSTs to MAP, with estimated student savings of $337M and projected 20-year economic impact of $1.36B.</w:t>
       </w:r>
     </w:p>
     <w:p>
@@ -424,7 +424,7 @@
                 <w:szCs w:val="20"/>
                 <w:rFonts w:ascii="Cambria" w:cs="Cambria" w:eastAsia="Cambria" w:hAnsi="Cambria"/>
               </w:rPr>
-              <w:t xml:space="preserve">50,809</w:t>
+              <w:t xml:space="preserve">50,862</w:t>
             </w:r>
           </w:p>
         </w:tc>
@@ -564,7 +564,7 @@
                 <w:szCs w:val="20"/>
                 <w:rFonts w:ascii="Cambria" w:cs="Cambria" w:eastAsia="Cambria" w:hAnsi="Cambria"/>
               </w:rPr>
-              <w:t xml:space="preserve">12,698</w:t>
+              <w:t xml:space="preserve">12,712</w:t>
             </w:r>
           </w:p>
         </w:tc>
@@ -634,7 +634,7 @@
                 <w:szCs w:val="20"/>
                 <w:rFonts w:ascii="Cambria" w:cs="Cambria" w:eastAsia="Cambria" w:hAnsi="Cambria"/>
               </w:rPr>
-              <w:t xml:space="preserve">102</w:t>
+              <w:t xml:space="preserve">103</w:t>
             </w:r>
           </w:p>
         </w:tc>
@@ -774,7 +774,7 @@
                 <w:szCs w:val="20"/>
                 <w:rFonts w:ascii="Cambria" w:cs="Cambria" w:eastAsia="Cambria" w:hAnsi="Cambria"/>
               </w:rPr>
-              <w:t xml:space="preserve">$336M</w:t>
+              <w:t xml:space="preserve">$337M</w:t>
             </w:r>
           </w:p>
         </w:tc>
@@ -29608,7 +29608,7 @@
           <w:szCs w:val="22"/>
           <w:rFonts w:ascii="Cambria" w:cs="Cambria" w:eastAsia="Cambria" w:hAnsi="Cambria"/>
         </w:rPr>
-        <w:t xml:space="preserve">The CPL Initiative has moved from pilot to scale, demonstrating measurable impact in student access, credit attainment, and system engagement. With 50,809 students served, 12,698 statewide credit recommendations, and 102 actively participating colleges, the initiative has surpassed most 2025–26 benchmarks ahead of schedule.</w:t>
+        <w:t xml:space="preserve">The CPL Initiative has moved from pilot to scale, demonstrating measurable impact in student access, credit attainment, and system engagement. With 50,862 students served, 12,712 statewide credit recommendations, and 103 actively participating colleges, the initiative has surpassed most 2025–26 benchmarks ahead of schedule.</w:t>
       </w:r>
     </w:p>
     <w:p>
@@ -29659,7 +29659,7 @@
           <w:szCs w:val="20"/>
           <w:rFonts w:ascii="Cambria" w:cs="Cambria" w:eastAsia="Cambria" w:hAnsi="Cambria"/>
         </w:rPr>
-        <w:t xml:space="preserve">July 29, 2026</w:t>
+        <w:t xml:space="preserve">July 30, 2026</w:t>
       </w:r>
     </w:p>
     <w:sectPr>
@@ -29696,7 +29696,7 @@
         <w:szCs w:val="14"/>
         <w:rFonts w:ascii="Cambria" w:cs="Cambria" w:eastAsia="Cambria" w:hAnsi="Cambria"/>
       </w:rPr>
-      <w:t xml:space="preserve">Generated July 29, 2026  |  California Community Colleges  |  CPL Initiative</w:t>
+      <w:t xml:space="preserve">Generated July 30, 2026  |  California Community Colleges  |  CPL Initiative</w:t>
     </w:r>
     <w:r>
       <w:rPr>

</xml_diff>

<commit_message>
Daily dashboard update — 2026-07-31
</commit_message>
<xml_diff>
--- a/reports/CPL_Master_Report.docx
+++ b/reports/CPL_Master_Report.docx
@@ -141,7 +141,7 @@
           <w:szCs w:val="22"/>
           <w:rFonts w:ascii="Cambria" w:cs="Cambria" w:eastAsia="Cambria" w:hAnsi="Cambria"/>
         </w:rPr>
-        <w:t xml:space="preserve">As of July 30, 2026, the CPL initiative is ahead of schedule, with most 2025–2026 targets met or exceeded and core infrastructure nearing completion. The work has expanded student access, increased transcripted units, and established the foundation for a permanent, statewide CPL service under Vision 2030.</w:t>
+        <w:t xml:space="preserve">As of July 31, 2026, the CPL initiative is ahead of schedule, with most 2025–2026 targets met or exceeded and core infrastructure nearing completion. The work has expanded student access, increased transcripted units, and established the foundation for a permanent, statewide CPL service under Vision 2030.</w:t>
       </w:r>
     </w:p>
     <w:p>
@@ -167,7 +167,7 @@
           <w:szCs w:val="21"/>
           <w:rFonts w:ascii="Cambria" w:cs="Cambria" w:eastAsia="Cambria" w:hAnsi="Cambria"/>
         </w:rPr>
-        <w:t xml:space="preserve">50,868 cumulative students served with CPL awards, surpassing annual targets.</w:t>
+        <w:t xml:space="preserve">50,908 cumulative students served with CPL awards, surpassing annual targets.</w:t>
       </w:r>
     </w:p>
     <w:p>
@@ -221,7 +221,7 @@
           <w:szCs w:val="21"/>
           <w:rFonts w:ascii="Cambria" w:cs="Cambria" w:eastAsia="Cambria" w:hAnsi="Cambria"/>
         </w:rPr>
-        <w:t xml:space="preserve">12,708 statewide credit recommendations, driven by faculty discipline workgroups spanning high-demand fields.</w:t>
+        <w:t xml:space="preserve">12,574 statewide credit recommendations, driven by faculty discipline workgroups spanning high-demand fields.</w:t>
       </w:r>
     </w:p>
     <w:p>
@@ -424,7 +424,7 @@
                 <w:szCs w:val="20"/>
                 <w:rFonts w:ascii="Cambria" w:cs="Cambria" w:eastAsia="Cambria" w:hAnsi="Cambria"/>
               </w:rPr>
-              <w:t xml:space="preserve">50,868</w:t>
+              <w:t xml:space="preserve">50,908</w:t>
             </w:r>
           </w:p>
         </w:tc>
@@ -564,7 +564,7 @@
                 <w:szCs w:val="20"/>
                 <w:rFonts w:ascii="Cambria" w:cs="Cambria" w:eastAsia="Cambria" w:hAnsi="Cambria"/>
               </w:rPr>
-              <w:t xml:space="preserve">12,708</w:t>
+              <w:t xml:space="preserve">12,574</w:t>
             </w:r>
           </w:p>
         </w:tc>
@@ -29608,7 +29608,7 @@
           <w:szCs w:val="22"/>
           <w:rFonts w:ascii="Cambria" w:cs="Cambria" w:eastAsia="Cambria" w:hAnsi="Cambria"/>
         </w:rPr>
-        <w:t xml:space="preserve">The CPL Initiative has moved from pilot to scale, demonstrating measurable impact in student access, credit attainment, and system engagement. With 50,868 students served, 12,708 statewide credit recommendations, and 103 actively participating colleges, the initiative has surpassed most 2025–26 benchmarks ahead of schedule.</w:t>
+        <w:t xml:space="preserve">The CPL Initiative has moved from pilot to scale, demonstrating measurable impact in student access, credit attainment, and system engagement. With 50,908 students served, 12,574 statewide credit recommendations, and 103 actively participating colleges, the initiative has surpassed most 2025–26 benchmarks ahead of schedule.</w:t>
       </w:r>
     </w:p>
     <w:p>
@@ -29659,7 +29659,7 @@
           <w:szCs w:val="20"/>
           <w:rFonts w:ascii="Cambria" w:cs="Cambria" w:eastAsia="Cambria" w:hAnsi="Cambria"/>
         </w:rPr>
-        <w:t xml:space="preserve">July 30, 2026</w:t>
+        <w:t xml:space="preserve">July 31, 2026</w:t>
       </w:r>
     </w:p>
     <w:sectPr>
@@ -29696,7 +29696,7 @@
         <w:szCs w:val="14"/>
         <w:rFonts w:ascii="Cambria" w:cs="Cambria" w:eastAsia="Cambria" w:hAnsi="Cambria"/>
       </w:rPr>
-      <w:t xml:space="preserve">Generated July 30, 2026  |  California Community Colleges  |  CPL Initiative</w:t>
+      <w:t xml:space="preserve">Generated July 31, 2026  |  California Community Colleges  |  CPL Initiative</w:t>
     </w:r>
     <w:r>
       <w:rPr>

</xml_diff>

<commit_message>
Daily dashboard update — 2026-08-01
</commit_message>
<xml_diff>
--- a/reports/CPL_Master_Report.docx
+++ b/reports/CPL_Master_Report.docx
@@ -35,7 +35,7 @@
           <w:szCs w:val="36"/>
           <w:rFonts w:ascii="Cambria" w:cs="Cambria" w:eastAsia="Cambria" w:hAnsi="Cambria"/>
         </w:rPr>
-        <w:t xml:space="preserve">July 2026</w:t>
+        <w:t xml:space="preserve">August 2026</w:t>
       </w:r>
     </w:p>
     <w:p>
@@ -141,7 +141,7 @@
           <w:szCs w:val="22"/>
           <w:rFonts w:ascii="Cambria" w:cs="Cambria" w:eastAsia="Cambria" w:hAnsi="Cambria"/>
         </w:rPr>
-        <w:t xml:space="preserve">As of July 31, 2026, the CPL initiative is ahead of schedule, with most 2025–2026 targets met or exceeded and core infrastructure nearing completion. The work has expanded student access, increased transcripted units, and established the foundation for a permanent, statewide CPL service under Vision 2030.</w:t>
+        <w:t xml:space="preserve">As of August 1, 2026, the CPL initiative is ahead of schedule, with most 2025–2026 targets met or exceeded and core infrastructure nearing completion. The work has expanded student access, increased transcripted units, and established the foundation for a permanent, statewide CPL service under Vision 2030.</w:t>
       </w:r>
     </w:p>
     <w:p>
@@ -29659,7 +29659,7 @@
           <w:szCs w:val="20"/>
           <w:rFonts w:ascii="Cambria" w:cs="Cambria" w:eastAsia="Cambria" w:hAnsi="Cambria"/>
         </w:rPr>
-        <w:t xml:space="preserve">July 31, 2026</w:t>
+        <w:t xml:space="preserve">August 1, 2026</w:t>
       </w:r>
     </w:p>
     <w:sectPr>
@@ -29696,7 +29696,7 @@
         <w:szCs w:val="14"/>
         <w:rFonts w:ascii="Cambria" w:cs="Cambria" w:eastAsia="Cambria" w:hAnsi="Cambria"/>
       </w:rPr>
-      <w:t xml:space="preserve">Generated July 31, 2026  |  California Community Colleges  |  CPL Initiative</w:t>
+      <w:t xml:space="preserve">Generated August 1, 2026  |  California Community Colleges  |  CPL Initiative</w:t>
     </w:r>
     <w:r>
       <w:rPr>

</xml_diff>

<commit_message>
Daily dashboard update — 2026-08-02
</commit_message>
<xml_diff>
--- a/reports/CPL_Master_Report.docx
+++ b/reports/CPL_Master_Report.docx
@@ -141,7 +141,7 @@
           <w:szCs w:val="22"/>
           <w:rFonts w:ascii="Cambria" w:cs="Cambria" w:eastAsia="Cambria" w:hAnsi="Cambria"/>
         </w:rPr>
-        <w:t xml:space="preserve">As of August 1, 2026, the CPL initiative is ahead of schedule, with most 2025–2026 targets met or exceeded and core infrastructure nearing completion. The work has expanded student access, increased transcripted units, and established the foundation for a permanent, statewide CPL service under Vision 2030.</w:t>
+        <w:t xml:space="preserve">As of August 2, 2026, the CPL initiative is ahead of schedule, with most 2025–2026 targets met or exceeded and core infrastructure nearing completion. The work has expanded student access, increased transcripted units, and established the foundation for a permanent, statewide CPL service under Vision 2030.</w:t>
       </w:r>
     </w:p>
     <w:p>
@@ -167,7 +167,7 @@
           <w:szCs w:val="21"/>
           <w:rFonts w:ascii="Cambria" w:cs="Cambria" w:eastAsia="Cambria" w:hAnsi="Cambria"/>
         </w:rPr>
-        <w:t xml:space="preserve">50,990 cumulative students served with CPL awards, surpassing annual targets.</w:t>
+        <w:t xml:space="preserve">50,991 cumulative students served with CPL awards, surpassing annual targets.</w:t>
       </w:r>
     </w:p>
     <w:p>
@@ -424,7 +424,7 @@
                 <w:szCs w:val="20"/>
                 <w:rFonts w:ascii="Cambria" w:cs="Cambria" w:eastAsia="Cambria" w:hAnsi="Cambria"/>
               </w:rPr>
-              <w:t xml:space="preserve">50,990</w:t>
+              <w:t xml:space="preserve">50,991</w:t>
             </w:r>
           </w:p>
         </w:tc>
@@ -29608,7 +29608,7 @@
           <w:szCs w:val="22"/>
           <w:rFonts w:ascii="Cambria" w:cs="Cambria" w:eastAsia="Cambria" w:hAnsi="Cambria"/>
         </w:rPr>
-        <w:t xml:space="preserve">The CPL Initiative has moved from pilot to scale, demonstrating measurable impact in student access, credit attainment, and system engagement. With 50,990 students served, 12,573 statewide credit recommendations, and 103 actively participating colleges, the initiative has surpassed most 2025–26 benchmarks ahead of schedule.</w:t>
+        <w:t xml:space="preserve">The CPL Initiative has moved from pilot to scale, demonstrating measurable impact in student access, credit attainment, and system engagement. With 50,991 students served, 12,573 statewide credit recommendations, and 103 actively participating colleges, the initiative has surpassed most 2025–26 benchmarks ahead of schedule.</w:t>
       </w:r>
     </w:p>
     <w:p>
@@ -29659,7 +29659,7 @@
           <w:szCs w:val="20"/>
           <w:rFonts w:ascii="Cambria" w:cs="Cambria" w:eastAsia="Cambria" w:hAnsi="Cambria"/>
         </w:rPr>
-        <w:t xml:space="preserve">August 1, 2026</w:t>
+        <w:t xml:space="preserve">August 2, 2026</w:t>
       </w:r>
     </w:p>
     <w:sectPr>
@@ -29696,7 +29696,7 @@
         <w:szCs w:val="14"/>
         <w:rFonts w:ascii="Cambria" w:cs="Cambria" w:eastAsia="Cambria" w:hAnsi="Cambria"/>
       </w:rPr>
-      <w:t xml:space="preserve">Generated August 1, 2026  |  California Community Colleges  |  CPL Initiative</w:t>
+      <w:t xml:space="preserve">Generated August 2, 2026  |  California Community Colleges  |  CPL Initiative</w:t>
     </w:r>
     <w:r>
       <w:rPr>

</xml_diff>

<commit_message>
Daily dashboard update — 2026-08-03
</commit_message>
<xml_diff>
--- a/reports/CPL_Master_Report.docx
+++ b/reports/CPL_Master_Report.docx
@@ -141,7 +141,7 @@
           <w:szCs w:val="22"/>
           <w:rFonts w:ascii="Cambria" w:cs="Cambria" w:eastAsia="Cambria" w:hAnsi="Cambria"/>
         </w:rPr>
-        <w:t xml:space="preserve">As of August 2, 2026, the CPL initiative is ahead of schedule, with most 2025–2026 targets met or exceeded and core infrastructure nearing completion. The work has expanded student access, increased transcripted units, and established the foundation for a permanent, statewide CPL service under Vision 2030.</w:t>
+        <w:t xml:space="preserve">As of August 3, 2026, the CPL initiative is ahead of schedule, with most 2025–2026 targets met or exceeded and core infrastructure nearing completion. The work has expanded student access, increased transcripted units, and established the foundation for a permanent, statewide CPL service under Vision 2030.</w:t>
       </w:r>
     </w:p>
     <w:p>
@@ -29659,7 +29659,7 @@
           <w:szCs w:val="20"/>
           <w:rFonts w:ascii="Cambria" w:cs="Cambria" w:eastAsia="Cambria" w:hAnsi="Cambria"/>
         </w:rPr>
-        <w:t xml:space="preserve">August 2, 2026</w:t>
+        <w:t xml:space="preserve">August 3, 2026</w:t>
       </w:r>
     </w:p>
     <w:sectPr>
@@ -29696,7 +29696,7 @@
         <w:szCs w:val="14"/>
         <w:rFonts w:ascii="Cambria" w:cs="Cambria" w:eastAsia="Cambria" w:hAnsi="Cambria"/>
       </w:rPr>
-      <w:t xml:space="preserve">Generated August 2, 2026  |  California Community Colleges  |  CPL Initiative</w:t>
+      <w:t xml:space="preserve">Generated August 3, 2026  |  California Community Colleges  |  CPL Initiative</w:t>
     </w:r>
     <w:r>
       <w:rPr>

</xml_diff>

<commit_message>
Daily dashboard update — 2026-08-04
</commit_message>
<xml_diff>
--- a/reports/CPL_Master_Report.docx
+++ b/reports/CPL_Master_Report.docx
@@ -141,7 +141,7 @@
           <w:szCs w:val="22"/>
           <w:rFonts w:ascii="Cambria" w:cs="Cambria" w:eastAsia="Cambria" w:hAnsi="Cambria"/>
         </w:rPr>
-        <w:t xml:space="preserve">As of August 3, 2026, the CPL initiative is ahead of schedule, with most 2025–2026 targets met or exceeded and core infrastructure nearing completion. The work has expanded student access, increased transcripted units, and established the foundation for a permanent, statewide CPL service under Vision 2030.</w:t>
+        <w:t xml:space="preserve">As of August 4, 2026, the CPL initiative is ahead of schedule, with most 2025–2026 targets met or exceeded and core infrastructure nearing completion. The work has expanded student access, increased transcripted units, and established the foundation for a permanent, statewide CPL service under Vision 2030.</w:t>
       </w:r>
     </w:p>
     <w:p>
@@ -167,7 +167,7 @@
           <w:szCs w:val="21"/>
           <w:rFonts w:ascii="Cambria" w:cs="Cambria" w:eastAsia="Cambria" w:hAnsi="Cambria"/>
         </w:rPr>
-        <w:t xml:space="preserve">50,991 cumulative students served with CPL awards, surpassing annual targets.</w:t>
+        <w:t xml:space="preserve">51,005 cumulative students served with CPL awards, surpassing annual targets.</w:t>
       </w:r>
     </w:p>
     <w:p>
@@ -221,7 +221,7 @@
           <w:szCs w:val="21"/>
           <w:rFonts w:ascii="Cambria" w:cs="Cambria" w:eastAsia="Cambria" w:hAnsi="Cambria"/>
         </w:rPr>
-        <w:t xml:space="preserve">12,573 statewide credit recommendations, driven by faculty discipline workgroups spanning high-demand fields.</w:t>
+        <w:t xml:space="preserve">12,567 statewide credit recommendations, driven by faculty discipline workgroups spanning high-demand fields.</w:t>
       </w:r>
     </w:p>
     <w:p>
@@ -424,7 +424,7 @@
                 <w:szCs w:val="20"/>
                 <w:rFonts w:ascii="Cambria" w:cs="Cambria" w:eastAsia="Cambria" w:hAnsi="Cambria"/>
               </w:rPr>
-              <w:t xml:space="preserve">50,991</w:t>
+              <w:t xml:space="preserve">51,005</w:t>
             </w:r>
           </w:p>
         </w:tc>
@@ -564,7 +564,7 @@
                 <w:szCs w:val="20"/>
                 <w:rFonts w:ascii="Cambria" w:cs="Cambria" w:eastAsia="Cambria" w:hAnsi="Cambria"/>
               </w:rPr>
-              <w:t xml:space="preserve">12,573</w:t>
+              <w:t xml:space="preserve">12,567</w:t>
             </w:r>
           </w:p>
         </w:tc>
@@ -29608,7 +29608,7 @@
           <w:szCs w:val="22"/>
           <w:rFonts w:ascii="Cambria" w:cs="Cambria" w:eastAsia="Cambria" w:hAnsi="Cambria"/>
         </w:rPr>
-        <w:t xml:space="preserve">The CPL Initiative has moved from pilot to scale, demonstrating measurable impact in student access, credit attainment, and system engagement. With 50,991 students served, 12,573 statewide credit recommendations, and 103 actively participating colleges, the initiative has surpassed most 2025–26 benchmarks ahead of schedule.</w:t>
+        <w:t xml:space="preserve">The CPL Initiative has moved from pilot to scale, demonstrating measurable impact in student access, credit attainment, and system engagement. With 51,005 students served, 12,567 statewide credit recommendations, and 103 actively participating colleges, the initiative has surpassed most 2025–26 benchmarks ahead of schedule.</w:t>
       </w:r>
     </w:p>
     <w:p>
@@ -29659,7 +29659,7 @@
           <w:szCs w:val="20"/>
           <w:rFonts w:ascii="Cambria" w:cs="Cambria" w:eastAsia="Cambria" w:hAnsi="Cambria"/>
         </w:rPr>
-        <w:t xml:space="preserve">August 3, 2026</w:t>
+        <w:t xml:space="preserve">August 4, 2026</w:t>
       </w:r>
     </w:p>
     <w:sectPr>
@@ -29696,7 +29696,7 @@
         <w:szCs w:val="14"/>
         <w:rFonts w:ascii="Cambria" w:cs="Cambria" w:eastAsia="Cambria" w:hAnsi="Cambria"/>
       </w:rPr>
-      <w:t xml:space="preserve">Generated August 3, 2026  |  California Community Colleges  |  CPL Initiative</w:t>
+      <w:t xml:space="preserve">Generated August 4, 2026  |  California Community Colleges  |  CPL Initiative</w:t>
     </w:r>
     <w:r>
       <w:rPr>

</xml_diff>

<commit_message>
Daily dashboard update — 2026-08-05
</commit_message>
<xml_diff>
--- a/reports/CPL_Master_Report.docx
+++ b/reports/CPL_Master_Report.docx
@@ -141,7 +141,7 @@
           <w:szCs w:val="22"/>
           <w:rFonts w:ascii="Cambria" w:cs="Cambria" w:eastAsia="Cambria" w:hAnsi="Cambria"/>
         </w:rPr>
-        <w:t xml:space="preserve">As of August 4, 2026, the CPL initiative is ahead of schedule, with most 2025–2026 targets met or exceeded and core infrastructure nearing completion. The work has expanded student access, increased transcripted units, and established the foundation for a permanent, statewide CPL service under Vision 2030.</w:t>
+        <w:t xml:space="preserve">As of August 5, 2026, the CPL initiative is ahead of schedule, with most 2025–2026 targets met or exceeded and core infrastructure nearing completion. The work has expanded student access, increased transcripted units, and established the foundation for a permanent, statewide CPL service under Vision 2030.</w:t>
       </w:r>
     </w:p>
     <w:p>
@@ -167,7 +167,7 @@
           <w:szCs w:val="21"/>
           <w:rFonts w:ascii="Cambria" w:cs="Cambria" w:eastAsia="Cambria" w:hAnsi="Cambria"/>
         </w:rPr>
-        <w:t xml:space="preserve">51,011 cumulative students served with CPL awards, surpassing annual targets.</w:t>
+        <w:t xml:space="preserve">50,953 cumulative students served with CPL awards, surpassing annual targets.</w:t>
       </w:r>
     </w:p>
     <w:p>
@@ -185,7 +185,7 @@
           <w:szCs w:val="21"/>
           <w:rFonts w:ascii="Cambria" w:cs="Cambria" w:eastAsia="Cambria" w:hAnsi="Cambria"/>
         </w:rPr>
-        <w:t xml:space="preserve">243k CPL units transcripted across the system.</w:t>
+        <w:t xml:space="preserve">242k CPL units transcripted across the system.</w:t>
       </w:r>
     </w:p>
     <w:p>
@@ -221,7 +221,7 @@
           <w:szCs w:val="21"/>
           <w:rFonts w:ascii="Cambria" w:cs="Cambria" w:eastAsia="Cambria" w:hAnsi="Cambria"/>
         </w:rPr>
-        <w:t xml:space="preserve">12,567 statewide credit recommendations, driven by faculty discipline workgroups spanning high-demand fields.</w:t>
+        <w:t xml:space="preserve">12,565 statewide credit recommendations, driven by faculty discipline workgroups spanning high-demand fields.</w:t>
       </w:r>
     </w:p>
     <w:p>
@@ -424,7 +424,7 @@
                 <w:szCs w:val="20"/>
                 <w:rFonts w:ascii="Cambria" w:cs="Cambria" w:eastAsia="Cambria" w:hAnsi="Cambria"/>
               </w:rPr>
-              <w:t xml:space="preserve">51,011</w:t>
+              <w:t xml:space="preserve">50,953</w:t>
             </w:r>
           </w:p>
         </w:tc>
@@ -494,7 +494,7 @@
                 <w:szCs w:val="20"/>
                 <w:rFonts w:ascii="Cambria" w:cs="Cambria" w:eastAsia="Cambria" w:hAnsi="Cambria"/>
               </w:rPr>
-              <w:t xml:space="preserve">243k</w:t>
+              <w:t xml:space="preserve">242k</w:t>
             </w:r>
           </w:p>
         </w:tc>
@@ -564,7 +564,7 @@
                 <w:szCs w:val="20"/>
                 <w:rFonts w:ascii="Cambria" w:cs="Cambria" w:eastAsia="Cambria" w:hAnsi="Cambria"/>
               </w:rPr>
-              <w:t xml:space="preserve">12,567</w:t>
+              <w:t xml:space="preserve">12,565</w:t>
             </w:r>
           </w:p>
         </w:tc>
@@ -29608,7 +29608,7 @@
           <w:szCs w:val="22"/>
           <w:rFonts w:ascii="Cambria" w:cs="Cambria" w:eastAsia="Cambria" w:hAnsi="Cambria"/>
         </w:rPr>
-        <w:t xml:space="preserve">The CPL Initiative has moved from pilot to scale, demonstrating measurable impact in student access, credit attainment, and system engagement. With 51,011 students served, 12,567 statewide credit recommendations, and 103 actively participating colleges, the initiative has surpassed most 2025–26 benchmarks ahead of schedule.</w:t>
+        <w:t xml:space="preserve">The CPL Initiative has moved from pilot to scale, demonstrating measurable impact in student access, credit attainment, and system engagement. With 50,953 students served, 12,565 statewide credit recommendations, and 103 actively participating colleges, the initiative has surpassed most 2025–26 benchmarks ahead of schedule.</w:t>
       </w:r>
     </w:p>
     <w:p>
@@ -29659,7 +29659,7 @@
           <w:szCs w:val="20"/>
           <w:rFonts w:ascii="Cambria" w:cs="Cambria" w:eastAsia="Cambria" w:hAnsi="Cambria"/>
         </w:rPr>
-        <w:t xml:space="preserve">August 4, 2026</w:t>
+        <w:t xml:space="preserve">August 5, 2026</w:t>
       </w:r>
     </w:p>
     <w:sectPr>
@@ -29696,7 +29696,7 @@
         <w:szCs w:val="14"/>
         <w:rFonts w:ascii="Cambria" w:cs="Cambria" w:eastAsia="Cambria" w:hAnsi="Cambria"/>
       </w:rPr>
-      <w:t xml:space="preserve">Generated August 4, 2026  |  California Community Colleges  |  CPL Initiative</w:t>
+      <w:t xml:space="preserve">Generated August 5, 2026  |  California Community Colleges  |  CPL Initiative</w:t>
     </w:r>
     <w:r>
       <w:rPr>

</xml_diff>

<commit_message>
Daily dashboard update — 2026-08-06
</commit_message>
<xml_diff>
--- a/reports/CPL_Master_Report.docx
+++ b/reports/CPL_Master_Report.docx
@@ -141,7 +141,7 @@
           <w:szCs w:val="22"/>
           <w:rFonts w:ascii="Cambria" w:cs="Cambria" w:eastAsia="Cambria" w:hAnsi="Cambria"/>
         </w:rPr>
-        <w:t xml:space="preserve">As of August 5, 2026, the CPL initiative is ahead of schedule, with most 2025–2026 targets met or exceeded and core infrastructure nearing completion. The work has expanded student access, increased transcripted units, and established the foundation for a permanent, statewide CPL service under Vision 2030.</w:t>
+        <w:t xml:space="preserve">As of August 6, 2026, the CPL initiative is ahead of schedule, with most 2025–2026 targets met or exceeded and core infrastructure nearing completion. The work has expanded student access, increased transcripted units, and established the foundation for a permanent, statewide CPL service under Vision 2030.</w:t>
       </w:r>
     </w:p>
     <w:p>
@@ -167,7 +167,7 @@
           <w:szCs w:val="21"/>
           <w:rFonts w:ascii="Cambria" w:cs="Cambria" w:eastAsia="Cambria" w:hAnsi="Cambria"/>
         </w:rPr>
-        <w:t xml:space="preserve">50,954 cumulative students served with CPL awards, surpassing annual targets.</w:t>
+        <w:t xml:space="preserve">50,361 cumulative students served with CPL awards, surpassing annual targets.</w:t>
       </w:r>
     </w:p>
     <w:p>
@@ -185,7 +185,7 @@
           <w:szCs w:val="21"/>
           <w:rFonts w:ascii="Cambria" w:cs="Cambria" w:eastAsia="Cambria" w:hAnsi="Cambria"/>
         </w:rPr>
-        <w:t xml:space="preserve">242k CPL units transcripted across the system.</w:t>
+        <w:t xml:space="preserve">233k CPL units transcripted across the system.</w:t>
       </w:r>
     </w:p>
     <w:p>
@@ -221,7 +221,7 @@
           <w:szCs w:val="21"/>
           <w:rFonts w:ascii="Cambria" w:cs="Cambria" w:eastAsia="Cambria" w:hAnsi="Cambria"/>
         </w:rPr>
-        <w:t xml:space="preserve">12,565 statewide credit recommendations, driven by faculty discipline workgroups spanning high-demand fields.</w:t>
+        <w:t xml:space="preserve">12,563 statewide credit recommendations, driven by faculty discipline workgroups spanning high-demand fields.</w:t>
       </w:r>
     </w:p>
     <w:p>
@@ -239,7 +239,7 @@
           <w:szCs w:val="21"/>
           <w:rFonts w:ascii="Cambria" w:cs="Cambria" w:eastAsia="Cambria" w:hAnsi="Cambria"/>
         </w:rPr>
-        <w:t xml:space="preserve">The Veteran Sprint has uploaded 55 JSTs to MAP, with estimated student savings of $338M and projected 20-year economic impact of $1.36B.</w:t>
+        <w:t xml:space="preserve">The Veteran Sprint has uploaded 55 JSTs to MAP, with estimated student savings of $329M and projected 20-year economic impact of $1.32B.</w:t>
       </w:r>
     </w:p>
     <w:p>
@@ -424,7 +424,7 @@
                 <w:szCs w:val="20"/>
                 <w:rFonts w:ascii="Cambria" w:cs="Cambria" w:eastAsia="Cambria" w:hAnsi="Cambria"/>
               </w:rPr>
-              <w:t xml:space="preserve">50,954</w:t>
+              <w:t xml:space="preserve">50,361</w:t>
             </w:r>
           </w:p>
         </w:tc>
@@ -494,7 +494,7 @@
                 <w:szCs w:val="20"/>
                 <w:rFonts w:ascii="Cambria" w:cs="Cambria" w:eastAsia="Cambria" w:hAnsi="Cambria"/>
               </w:rPr>
-              <w:t xml:space="preserve">242k</w:t>
+              <w:t xml:space="preserve">233k</w:t>
             </w:r>
           </w:p>
         </w:tc>
@@ -564,7 +564,7 @@
                 <w:szCs w:val="20"/>
                 <w:rFonts w:ascii="Cambria" w:cs="Cambria" w:eastAsia="Cambria" w:hAnsi="Cambria"/>
               </w:rPr>
-              <w:t xml:space="preserve">12,565</w:t>
+              <w:t xml:space="preserve">12,563</w:t>
             </w:r>
           </w:p>
         </w:tc>
@@ -774,7 +774,7 @@
                 <w:szCs w:val="20"/>
                 <w:rFonts w:ascii="Cambria" w:cs="Cambria" w:eastAsia="Cambria" w:hAnsi="Cambria"/>
               </w:rPr>
-              <w:t xml:space="preserve">$338M</w:t>
+              <w:t xml:space="preserve">$329M</w:t>
             </w:r>
           </w:p>
         </w:tc>
@@ -844,7 +844,7 @@
                 <w:szCs w:val="20"/>
                 <w:rFonts w:ascii="Cambria" w:cs="Cambria" w:eastAsia="Cambria" w:hAnsi="Cambria"/>
               </w:rPr>
-              <w:t xml:space="preserve">$1.36B</w:t>
+              <w:t xml:space="preserve">$1.32B</w:t>
             </w:r>
           </w:p>
         </w:tc>
@@ -29608,7 +29608,7 @@
           <w:szCs w:val="22"/>
           <w:rFonts w:ascii="Cambria" w:cs="Cambria" w:eastAsia="Cambria" w:hAnsi="Cambria"/>
         </w:rPr>
-        <w:t xml:space="preserve">The CPL Initiative has moved from pilot to scale, demonstrating measurable impact in student access, credit attainment, and system engagement. With 50,954 students served, 12,565 statewide credit recommendations, and 103 actively participating colleges, the initiative has surpassed most 2025–26 benchmarks ahead of schedule.</w:t>
+        <w:t xml:space="preserve">The CPL Initiative has moved from pilot to scale, demonstrating measurable impact in student access, credit attainment, and system engagement. With 50,361 students served, 12,563 statewide credit recommendations, and 103 actively participating colleges, the initiative has surpassed most 2025–26 benchmarks ahead of schedule.</w:t>
       </w:r>
     </w:p>
     <w:p>
@@ -29659,7 +29659,7 @@
           <w:szCs w:val="20"/>
           <w:rFonts w:ascii="Cambria" w:cs="Cambria" w:eastAsia="Cambria" w:hAnsi="Cambria"/>
         </w:rPr>
-        <w:t xml:space="preserve">August 5, 2026</w:t>
+        <w:t xml:space="preserve">August 6, 2026</w:t>
       </w:r>
     </w:p>
     <w:sectPr>
@@ -29696,7 +29696,7 @@
         <w:szCs w:val="14"/>
         <w:rFonts w:ascii="Cambria" w:cs="Cambria" w:eastAsia="Cambria" w:hAnsi="Cambria"/>
       </w:rPr>
-      <w:t xml:space="preserve">Generated August 5, 2026  |  California Community Colleges  |  CPL Initiative</w:t>
+      <w:t xml:space="preserve">Generated August 6, 2026  |  California Community Colleges  |  CPL Initiative</w:t>
     </w:r>
     <w:r>
       <w:rPr>

</xml_diff>

<commit_message>
Daily dashboard update — 2026-08-07
</commit_message>
<xml_diff>
--- a/reports/CPL_Master_Report.docx
+++ b/reports/CPL_Master_Report.docx
@@ -141,7 +141,7 @@
           <w:szCs w:val="22"/>
           <w:rFonts w:ascii="Cambria" w:cs="Cambria" w:eastAsia="Cambria" w:hAnsi="Cambria"/>
         </w:rPr>
-        <w:t xml:space="preserve">As of August 6, 2026, the CPL initiative is ahead of schedule, with most 2025–2026 targets met or exceeded and core infrastructure nearing completion. The work has expanded student access, increased transcripted units, and established the foundation for a permanent, statewide CPL service under Vision 2030.</w:t>
+        <w:t xml:space="preserve">As of August 7, 2026, the CPL initiative is ahead of schedule, with most 2025–2026 targets met or exceeded and core infrastructure nearing completion. The work has expanded student access, increased transcripted units, and established the foundation for a permanent, statewide CPL service under Vision 2030.</w:t>
       </w:r>
     </w:p>
     <w:p>
@@ -167,7 +167,7 @@
           <w:szCs w:val="21"/>
           <w:rFonts w:ascii="Cambria" w:cs="Cambria" w:eastAsia="Cambria" w:hAnsi="Cambria"/>
         </w:rPr>
-        <w:t xml:space="preserve">50,362 cumulative students served with CPL awards, surpassing annual targets.</w:t>
+        <w:t xml:space="preserve">49,660 cumulative students served with CPL awards, surpassing annual targets.</w:t>
       </w:r>
     </w:p>
     <w:p>
@@ -185,7 +185,7 @@
           <w:szCs w:val="21"/>
           <w:rFonts w:ascii="Cambria" w:cs="Cambria" w:eastAsia="Cambria" w:hAnsi="Cambria"/>
         </w:rPr>
-        <w:t xml:space="preserve">233k CPL units transcripted across the system.</w:t>
+        <w:t xml:space="preserve">216k CPL units transcripted across the system.</w:t>
       </w:r>
     </w:p>
     <w:p>
@@ -221,7 +221,7 @@
           <w:szCs w:val="21"/>
           <w:rFonts w:ascii="Cambria" w:cs="Cambria" w:eastAsia="Cambria" w:hAnsi="Cambria"/>
         </w:rPr>
-        <w:t xml:space="preserve">12,563 statewide credit recommendations, driven by faculty discipline workgroups spanning high-demand fields.</w:t>
+        <w:t xml:space="preserve">12,516 statewide credit recommendations, driven by faculty discipline workgroups spanning high-demand fields.</w:t>
       </w:r>
     </w:p>
     <w:p>
@@ -239,7 +239,7 @@
           <w:szCs w:val="21"/>
           <w:rFonts w:ascii="Cambria" w:cs="Cambria" w:eastAsia="Cambria" w:hAnsi="Cambria"/>
         </w:rPr>
-        <w:t xml:space="preserve">The Veteran Sprint has uploaded 55 JSTs to MAP, with estimated student savings of $329M and projected 20-year economic impact of $1.32B.</w:t>
+        <w:t xml:space="preserve">The Veteran Sprint has uploaded 55 JSTs to MAP, with estimated student savings of $313M and projected 20-year economic impact of $1.24B.</w:t>
       </w:r>
     </w:p>
     <w:p>
@@ -424,7 +424,7 @@
                 <w:szCs w:val="20"/>
                 <w:rFonts w:ascii="Cambria" w:cs="Cambria" w:eastAsia="Cambria" w:hAnsi="Cambria"/>
               </w:rPr>
-              <w:t xml:space="preserve">50,362</w:t>
+              <w:t xml:space="preserve">49,660</w:t>
             </w:r>
           </w:p>
         </w:tc>
@@ -494,7 +494,7 @@
                 <w:szCs w:val="20"/>
                 <w:rFonts w:ascii="Cambria" w:cs="Cambria" w:eastAsia="Cambria" w:hAnsi="Cambria"/>
               </w:rPr>
-              <w:t xml:space="preserve">233k</w:t>
+              <w:t xml:space="preserve">216k</w:t>
             </w:r>
           </w:p>
         </w:tc>
@@ -564,7 +564,7 @@
                 <w:szCs w:val="20"/>
                 <w:rFonts w:ascii="Cambria" w:cs="Cambria" w:eastAsia="Cambria" w:hAnsi="Cambria"/>
               </w:rPr>
-              <w:t xml:space="preserve">12,563</w:t>
+              <w:t xml:space="preserve">12,516</w:t>
             </w:r>
           </w:p>
         </w:tc>
@@ -774,7 +774,7 @@
                 <w:szCs w:val="20"/>
                 <w:rFonts w:ascii="Cambria" w:cs="Cambria" w:eastAsia="Cambria" w:hAnsi="Cambria"/>
               </w:rPr>
-              <w:t xml:space="preserve">$329M</w:t>
+              <w:t xml:space="preserve">$313M</w:t>
             </w:r>
           </w:p>
         </w:tc>
@@ -844,7 +844,7 @@
                 <w:szCs w:val="20"/>
                 <w:rFonts w:ascii="Cambria" w:cs="Cambria" w:eastAsia="Cambria" w:hAnsi="Cambria"/>
               </w:rPr>
-              <w:t xml:space="preserve">$1.32B</w:t>
+              <w:t xml:space="preserve">$1.24B</w:t>
             </w:r>
           </w:p>
         </w:tc>
@@ -29608,7 +29608,7 @@
           <w:szCs w:val="22"/>
           <w:rFonts w:ascii="Cambria" w:cs="Cambria" w:eastAsia="Cambria" w:hAnsi="Cambria"/>
         </w:rPr>
-        <w:t xml:space="preserve">The CPL Initiative has moved from pilot to scale, demonstrating measurable impact in student access, credit attainment, and system engagement. With 50,362 students served, 12,563 statewide credit recommendations, and 103 actively participating colleges, the initiative has surpassed most 2025–26 benchmarks ahead of schedule.</w:t>
+        <w:t xml:space="preserve">The CPL Initiative has moved from pilot to scale, demonstrating measurable impact in student access, credit attainment, and system engagement. With 49,660 students served, 12,516 statewide credit recommendations, and 103 actively participating colleges, the initiative has surpassed most 2025–26 benchmarks ahead of schedule.</w:t>
       </w:r>
     </w:p>
     <w:p>
@@ -29659,7 +29659,7 @@
           <w:szCs w:val="20"/>
           <w:rFonts w:ascii="Cambria" w:cs="Cambria" w:eastAsia="Cambria" w:hAnsi="Cambria"/>
         </w:rPr>
-        <w:t xml:space="preserve">August 6, 2026</w:t>
+        <w:t xml:space="preserve">August 7, 2026</w:t>
       </w:r>
     </w:p>
     <w:sectPr>
@@ -29696,7 +29696,7 @@
         <w:szCs w:val="14"/>
         <w:rFonts w:ascii="Cambria" w:cs="Cambria" w:eastAsia="Cambria" w:hAnsi="Cambria"/>
       </w:rPr>
-      <w:t xml:space="preserve">Generated August 6, 2026  |  California Community Colleges  |  CPL Initiative</w:t>
+      <w:t xml:space="preserve">Generated August 7, 2026  |  California Community Colleges  |  CPL Initiative</w:t>
     </w:r>
     <w:r>
       <w:rPr>

</xml_diff>

<commit_message>
Daily dashboard update — 2026-08-08
</commit_message>
<xml_diff>
--- a/reports/CPL_Master_Report.docx
+++ b/reports/CPL_Master_Report.docx
@@ -141,7 +141,7 @@
           <w:szCs w:val="22"/>
           <w:rFonts w:ascii="Cambria" w:cs="Cambria" w:eastAsia="Cambria" w:hAnsi="Cambria"/>
         </w:rPr>
-        <w:t xml:space="preserve">As of August 7, 2026, the CPL initiative is ahead of schedule, with most 2025–2026 targets met or exceeded and core infrastructure nearing completion. The work has expanded student access, increased transcripted units, and established the foundation for a permanent, statewide CPL service under Vision 2030.</w:t>
+        <w:t xml:space="preserve">As of August 8, 2026, the CPL initiative is ahead of schedule, with most 2025–2026 targets met or exceeded and core infrastructure nearing completion. The work has expanded student access, increased transcripted units, and established the foundation for a permanent, statewide CPL service under Vision 2030.</w:t>
       </w:r>
     </w:p>
     <w:p>
@@ -167,7 +167,7 @@
           <w:szCs w:val="21"/>
           <w:rFonts w:ascii="Cambria" w:cs="Cambria" w:eastAsia="Cambria" w:hAnsi="Cambria"/>
         </w:rPr>
-        <w:t xml:space="preserve">49,660 cumulative students served with CPL awards, surpassing annual targets.</w:t>
+        <w:t xml:space="preserve">49,694 cumulative students served with CPL awards, surpassing annual targets.</w:t>
       </w:r>
     </w:p>
     <w:p>
@@ -424,7 +424,7 @@
                 <w:szCs w:val="20"/>
                 <w:rFonts w:ascii="Cambria" w:cs="Cambria" w:eastAsia="Cambria" w:hAnsi="Cambria"/>
               </w:rPr>
-              <w:t xml:space="preserve">49,660</w:t>
+              <w:t xml:space="preserve">49,694</w:t>
             </w:r>
           </w:p>
         </w:tc>
@@ -29608,7 +29608,7 @@
           <w:szCs w:val="22"/>
           <w:rFonts w:ascii="Cambria" w:cs="Cambria" w:eastAsia="Cambria" w:hAnsi="Cambria"/>
         </w:rPr>
-        <w:t xml:space="preserve">The CPL Initiative has moved from pilot to scale, demonstrating measurable impact in student access, credit attainment, and system engagement. With 49,660 students served, 12,516 statewide credit recommendations, and 103 actively participating colleges, the initiative has surpassed most 2025–26 benchmarks ahead of schedule.</w:t>
+        <w:t xml:space="preserve">The CPL Initiative has moved from pilot to scale, demonstrating measurable impact in student access, credit attainment, and system engagement. With 49,694 students served, 12,516 statewide credit recommendations, and 103 actively participating colleges, the initiative has surpassed most 2025–26 benchmarks ahead of schedule.</w:t>
       </w:r>
     </w:p>
     <w:p>
@@ -29659,7 +29659,7 @@
           <w:szCs w:val="20"/>
           <w:rFonts w:ascii="Cambria" w:cs="Cambria" w:eastAsia="Cambria" w:hAnsi="Cambria"/>
         </w:rPr>
-        <w:t xml:space="preserve">August 7, 2026</w:t>
+        <w:t xml:space="preserve">August 8, 2026</w:t>
       </w:r>
     </w:p>
     <w:sectPr>
@@ -29696,7 +29696,7 @@
         <w:szCs w:val="14"/>
         <w:rFonts w:ascii="Cambria" w:cs="Cambria" w:eastAsia="Cambria" w:hAnsi="Cambria"/>
       </w:rPr>
-      <w:t xml:space="preserve">Generated August 7, 2026  |  California Community Colleges  |  CPL Initiative</w:t>
+      <w:t xml:space="preserve">Generated August 8, 2026  |  California Community Colleges  |  CPL Initiative</w:t>
     </w:r>
     <w:r>
       <w:rPr>

</xml_diff>

<commit_message>
Daily dashboard update — 2026-08-09
</commit_message>
<xml_diff>
--- a/reports/CPL_Master_Report.docx
+++ b/reports/CPL_Master_Report.docx
@@ -141,7 +141,7 @@
           <w:szCs w:val="22"/>
           <w:rFonts w:ascii="Cambria" w:cs="Cambria" w:eastAsia="Cambria" w:hAnsi="Cambria"/>
         </w:rPr>
-        <w:t xml:space="preserve">As of August 8, 2026, the CPL initiative is ahead of schedule, with most 2025–2026 targets met or exceeded and core infrastructure nearing completion. The work has expanded student access, increased transcripted units, and established the foundation for a permanent, statewide CPL service under Vision 2030.</w:t>
+        <w:t xml:space="preserve">As of August 9, 2026, the CPL initiative is ahead of schedule, with most 2025–2026 targets met or exceeded and core infrastructure nearing completion. The work has expanded student access, increased transcripted units, and established the foundation for a permanent, statewide CPL service under Vision 2030.</w:t>
       </w:r>
     </w:p>
     <w:p>
@@ -167,7 +167,7 @@
           <w:szCs w:val="21"/>
           <w:rFonts w:ascii="Cambria" w:cs="Cambria" w:eastAsia="Cambria" w:hAnsi="Cambria"/>
         </w:rPr>
-        <w:t xml:space="preserve">49,694 cumulative students served with CPL awards, surpassing annual targets.</w:t>
+        <w:t xml:space="preserve">49,695 cumulative students served with CPL awards, surpassing annual targets.</w:t>
       </w:r>
     </w:p>
     <w:p>
@@ -424,7 +424,7 @@
                 <w:szCs w:val="20"/>
                 <w:rFonts w:ascii="Cambria" w:cs="Cambria" w:eastAsia="Cambria" w:hAnsi="Cambria"/>
               </w:rPr>
-              <w:t xml:space="preserve">49,694</w:t>
+              <w:t xml:space="preserve">49,695</w:t>
             </w:r>
           </w:p>
         </w:tc>
@@ -29608,7 +29608,7 @@
           <w:szCs w:val="22"/>
           <w:rFonts w:ascii="Cambria" w:cs="Cambria" w:eastAsia="Cambria" w:hAnsi="Cambria"/>
         </w:rPr>
-        <w:t xml:space="preserve">The CPL Initiative has moved from pilot to scale, demonstrating measurable impact in student access, credit attainment, and system engagement. With 49,694 students served, 12,516 statewide credit recommendations, and 103 actively participating colleges, the initiative has surpassed most 2025–26 benchmarks ahead of schedule.</w:t>
+        <w:t xml:space="preserve">The CPL Initiative has moved from pilot to scale, demonstrating measurable impact in student access, credit attainment, and system engagement. With 49,695 students served, 12,516 statewide credit recommendations, and 103 actively participating colleges, the initiative has surpassed most 2025–26 benchmarks ahead of schedule.</w:t>
       </w:r>
     </w:p>
     <w:p>
@@ -29659,7 +29659,7 @@
           <w:szCs w:val="20"/>
           <w:rFonts w:ascii="Cambria" w:cs="Cambria" w:eastAsia="Cambria" w:hAnsi="Cambria"/>
         </w:rPr>
-        <w:t xml:space="preserve">August 8, 2026</w:t>
+        <w:t xml:space="preserve">August 9, 2026</w:t>
       </w:r>
     </w:p>
     <w:sectPr>
@@ -29696,7 +29696,7 @@
         <w:szCs w:val="14"/>
         <w:rFonts w:ascii="Cambria" w:cs="Cambria" w:eastAsia="Cambria" w:hAnsi="Cambria"/>
       </w:rPr>
-      <w:t xml:space="preserve">Generated August 8, 2026  |  California Community Colleges  |  CPL Initiative</w:t>
+      <w:t xml:space="preserve">Generated August 9, 2026  |  California Community Colleges  |  CPL Initiative</w:t>
     </w:r>
     <w:r>
       <w:rPr>

</xml_diff>

<commit_message>
Daily dashboard update — 2026-08-10
</commit_message>
<xml_diff>
--- a/reports/CPL_Master_Report.docx
+++ b/reports/CPL_Master_Report.docx
@@ -141,7 +141,7 @@
           <w:szCs w:val="22"/>
           <w:rFonts w:ascii="Cambria" w:cs="Cambria" w:eastAsia="Cambria" w:hAnsi="Cambria"/>
         </w:rPr>
-        <w:t xml:space="preserve">As of August 9, 2026, the CPL initiative is ahead of schedule, with most 2025–2026 targets met or exceeded and core infrastructure nearing completion. The work has expanded student access, increased transcripted units, and established the foundation for a permanent, statewide CPL service under Vision 2030.</w:t>
+        <w:t xml:space="preserve">As of August 10, 2026, the CPL initiative is ahead of schedule, with most 2025–2026 targets met or exceeded and core infrastructure nearing completion. The work has expanded student access, increased transcripted units, and established the foundation for a permanent, statewide CPL service under Vision 2030.</w:t>
       </w:r>
     </w:p>
     <w:p>
@@ -167,7 +167,7 @@
           <w:szCs w:val="21"/>
           <w:rFonts w:ascii="Cambria" w:cs="Cambria" w:eastAsia="Cambria" w:hAnsi="Cambria"/>
         </w:rPr>
-        <w:t xml:space="preserve">49,695 cumulative students served with CPL awards, surpassing annual targets.</w:t>
+        <w:t xml:space="preserve">49,696 cumulative students served with CPL awards, surpassing annual targets.</w:t>
       </w:r>
     </w:p>
     <w:p>
@@ -424,7 +424,7 @@
                 <w:szCs w:val="20"/>
                 <w:rFonts w:ascii="Cambria" w:cs="Cambria" w:eastAsia="Cambria" w:hAnsi="Cambria"/>
               </w:rPr>
-              <w:t xml:space="preserve">49,695</w:t>
+              <w:t xml:space="preserve">49,696</w:t>
             </w:r>
           </w:p>
         </w:tc>
@@ -29608,7 +29608,7 @@
           <w:szCs w:val="22"/>
           <w:rFonts w:ascii="Cambria" w:cs="Cambria" w:eastAsia="Cambria" w:hAnsi="Cambria"/>
         </w:rPr>
-        <w:t xml:space="preserve">The CPL Initiative has moved from pilot to scale, demonstrating measurable impact in student access, credit attainment, and system engagement. With 49,695 students served, 12,516 statewide credit recommendations, and 103 actively participating colleges, the initiative has surpassed most 2025–26 benchmarks ahead of schedule.</w:t>
+        <w:t xml:space="preserve">The CPL Initiative has moved from pilot to scale, demonstrating measurable impact in student access, credit attainment, and system engagement. With 49,696 students served, 12,516 statewide credit recommendations, and 103 actively participating colleges, the initiative has surpassed most 2025–26 benchmarks ahead of schedule.</w:t>
       </w:r>
     </w:p>
     <w:p>
@@ -29659,7 +29659,7 @@
           <w:szCs w:val="20"/>
           <w:rFonts w:ascii="Cambria" w:cs="Cambria" w:eastAsia="Cambria" w:hAnsi="Cambria"/>
         </w:rPr>
-        <w:t xml:space="preserve">August 9, 2026</w:t>
+        <w:t xml:space="preserve">August 10, 2026</w:t>
       </w:r>
     </w:p>
     <w:sectPr>
@@ -29696,7 +29696,7 @@
         <w:szCs w:val="14"/>
         <w:rFonts w:ascii="Cambria" w:cs="Cambria" w:eastAsia="Cambria" w:hAnsi="Cambria"/>
       </w:rPr>
-      <w:t xml:space="preserve">Generated August 9, 2026  |  California Community Colleges  |  CPL Initiative</w:t>
+      <w:t xml:space="preserve">Generated August 10, 2026  |  California Community Colleges  |  CPL Initiative</w:t>
     </w:r>
     <w:r>
       <w:rPr>

</xml_diff>

<commit_message>
Daily dashboard update — 2026-08-11
</commit_message>
<xml_diff>
--- a/reports/CPL_Master_Report.docx
+++ b/reports/CPL_Master_Report.docx
@@ -141,7 +141,7 @@
           <w:szCs w:val="22"/>
           <w:rFonts w:ascii="Cambria" w:cs="Cambria" w:eastAsia="Cambria" w:hAnsi="Cambria"/>
         </w:rPr>
-        <w:t xml:space="preserve">As of August 10, 2026, the CPL initiative is ahead of schedule, with most 2025–2026 targets met or exceeded and core infrastructure nearing completion. The work has expanded student access, increased transcripted units, and established the foundation for a permanent, statewide CPL service under Vision 2030.</w:t>
+        <w:t xml:space="preserve">As of August 11, 2026, the CPL initiative is ahead of schedule, with most 2025–2026 targets met or exceeded and core infrastructure nearing completion. The work has expanded student access, increased transcripted units, and established the foundation for a permanent, statewide CPL service under Vision 2030.</w:t>
       </w:r>
     </w:p>
     <w:p>
@@ -167,7 +167,7 @@
           <w:szCs w:val="21"/>
           <w:rFonts w:ascii="Cambria" w:cs="Cambria" w:eastAsia="Cambria" w:hAnsi="Cambria"/>
         </w:rPr>
-        <w:t xml:space="preserve">49,696 cumulative students served with CPL awards, surpassing annual targets.</w:t>
+        <w:t xml:space="preserve">49,734 cumulative students served with CPL awards, surpassing annual targets.</w:t>
       </w:r>
     </w:p>
     <w:p>
@@ -221,7 +221,7 @@
           <w:szCs w:val="21"/>
           <w:rFonts w:ascii="Cambria" w:cs="Cambria" w:eastAsia="Cambria" w:hAnsi="Cambria"/>
         </w:rPr>
-        <w:t xml:space="preserve">12,517 statewide credit recommendations, driven by faculty discipline workgroups spanning high-demand fields.</w:t>
+        <w:t xml:space="preserve">12,569 statewide credit recommendations, driven by faculty discipline workgroups spanning high-demand fields.</w:t>
       </w:r>
     </w:p>
     <w:p>
@@ -239,7 +239,7 @@
           <w:szCs w:val="21"/>
           <w:rFonts w:ascii="Cambria" w:cs="Cambria" w:eastAsia="Cambria" w:hAnsi="Cambria"/>
         </w:rPr>
-        <w:t xml:space="preserve">The Veteran Sprint has uploaded 55 JSTs to MAP, with estimated student savings of $313M and projected 20-year economic impact of $1.24B.</w:t>
+        <w:t xml:space="preserve">The Veteran Sprint has uploaded 56 JSTs to MAP, with estimated student savings of $313M and projected 20-year economic impact of $1.24B.</w:t>
       </w:r>
     </w:p>
     <w:p>
@@ -424,7 +424,7 @@
                 <w:szCs w:val="20"/>
                 <w:rFonts w:ascii="Cambria" w:cs="Cambria" w:eastAsia="Cambria" w:hAnsi="Cambria"/>
               </w:rPr>
-              <w:t xml:space="preserve">49,696</w:t>
+              <w:t xml:space="preserve">49,734</w:t>
             </w:r>
           </w:p>
         </w:tc>
@@ -564,7 +564,7 @@
                 <w:szCs w:val="20"/>
                 <w:rFonts w:ascii="Cambria" w:cs="Cambria" w:eastAsia="Cambria" w:hAnsi="Cambria"/>
               </w:rPr>
-              <w:t xml:space="preserve">12,517</w:t>
+              <w:t xml:space="preserve">12,569</w:t>
             </w:r>
           </w:p>
         </w:tc>
@@ -704,7 +704,7 @@
                 <w:szCs w:val="20"/>
                 <w:rFonts w:ascii="Cambria" w:cs="Cambria" w:eastAsia="Cambria" w:hAnsi="Cambria"/>
               </w:rPr>
-              <w:t xml:space="preserve">55</w:t>
+              <w:t xml:space="preserve">56</w:t>
             </w:r>
           </w:p>
         </w:tc>
@@ -29608,7 +29608,7 @@
           <w:szCs w:val="22"/>
           <w:rFonts w:ascii="Cambria" w:cs="Cambria" w:eastAsia="Cambria" w:hAnsi="Cambria"/>
         </w:rPr>
-        <w:t xml:space="preserve">The CPL Initiative has moved from pilot to scale, demonstrating measurable impact in student access, credit attainment, and system engagement. With 49,696 students served, 12,517 statewide credit recommendations, and 103 actively participating colleges, the initiative has surpassed most 2025–26 benchmarks ahead of schedule.</w:t>
+        <w:t xml:space="preserve">The CPL Initiative has moved from pilot to scale, demonstrating measurable impact in student access, credit attainment, and system engagement. With 49,734 students served, 12,569 statewide credit recommendations, and 103 actively participating colleges, the initiative has surpassed most 2025–26 benchmarks ahead of schedule.</w:t>
       </w:r>
     </w:p>
     <w:p>
@@ -29659,7 +29659,7 @@
           <w:szCs w:val="20"/>
           <w:rFonts w:ascii="Cambria" w:cs="Cambria" w:eastAsia="Cambria" w:hAnsi="Cambria"/>
         </w:rPr>
-        <w:t xml:space="preserve">August 10, 2026</w:t>
+        <w:t xml:space="preserve">August 11, 2026</w:t>
       </w:r>
     </w:p>
     <w:sectPr>
@@ -29696,7 +29696,7 @@
         <w:szCs w:val="14"/>
         <w:rFonts w:ascii="Cambria" w:cs="Cambria" w:eastAsia="Cambria" w:hAnsi="Cambria"/>
       </w:rPr>
-      <w:t xml:space="preserve">Generated August 10, 2026  |  California Community Colleges  |  CPL Initiative</w:t>
+      <w:t xml:space="preserve">Generated August 11, 2026  |  California Community Colleges  |  CPL Initiative</w:t>
     </w:r>
     <w:r>
       <w:rPr>

</xml_diff>

<commit_message>
Daily dashboard update — 2026-08-12
</commit_message>
<xml_diff>
--- a/reports/CPL_Master_Report.docx
+++ b/reports/CPL_Master_Report.docx
@@ -141,7 +141,7 @@
           <w:szCs w:val="22"/>
           <w:rFonts w:ascii="Cambria" w:cs="Cambria" w:eastAsia="Cambria" w:hAnsi="Cambria"/>
         </w:rPr>
-        <w:t xml:space="preserve">As of August 11, 2026, the CPL initiative is ahead of schedule, with most 2025–2026 targets met or exceeded and core infrastructure nearing completion. The work has expanded student access, increased transcripted units, and established the foundation for a permanent, statewide CPL service under Vision 2030.</w:t>
+        <w:t xml:space="preserve">As of August 12, 2026, the CPL initiative is ahead of schedule, with most 2025–2026 targets met or exceeded and core infrastructure nearing completion. The work has expanded student access, increased transcripted units, and established the foundation for a permanent, statewide CPL service under Vision 2030.</w:t>
       </w:r>
     </w:p>
     <w:p>
@@ -167,7 +167,7 @@
           <w:szCs w:val="21"/>
           <w:rFonts w:ascii="Cambria" w:cs="Cambria" w:eastAsia="Cambria" w:hAnsi="Cambria"/>
         </w:rPr>
-        <w:t xml:space="preserve">49,734 cumulative students served with CPL awards, surpassing annual targets.</w:t>
+        <w:t xml:space="preserve">49,830 cumulative students served with CPL awards, surpassing annual targets.</w:t>
       </w:r>
     </w:p>
     <w:p>
@@ -185,7 +185,7 @@
           <w:szCs w:val="21"/>
           <w:rFonts w:ascii="Cambria" w:cs="Cambria" w:eastAsia="Cambria" w:hAnsi="Cambria"/>
         </w:rPr>
-        <w:t xml:space="preserve">216k CPL units transcripted across the system.</w:t>
+        <w:t xml:space="preserve">217k CPL units transcripted across the system.</w:t>
       </w:r>
     </w:p>
     <w:p>
@@ -221,7 +221,7 @@
           <w:szCs w:val="21"/>
           <w:rFonts w:ascii="Cambria" w:cs="Cambria" w:eastAsia="Cambria" w:hAnsi="Cambria"/>
         </w:rPr>
-        <w:t xml:space="preserve">12,569 statewide credit recommendations, driven by faculty discipline workgroups spanning high-demand fields.</w:t>
+        <w:t xml:space="preserve">12,727 statewide credit recommendations, driven by faculty discipline workgroups spanning high-demand fields.</w:t>
       </w:r>
     </w:p>
     <w:p>
@@ -239,7 +239,7 @@
           <w:szCs w:val="21"/>
           <w:rFonts w:ascii="Cambria" w:cs="Cambria" w:eastAsia="Cambria" w:hAnsi="Cambria"/>
         </w:rPr>
-        <w:t xml:space="preserve">The Veteran Sprint has uploaded 56 JSTs to MAP, with estimated student savings of $313M and projected 20-year economic impact of $1.24B.</w:t>
+        <w:t xml:space="preserve">The Veteran Sprint has uploaded 56 JSTs to MAP, with estimated student savings of $314M and projected 20-year economic impact of $1.24B.</w:t>
       </w:r>
     </w:p>
     <w:p>
@@ -424,7 +424,7 @@
                 <w:szCs w:val="20"/>
                 <w:rFonts w:ascii="Cambria" w:cs="Cambria" w:eastAsia="Cambria" w:hAnsi="Cambria"/>
               </w:rPr>
-              <w:t xml:space="preserve">49,734</w:t>
+              <w:t xml:space="preserve">49,830</w:t>
             </w:r>
           </w:p>
         </w:tc>
@@ -494,7 +494,7 @@
                 <w:szCs w:val="20"/>
                 <w:rFonts w:ascii="Cambria" w:cs="Cambria" w:eastAsia="Cambria" w:hAnsi="Cambria"/>
               </w:rPr>
-              <w:t xml:space="preserve">216k</w:t>
+              <w:t xml:space="preserve">217k</w:t>
             </w:r>
           </w:p>
         </w:tc>
@@ -564,7 +564,7 @@
                 <w:szCs w:val="20"/>
                 <w:rFonts w:ascii="Cambria" w:cs="Cambria" w:eastAsia="Cambria" w:hAnsi="Cambria"/>
               </w:rPr>
-              <w:t xml:space="preserve">12,569</w:t>
+              <w:t xml:space="preserve">12,727</w:t>
             </w:r>
           </w:p>
         </w:tc>
@@ -774,7 +774,7 @@
                 <w:szCs w:val="20"/>
                 <w:rFonts w:ascii="Cambria" w:cs="Cambria" w:eastAsia="Cambria" w:hAnsi="Cambria"/>
               </w:rPr>
-              <w:t xml:space="preserve">$313M</w:t>
+              <w:t xml:space="preserve">$314M</w:t>
             </w:r>
           </w:p>
         </w:tc>
@@ -29608,7 +29608,7 @@
           <w:szCs w:val="22"/>
           <w:rFonts w:ascii="Cambria" w:cs="Cambria" w:eastAsia="Cambria" w:hAnsi="Cambria"/>
         </w:rPr>
-        <w:t xml:space="preserve">The CPL Initiative has moved from pilot to scale, demonstrating measurable impact in student access, credit attainment, and system engagement. With 49,734 students served, 12,569 statewide credit recommendations, and 103 actively participating colleges, the initiative has surpassed most 2025–26 benchmarks ahead of schedule.</w:t>
+        <w:t xml:space="preserve">The CPL Initiative has moved from pilot to scale, demonstrating measurable impact in student access, credit attainment, and system engagement. With 49,830 students served, 12,727 statewide credit recommendations, and 103 actively participating colleges, the initiative has surpassed most 2025–26 benchmarks ahead of schedule.</w:t>
       </w:r>
     </w:p>
     <w:p>
@@ -29659,7 +29659,7 @@
           <w:szCs w:val="20"/>
           <w:rFonts w:ascii="Cambria" w:cs="Cambria" w:eastAsia="Cambria" w:hAnsi="Cambria"/>
         </w:rPr>
-        <w:t xml:space="preserve">August 11, 2026</w:t>
+        <w:t xml:space="preserve">August 12, 2026</w:t>
       </w:r>
     </w:p>
     <w:sectPr>
@@ -29696,7 +29696,7 @@
         <w:szCs w:val="14"/>
         <w:rFonts w:ascii="Cambria" w:cs="Cambria" w:eastAsia="Cambria" w:hAnsi="Cambria"/>
       </w:rPr>
-      <w:t xml:space="preserve">Generated August 11, 2026  |  California Community Colleges  |  CPL Initiative</w:t>
+      <w:t xml:space="preserve">Generated August 12, 2026  |  California Community Colleges  |  CPL Initiative</w:t>
     </w:r>
     <w:r>
       <w:rPr>

</xml_diff>

<commit_message>
Daily dashboard update — 2026-08-13
</commit_message>
<xml_diff>
--- a/reports/CPL_Master_Report.docx
+++ b/reports/CPL_Master_Report.docx
@@ -141,7 +141,7 @@
           <w:szCs w:val="22"/>
           <w:rFonts w:ascii="Cambria" w:cs="Cambria" w:eastAsia="Cambria" w:hAnsi="Cambria"/>
         </w:rPr>
-        <w:t xml:space="preserve">As of August 12, 2026, the CPL initiative is ahead of schedule, with most 2025–2026 targets met or exceeded and core infrastructure nearing completion. The work has expanded student access, increased transcripted units, and established the foundation for a permanent, statewide CPL service under Vision 2030.</w:t>
+        <w:t xml:space="preserve">As of August 13, 2026, the CPL initiative is ahead of schedule, with most 2025–2026 targets met or exceeded and core infrastructure nearing completion. The work has expanded student access, increased transcripted units, and established the foundation for a permanent, statewide CPL service under Vision 2030.</w:t>
       </w:r>
     </w:p>
     <w:p>
@@ -167,7 +167,7 @@
           <w:szCs w:val="21"/>
           <w:rFonts w:ascii="Cambria" w:cs="Cambria" w:eastAsia="Cambria" w:hAnsi="Cambria"/>
         </w:rPr>
-        <w:t xml:space="preserve">49,830 cumulative students served with CPL awards, surpassing annual targets.</w:t>
+        <w:t xml:space="preserve">49,833 cumulative students served with CPL awards, surpassing annual targets.</w:t>
       </w:r>
     </w:p>
     <w:p>
@@ -203,7 +203,7 @@
           <w:szCs w:val="21"/>
           <w:rFonts w:ascii="Cambria" w:cs="Cambria" w:eastAsia="Cambria" w:hAnsi="Cambria"/>
         </w:rPr>
-        <w:t xml:space="preserve">103 colleges meeting active participation thresholds, exceeding the goal of 50.</w:t>
+        <w:t xml:space="preserve">102 colleges meeting active participation thresholds, exceeding the goal of 50.</w:t>
       </w:r>
     </w:p>
     <w:p>
@@ -221,7 +221,7 @@
           <w:szCs w:val="21"/>
           <w:rFonts w:ascii="Cambria" w:cs="Cambria" w:eastAsia="Cambria" w:hAnsi="Cambria"/>
         </w:rPr>
-        <w:t xml:space="preserve">12,727 statewide credit recommendations, driven by faculty discipline workgroups spanning high-demand fields.</w:t>
+        <w:t xml:space="preserve">12,894 statewide credit recommendations, driven by faculty discipline workgroups spanning high-demand fields.</w:t>
       </w:r>
     </w:p>
     <w:p>
@@ -424,7 +424,7 @@
                 <w:szCs w:val="20"/>
                 <w:rFonts w:ascii="Cambria" w:cs="Cambria" w:eastAsia="Cambria" w:hAnsi="Cambria"/>
               </w:rPr>
-              <w:t xml:space="preserve">49,830</w:t>
+              <w:t xml:space="preserve">49,833</w:t>
             </w:r>
           </w:p>
         </w:tc>
@@ -564,7 +564,7 @@
                 <w:szCs w:val="20"/>
                 <w:rFonts w:ascii="Cambria" w:cs="Cambria" w:eastAsia="Cambria" w:hAnsi="Cambria"/>
               </w:rPr>
-              <w:t xml:space="preserve">12,727</w:t>
+              <w:t xml:space="preserve">12,894</w:t>
             </w:r>
           </w:p>
         </w:tc>
@@ -634,7 +634,7 @@
                 <w:szCs w:val="20"/>
                 <w:rFonts w:ascii="Cambria" w:cs="Cambria" w:eastAsia="Cambria" w:hAnsi="Cambria"/>
               </w:rPr>
-              <w:t xml:space="preserve">103</w:t>
+              <w:t xml:space="preserve">102</w:t>
             </w:r>
           </w:p>
         </w:tc>
@@ -29608,7 +29608,7 @@
           <w:szCs w:val="22"/>
           <w:rFonts w:ascii="Cambria" w:cs="Cambria" w:eastAsia="Cambria" w:hAnsi="Cambria"/>
         </w:rPr>
-        <w:t xml:space="preserve">The CPL Initiative has moved from pilot to scale, demonstrating measurable impact in student access, credit attainment, and system engagement. With 49,830 students served, 12,727 statewide credit recommendations, and 103 actively participating colleges, the initiative has surpassed most 2025–26 benchmarks ahead of schedule.</w:t>
+        <w:t xml:space="preserve">The CPL Initiative has moved from pilot to scale, demonstrating measurable impact in student access, credit attainment, and system engagement. With 49,833 students served, 12,894 statewide credit recommendations, and 102 actively participating colleges, the initiative has surpassed most 2025–26 benchmarks ahead of schedule.</w:t>
       </w:r>
     </w:p>
     <w:p>
@@ -29659,7 +29659,7 @@
           <w:szCs w:val="20"/>
           <w:rFonts w:ascii="Cambria" w:cs="Cambria" w:eastAsia="Cambria" w:hAnsi="Cambria"/>
         </w:rPr>
-        <w:t xml:space="preserve">August 12, 2026</w:t>
+        <w:t xml:space="preserve">August 13, 2026</w:t>
       </w:r>
     </w:p>
     <w:sectPr>
@@ -29696,7 +29696,7 @@
         <w:szCs w:val="14"/>
         <w:rFonts w:ascii="Cambria" w:cs="Cambria" w:eastAsia="Cambria" w:hAnsi="Cambria"/>
       </w:rPr>
-      <w:t xml:space="preserve">Generated August 12, 2026  |  California Community Colleges  |  CPL Initiative</w:t>
+      <w:t xml:space="preserve">Generated August 13, 2026  |  California Community Colleges  |  CPL Initiative</w:t>
     </w:r>
     <w:r>
       <w:rPr>

</xml_diff>

<commit_message>
Daily dashboard update — 2026-08-14
</commit_message>
<xml_diff>
--- a/reports/CPL_Master_Report.docx
+++ b/reports/CPL_Master_Report.docx
@@ -141,7 +141,7 @@
           <w:szCs w:val="22"/>
           <w:rFonts w:ascii="Cambria" w:cs="Cambria" w:eastAsia="Cambria" w:hAnsi="Cambria"/>
         </w:rPr>
-        <w:t xml:space="preserve">As of August 13, 2026, the CPL initiative is ahead of schedule, with most 2025–2026 targets met or exceeded and core infrastructure nearing completion. The work has expanded student access, increased transcripted units, and established the foundation for a permanent, statewide CPL service under Vision 2030.</w:t>
+        <w:t xml:space="preserve">As of August 14, 2026, the CPL initiative is ahead of schedule, with most 2025–2026 targets met or exceeded and core infrastructure nearing completion. The work has expanded student access, increased transcripted units, and established the foundation for a permanent, statewide CPL service under Vision 2030.</w:t>
       </w:r>
     </w:p>
     <w:p>
@@ -167,7 +167,7 @@
           <w:szCs w:val="21"/>
           <w:rFonts w:ascii="Cambria" w:cs="Cambria" w:eastAsia="Cambria" w:hAnsi="Cambria"/>
         </w:rPr>
-        <w:t xml:space="preserve">49,833 cumulative students served with CPL awards, surpassing annual targets.</w:t>
+        <w:t xml:space="preserve">49,935 cumulative students served with CPL awards, surpassing annual targets.</w:t>
       </w:r>
     </w:p>
     <w:p>
@@ -221,7 +221,7 @@
           <w:szCs w:val="21"/>
           <w:rFonts w:ascii="Cambria" w:cs="Cambria" w:eastAsia="Cambria" w:hAnsi="Cambria"/>
         </w:rPr>
-        <w:t xml:space="preserve">12,894 statewide credit recommendations, driven by faculty discipline workgroups spanning high-demand fields.</w:t>
+        <w:t xml:space="preserve">12,900 statewide credit recommendations, driven by faculty discipline workgroups spanning high-demand fields.</w:t>
       </w:r>
     </w:p>
     <w:p>
@@ -239,7 +239,7 @@
           <w:szCs w:val="21"/>
           <w:rFonts w:ascii="Cambria" w:cs="Cambria" w:eastAsia="Cambria" w:hAnsi="Cambria"/>
         </w:rPr>
-        <w:t xml:space="preserve">The Veteran Sprint has uploaded 56 JSTs to MAP, with estimated student savings of $314M and projected 20-year economic impact of $1.24B.</w:t>
+        <w:t xml:space="preserve">The Veteran Sprint has uploaded 56 JSTs to MAP, with estimated student savings of $315M and projected 20-year economic impact of $1.25B.</w:t>
       </w:r>
     </w:p>
     <w:p>
@@ -424,7 +424,7 @@
                 <w:szCs w:val="20"/>
                 <w:rFonts w:ascii="Cambria" w:cs="Cambria" w:eastAsia="Cambria" w:hAnsi="Cambria"/>
               </w:rPr>
-              <w:t xml:space="preserve">49,833</w:t>
+              <w:t xml:space="preserve">49,935</w:t>
             </w:r>
           </w:p>
         </w:tc>
@@ -564,7 +564,7 @@
                 <w:szCs w:val="20"/>
                 <w:rFonts w:ascii="Cambria" w:cs="Cambria" w:eastAsia="Cambria" w:hAnsi="Cambria"/>
               </w:rPr>
-              <w:t xml:space="preserve">12,894</w:t>
+              <w:t xml:space="preserve">12,900</w:t>
             </w:r>
           </w:p>
         </w:tc>
@@ -774,7 +774,7 @@
                 <w:szCs w:val="20"/>
                 <w:rFonts w:ascii="Cambria" w:cs="Cambria" w:eastAsia="Cambria" w:hAnsi="Cambria"/>
               </w:rPr>
-              <w:t xml:space="preserve">$314M</w:t>
+              <w:t xml:space="preserve">$315M</w:t>
             </w:r>
           </w:p>
         </w:tc>
@@ -844,7 +844,7 @@
                 <w:szCs w:val="20"/>
                 <w:rFonts w:ascii="Cambria" w:cs="Cambria" w:eastAsia="Cambria" w:hAnsi="Cambria"/>
               </w:rPr>
-              <w:t xml:space="preserve">$1.24B</w:t>
+              <w:t xml:space="preserve">$1.25B</w:t>
             </w:r>
           </w:p>
         </w:tc>
@@ -29608,7 +29608,7 @@
           <w:szCs w:val="22"/>
           <w:rFonts w:ascii="Cambria" w:cs="Cambria" w:eastAsia="Cambria" w:hAnsi="Cambria"/>
         </w:rPr>
-        <w:t xml:space="preserve">The CPL Initiative has moved from pilot to scale, demonstrating measurable impact in student access, credit attainment, and system engagement. With 49,833 students served, 12,894 statewide credit recommendations, and 102 actively participating colleges, the initiative has surpassed most 2025–26 benchmarks ahead of schedule.</w:t>
+        <w:t xml:space="preserve">The CPL Initiative has moved from pilot to scale, demonstrating measurable impact in student access, credit attainment, and system engagement. With 49,935 students served, 12,900 statewide credit recommendations, and 102 actively participating colleges, the initiative has surpassed most 2025–26 benchmarks ahead of schedule.</w:t>
       </w:r>
     </w:p>
     <w:p>
@@ -29659,7 +29659,7 @@
           <w:szCs w:val="20"/>
           <w:rFonts w:ascii="Cambria" w:cs="Cambria" w:eastAsia="Cambria" w:hAnsi="Cambria"/>
         </w:rPr>
-        <w:t xml:space="preserve">August 13, 2026</w:t>
+        <w:t xml:space="preserve">August 14, 2026</w:t>
       </w:r>
     </w:p>
     <w:sectPr>
@@ -29696,7 +29696,7 @@
         <w:szCs w:val="14"/>
         <w:rFonts w:ascii="Cambria" w:cs="Cambria" w:eastAsia="Cambria" w:hAnsi="Cambria"/>
       </w:rPr>
-      <w:t xml:space="preserve">Generated August 13, 2026  |  California Community Colleges  |  CPL Initiative</w:t>
+      <w:t xml:space="preserve">Generated August 14, 2026  |  California Community Colleges  |  CPL Initiative</w:t>
     </w:r>
     <w:r>
       <w:rPr>

</xml_diff>

<commit_message>
Daily dashboard update — 2026-08-15
</commit_message>
<xml_diff>
--- a/reports/CPL_Master_Report.docx
+++ b/reports/CPL_Master_Report.docx
@@ -141,7 +141,7 @@
           <w:szCs w:val="22"/>
           <w:rFonts w:ascii="Cambria" w:cs="Cambria" w:eastAsia="Cambria" w:hAnsi="Cambria"/>
         </w:rPr>
-        <w:t xml:space="preserve">As of August 14, 2026, the CPL initiative is ahead of schedule, with most 2025–2026 targets met or exceeded and core infrastructure nearing completion. The work has expanded student access, increased transcripted units, and established the foundation for a permanent, statewide CPL service under Vision 2030.</w:t>
+        <w:t xml:space="preserve">As of August 15, 2026, the CPL initiative is ahead of schedule, with most 2025–2026 targets met or exceeded and core infrastructure nearing completion. The work has expanded student access, increased transcripted units, and established the foundation for a permanent, statewide CPL service under Vision 2030.</w:t>
       </w:r>
     </w:p>
     <w:p>
@@ -167,7 +167,7 @@
           <w:szCs w:val="21"/>
           <w:rFonts w:ascii="Cambria" w:cs="Cambria" w:eastAsia="Cambria" w:hAnsi="Cambria"/>
         </w:rPr>
-        <w:t xml:space="preserve">49,933 cumulative students served with CPL awards, surpassing annual targets.</w:t>
+        <w:t xml:space="preserve">49,955 cumulative students served with CPL awards, surpassing annual targets.</w:t>
       </w:r>
     </w:p>
     <w:p>
@@ -221,7 +221,7 @@
           <w:szCs w:val="21"/>
           <w:rFonts w:ascii="Cambria" w:cs="Cambria" w:eastAsia="Cambria" w:hAnsi="Cambria"/>
         </w:rPr>
-        <w:t xml:space="preserve">12,900 statewide credit recommendations, driven by faculty discipline workgroups spanning high-demand fields.</w:t>
+        <w:t xml:space="preserve">12,901 statewide credit recommendations, driven by faculty discipline workgroups spanning high-demand fields.</w:t>
       </w:r>
     </w:p>
     <w:p>
@@ -424,7 +424,7 @@
                 <w:szCs w:val="20"/>
                 <w:rFonts w:ascii="Cambria" w:cs="Cambria" w:eastAsia="Cambria" w:hAnsi="Cambria"/>
               </w:rPr>
-              <w:t xml:space="preserve">49,933</w:t>
+              <w:t xml:space="preserve">49,955</w:t>
             </w:r>
           </w:p>
         </w:tc>
@@ -564,7 +564,7 @@
                 <w:szCs w:val="20"/>
                 <w:rFonts w:ascii="Cambria" w:cs="Cambria" w:eastAsia="Cambria" w:hAnsi="Cambria"/>
               </w:rPr>
-              <w:t xml:space="preserve">12,900</w:t>
+              <w:t xml:space="preserve">12,901</w:t>
             </w:r>
           </w:p>
         </w:tc>
@@ -29608,7 +29608,7 @@
           <w:szCs w:val="22"/>
           <w:rFonts w:ascii="Cambria" w:cs="Cambria" w:eastAsia="Cambria" w:hAnsi="Cambria"/>
         </w:rPr>
-        <w:t xml:space="preserve">The CPL Initiative has moved from pilot to scale, demonstrating measurable impact in student access, credit attainment, and system engagement. With 49,933 students served, 12,900 statewide credit recommendations, and 102 actively participating colleges, the initiative has surpassed most 2025–26 benchmarks ahead of schedule.</w:t>
+        <w:t xml:space="preserve">The CPL Initiative has moved from pilot to scale, demonstrating measurable impact in student access, credit attainment, and system engagement. With 49,955 students served, 12,901 statewide credit recommendations, and 102 actively participating colleges, the initiative has surpassed most 2025–26 benchmarks ahead of schedule.</w:t>
       </w:r>
     </w:p>
     <w:p>
@@ -29659,7 +29659,7 @@
           <w:szCs w:val="20"/>
           <w:rFonts w:ascii="Cambria" w:cs="Cambria" w:eastAsia="Cambria" w:hAnsi="Cambria"/>
         </w:rPr>
-        <w:t xml:space="preserve">August 14, 2026</w:t>
+        <w:t xml:space="preserve">August 15, 2026</w:t>
       </w:r>
     </w:p>
     <w:sectPr>
@@ -29696,7 +29696,7 @@
         <w:szCs w:val="14"/>
         <w:rFonts w:ascii="Cambria" w:cs="Cambria" w:eastAsia="Cambria" w:hAnsi="Cambria"/>
       </w:rPr>
-      <w:t xml:space="preserve">Generated August 14, 2026  |  California Community Colleges  |  CPL Initiative</w:t>
+      <w:t xml:space="preserve">Generated August 15, 2026  |  California Community Colleges  |  CPL Initiative</w:t>
     </w:r>
     <w:r>
       <w:rPr>

</xml_diff>

<commit_message>
Daily dashboard update — 2026-08-16
</commit_message>
<xml_diff>
--- a/reports/CPL_Master_Report.docx
+++ b/reports/CPL_Master_Report.docx
@@ -141,7 +141,7 @@
           <w:szCs w:val="22"/>
           <w:rFonts w:ascii="Cambria" w:cs="Cambria" w:eastAsia="Cambria" w:hAnsi="Cambria"/>
         </w:rPr>
-        <w:t xml:space="preserve">As of August 15, 2026, the CPL initiative is ahead of schedule, with most 2025–2026 targets met or exceeded and core infrastructure nearing completion. The work has expanded student access, increased transcripted units, and established the foundation for a permanent, statewide CPL service under Vision 2030.</w:t>
+        <w:t xml:space="preserve">As of August 16, 2026, the CPL initiative is ahead of schedule, with most 2025–2026 targets met or exceeded and core infrastructure nearing completion. The work has expanded student access, increased transcripted units, and established the foundation for a permanent, statewide CPL service under Vision 2030.</w:t>
       </w:r>
     </w:p>
     <w:p>
@@ -167,7 +167,7 @@
           <w:szCs w:val="21"/>
           <w:rFonts w:ascii="Cambria" w:cs="Cambria" w:eastAsia="Cambria" w:hAnsi="Cambria"/>
         </w:rPr>
-        <w:t xml:space="preserve">49,955 cumulative students served with CPL awards, surpassing annual targets.</w:t>
+        <w:t xml:space="preserve">49,956 cumulative students served with CPL awards, surpassing annual targets.</w:t>
       </w:r>
     </w:p>
     <w:p>
@@ -424,7 +424,7 @@
                 <w:szCs w:val="20"/>
                 <w:rFonts w:ascii="Cambria" w:cs="Cambria" w:eastAsia="Cambria" w:hAnsi="Cambria"/>
               </w:rPr>
-              <w:t xml:space="preserve">49,955</w:t>
+              <w:t xml:space="preserve">49,956</w:t>
             </w:r>
           </w:p>
         </w:tc>
@@ -29608,7 +29608,7 @@
           <w:szCs w:val="22"/>
           <w:rFonts w:ascii="Cambria" w:cs="Cambria" w:eastAsia="Cambria" w:hAnsi="Cambria"/>
         </w:rPr>
-        <w:t xml:space="preserve">The CPL Initiative has moved from pilot to scale, demonstrating measurable impact in student access, credit attainment, and system engagement. With 49,955 students served, 12,901 statewide credit recommendations, and 102 actively participating colleges, the initiative has surpassed most 2025–26 benchmarks ahead of schedule.</w:t>
+        <w:t xml:space="preserve">The CPL Initiative has moved from pilot to scale, demonstrating measurable impact in student access, credit attainment, and system engagement. With 49,956 students served, 12,901 statewide credit recommendations, and 102 actively participating colleges, the initiative has surpassed most 2025–26 benchmarks ahead of schedule.</w:t>
       </w:r>
     </w:p>
     <w:p>
@@ -29659,7 +29659,7 @@
           <w:szCs w:val="20"/>
           <w:rFonts w:ascii="Cambria" w:cs="Cambria" w:eastAsia="Cambria" w:hAnsi="Cambria"/>
         </w:rPr>
-        <w:t xml:space="preserve">August 15, 2026</w:t>
+        <w:t xml:space="preserve">August 16, 2026</w:t>
       </w:r>
     </w:p>
     <w:sectPr>
@@ -29696,7 +29696,7 @@
         <w:szCs w:val="14"/>
         <w:rFonts w:ascii="Cambria" w:cs="Cambria" w:eastAsia="Cambria" w:hAnsi="Cambria"/>
       </w:rPr>
-      <w:t xml:space="preserve">Generated August 15, 2026  |  California Community Colleges  |  CPL Initiative</w:t>
+      <w:t xml:space="preserve">Generated August 16, 2026  |  California Community Colleges  |  CPL Initiative</w:t>
     </w:r>
     <w:r>
       <w:rPr>

</xml_diff>

<commit_message>
Daily dashboard update — 2026-08-17
</commit_message>
<xml_diff>
--- a/reports/CPL_Master_Report.docx
+++ b/reports/CPL_Master_Report.docx
@@ -141,7 +141,7 @@
           <w:szCs w:val="22"/>
           <w:rFonts w:ascii="Cambria" w:cs="Cambria" w:eastAsia="Cambria" w:hAnsi="Cambria"/>
         </w:rPr>
-        <w:t xml:space="preserve">As of August 16, 2026, the CPL initiative is ahead of schedule, with most 2025–2026 targets met or exceeded and core infrastructure nearing completion. The work has expanded student access, increased transcripted units, and established the foundation for a permanent, statewide CPL service under Vision 2030.</w:t>
+        <w:t xml:space="preserve">As of August 17, 2026, the CPL initiative is ahead of schedule, with most 2025–2026 targets met or exceeded and core infrastructure nearing completion. The work has expanded student access, increased transcripted units, and established the foundation for a permanent, statewide CPL service under Vision 2030.</w:t>
       </w:r>
     </w:p>
     <w:p>
@@ -167,7 +167,7 @@
           <w:szCs w:val="21"/>
           <w:rFonts w:ascii="Cambria" w:cs="Cambria" w:eastAsia="Cambria" w:hAnsi="Cambria"/>
         </w:rPr>
-        <w:t xml:space="preserve">49,956 cumulative students served with CPL awards, surpassing annual targets.</w:t>
+        <w:t xml:space="preserve">49,957 cumulative students served with CPL awards, surpassing annual targets.</w:t>
       </w:r>
     </w:p>
     <w:p>
@@ -424,7 +424,7 @@
                 <w:szCs w:val="20"/>
                 <w:rFonts w:ascii="Cambria" w:cs="Cambria" w:eastAsia="Cambria" w:hAnsi="Cambria"/>
               </w:rPr>
-              <w:t xml:space="preserve">49,956</w:t>
+              <w:t xml:space="preserve">49,957</w:t>
             </w:r>
           </w:p>
         </w:tc>
@@ -29608,7 +29608,7 @@
           <w:szCs w:val="22"/>
           <w:rFonts w:ascii="Cambria" w:cs="Cambria" w:eastAsia="Cambria" w:hAnsi="Cambria"/>
         </w:rPr>
-        <w:t xml:space="preserve">The CPL Initiative has moved from pilot to scale, demonstrating measurable impact in student access, credit attainment, and system engagement. With 49,956 students served, 12,901 statewide credit recommendations, and 102 actively participating colleges, the initiative has surpassed most 2025–26 benchmarks ahead of schedule.</w:t>
+        <w:t xml:space="preserve">The CPL Initiative has moved from pilot to scale, demonstrating measurable impact in student access, credit attainment, and system engagement. With 49,957 students served, 12,901 statewide credit recommendations, and 102 actively participating colleges, the initiative has surpassed most 2025–26 benchmarks ahead of schedule.</w:t>
       </w:r>
     </w:p>
     <w:p>
@@ -29659,7 +29659,7 @@
           <w:szCs w:val="20"/>
           <w:rFonts w:ascii="Cambria" w:cs="Cambria" w:eastAsia="Cambria" w:hAnsi="Cambria"/>
         </w:rPr>
-        <w:t xml:space="preserve">August 16, 2026</w:t>
+        <w:t xml:space="preserve">August 17, 2026</w:t>
       </w:r>
     </w:p>
     <w:sectPr>
@@ -29696,7 +29696,7 @@
         <w:szCs w:val="14"/>
         <w:rFonts w:ascii="Cambria" w:cs="Cambria" w:eastAsia="Cambria" w:hAnsi="Cambria"/>
       </w:rPr>
-      <w:t xml:space="preserve">Generated August 16, 2026  |  California Community Colleges  |  CPL Initiative</w:t>
+      <w:t xml:space="preserve">Generated August 17, 2026  |  California Community Colleges  |  CPL Initiative</w:t>
     </w:r>
     <w:r>
       <w:rPr>

</xml_diff>

<commit_message>
Daily dashboard update — 2026-08-18
</commit_message>
<xml_diff>
--- a/reports/CPL_Master_Report.docx
+++ b/reports/CPL_Master_Report.docx
@@ -141,7 +141,7 @@
           <w:szCs w:val="22"/>
           <w:rFonts w:ascii="Cambria" w:cs="Cambria" w:eastAsia="Cambria" w:hAnsi="Cambria"/>
         </w:rPr>
-        <w:t xml:space="preserve">As of August 17, 2026, the CPL initiative is ahead of schedule, with most 2025–2026 targets met or exceeded and core infrastructure nearing completion. The work has expanded student access, increased transcripted units, and established the foundation for a permanent, statewide CPL service under Vision 2030.</w:t>
+        <w:t xml:space="preserve">As of August 18, 2026, the CPL initiative is ahead of schedule, with most 2025–2026 targets met or exceeded and core infrastructure nearing completion. The work has expanded student access, increased transcripted units, and established the foundation for a permanent, statewide CPL service under Vision 2030.</w:t>
       </w:r>
     </w:p>
     <w:p>
@@ -167,7 +167,7 @@
           <w:szCs w:val="21"/>
           <w:rFonts w:ascii="Cambria" w:cs="Cambria" w:eastAsia="Cambria" w:hAnsi="Cambria"/>
         </w:rPr>
-        <w:t xml:space="preserve">49,957 cumulative students served with CPL awards, surpassing annual targets.</w:t>
+        <w:t xml:space="preserve">50,177 cumulative students served with CPL awards, surpassing annual targets.</w:t>
       </w:r>
     </w:p>
     <w:p>
@@ -185,7 +185,7 @@
           <w:szCs w:val="21"/>
           <w:rFonts w:ascii="Cambria" w:cs="Cambria" w:eastAsia="Cambria" w:hAnsi="Cambria"/>
         </w:rPr>
-        <w:t xml:space="preserve">218k CPL units transcripted across the system.</w:t>
+        <w:t xml:space="preserve">221k CPL units transcripted across the system.</w:t>
       </w:r>
     </w:p>
     <w:p>
@@ -221,7 +221,7 @@
           <w:szCs w:val="21"/>
           <w:rFonts w:ascii="Cambria" w:cs="Cambria" w:eastAsia="Cambria" w:hAnsi="Cambria"/>
         </w:rPr>
-        <w:t xml:space="preserve">12,901 statewide credit recommendations, driven by faculty discipline workgroups spanning high-demand fields.</w:t>
+        <w:t xml:space="preserve">12,924 statewide credit recommendations, driven by faculty discipline workgroups spanning high-demand fields.</w:t>
       </w:r>
     </w:p>
     <w:p>
@@ -239,7 +239,7 @@
           <w:szCs w:val="21"/>
           <w:rFonts w:ascii="Cambria" w:cs="Cambria" w:eastAsia="Cambria" w:hAnsi="Cambria"/>
         </w:rPr>
-        <w:t xml:space="preserve">The Veteran Sprint has uploaded 56 JSTs to MAP, with estimated student savings of $316M and projected 20-year economic impact of $1.25B.</w:t>
+        <w:t xml:space="preserve">The Veteran Sprint has uploaded 56 JSTs to MAP, with estimated student savings of $329M and projected 20-year economic impact of $1.31B.</w:t>
       </w:r>
     </w:p>
     <w:p>
@@ -424,7 +424,7 @@
                 <w:szCs w:val="20"/>
                 <w:rFonts w:ascii="Cambria" w:cs="Cambria" w:eastAsia="Cambria" w:hAnsi="Cambria"/>
               </w:rPr>
-              <w:t xml:space="preserve">49,957</w:t>
+              <w:t xml:space="preserve">50,177</w:t>
             </w:r>
           </w:p>
         </w:tc>
@@ -494,7 +494,7 @@
                 <w:szCs w:val="20"/>
                 <w:rFonts w:ascii="Cambria" w:cs="Cambria" w:eastAsia="Cambria" w:hAnsi="Cambria"/>
               </w:rPr>
-              <w:t xml:space="preserve">218k</w:t>
+              <w:t xml:space="preserve">221k</w:t>
             </w:r>
           </w:p>
         </w:tc>
@@ -564,7 +564,7 @@
                 <w:szCs w:val="20"/>
                 <w:rFonts w:ascii="Cambria" w:cs="Cambria" w:eastAsia="Cambria" w:hAnsi="Cambria"/>
               </w:rPr>
-              <w:t xml:space="preserve">12,901</w:t>
+              <w:t xml:space="preserve">12,924</w:t>
             </w:r>
           </w:p>
         </w:tc>
@@ -774,7 +774,7 @@
                 <w:szCs w:val="20"/>
                 <w:rFonts w:ascii="Cambria" w:cs="Cambria" w:eastAsia="Cambria" w:hAnsi="Cambria"/>
               </w:rPr>
-              <w:t xml:space="preserve">$316M</w:t>
+              <w:t xml:space="preserve">$329M</w:t>
             </w:r>
           </w:p>
         </w:tc>
@@ -844,7 +844,7 @@
                 <w:szCs w:val="20"/>
                 <w:rFonts w:ascii="Cambria" w:cs="Cambria" w:eastAsia="Cambria" w:hAnsi="Cambria"/>
               </w:rPr>
-              <w:t xml:space="preserve">$1.25B</w:t>
+              <w:t xml:space="preserve">$1.31B</w:t>
             </w:r>
           </w:p>
         </w:tc>
@@ -29608,7 +29608,7 @@
           <w:szCs w:val="22"/>
           <w:rFonts w:ascii="Cambria" w:cs="Cambria" w:eastAsia="Cambria" w:hAnsi="Cambria"/>
         </w:rPr>
-        <w:t xml:space="preserve">The CPL Initiative has moved from pilot to scale, demonstrating measurable impact in student access, credit attainment, and system engagement. With 49,957 students served, 12,901 statewide credit recommendations, and 102 actively participating colleges, the initiative has surpassed most 2025–26 benchmarks ahead of schedule.</w:t>
+        <w:t xml:space="preserve">The CPL Initiative has moved from pilot to scale, demonstrating measurable impact in student access, credit attainment, and system engagement. With 50,177 students served, 12,924 statewide credit recommendations, and 102 actively participating colleges, the initiative has surpassed most 2025–26 benchmarks ahead of schedule.</w:t>
       </w:r>
     </w:p>
     <w:p>
@@ -29659,7 +29659,7 @@
           <w:szCs w:val="20"/>
           <w:rFonts w:ascii="Cambria" w:cs="Cambria" w:eastAsia="Cambria" w:hAnsi="Cambria"/>
         </w:rPr>
-        <w:t xml:space="preserve">August 17, 2026</w:t>
+        <w:t xml:space="preserve">August 18, 2026</w:t>
       </w:r>
     </w:p>
     <w:sectPr>
@@ -29696,7 +29696,7 @@
         <w:szCs w:val="14"/>
         <w:rFonts w:ascii="Cambria" w:cs="Cambria" w:eastAsia="Cambria" w:hAnsi="Cambria"/>
       </w:rPr>
-      <w:t xml:space="preserve">Generated August 17, 2026  |  California Community Colleges  |  CPL Initiative</w:t>
+      <w:t xml:space="preserve">Generated August 18, 2026  |  California Community Colleges  |  CPL Initiative</w:t>
     </w:r>
     <w:r>
       <w:rPr>

</xml_diff>

<commit_message>
Daily dashboard update — 2026-08-19
</commit_message>
<xml_diff>
--- a/reports/CPL_Master_Report.docx
+++ b/reports/CPL_Master_Report.docx
@@ -141,7 +141,7 @@
           <w:szCs w:val="22"/>
           <w:rFonts w:ascii="Cambria" w:cs="Cambria" w:eastAsia="Cambria" w:hAnsi="Cambria"/>
         </w:rPr>
-        <w:t xml:space="preserve">As of August 18, 2026, the CPL initiative is ahead of schedule, with most 2025–2026 targets met or exceeded and core infrastructure nearing completion. The work has expanded student access, increased transcripted units, and established the foundation for a permanent, statewide CPL service under Vision 2030.</w:t>
+        <w:t xml:space="preserve">As of August 19, 2026, the CPL initiative is ahead of schedule, with most 2025–2026 targets met or exceeded and core infrastructure nearing completion. The work has expanded student access, increased transcripted units, and established the foundation for a permanent, statewide CPL service under Vision 2030.</w:t>
       </w:r>
     </w:p>
     <w:p>
@@ -167,7 +167,7 @@
           <w:szCs w:val="21"/>
           <w:rFonts w:ascii="Cambria" w:cs="Cambria" w:eastAsia="Cambria" w:hAnsi="Cambria"/>
         </w:rPr>
-        <w:t xml:space="preserve">50,177 cumulative students served with CPL awards, surpassing annual targets.</w:t>
+        <w:t xml:space="preserve">50,240 cumulative students served with CPL awards, surpassing annual targets.</w:t>
       </w:r>
     </w:p>
     <w:p>
@@ -185,7 +185,7 @@
           <w:szCs w:val="21"/>
           <w:rFonts w:ascii="Cambria" w:cs="Cambria" w:eastAsia="Cambria" w:hAnsi="Cambria"/>
         </w:rPr>
-        <w:t xml:space="preserve">221k CPL units transcripted across the system.</w:t>
+        <w:t xml:space="preserve">222k CPL units transcripted across the system.</w:t>
       </w:r>
     </w:p>
     <w:p>
@@ -221,7 +221,7 @@
           <w:szCs w:val="21"/>
           <w:rFonts w:ascii="Cambria" w:cs="Cambria" w:eastAsia="Cambria" w:hAnsi="Cambria"/>
         </w:rPr>
-        <w:t xml:space="preserve">12,924 statewide credit recommendations, driven by faculty discipline workgroups spanning high-demand fields.</w:t>
+        <w:t xml:space="preserve">12,928 statewide credit recommendations, driven by faculty discipline workgroups spanning high-demand fields.</w:t>
       </w:r>
     </w:p>
     <w:p>
@@ -239,7 +239,7 @@
           <w:szCs w:val="21"/>
           <w:rFonts w:ascii="Cambria" w:cs="Cambria" w:eastAsia="Cambria" w:hAnsi="Cambria"/>
         </w:rPr>
-        <w:t xml:space="preserve">The Veteran Sprint has uploaded 56 JSTs to MAP, with estimated student savings of $329M and projected 20-year economic impact of $1.31B.</w:t>
+        <w:t xml:space="preserve">The Veteran Sprint has uploaded 56 JSTs to MAP, with estimated student savings of $332M and projected 20-year economic impact of $1.33B.</w:t>
       </w:r>
     </w:p>
     <w:p>
@@ -424,7 +424,7 @@
                 <w:szCs w:val="20"/>
                 <w:rFonts w:ascii="Cambria" w:cs="Cambria" w:eastAsia="Cambria" w:hAnsi="Cambria"/>
               </w:rPr>
-              <w:t xml:space="preserve">50,177</w:t>
+              <w:t xml:space="preserve">50,240</w:t>
             </w:r>
           </w:p>
         </w:tc>
@@ -494,7 +494,7 @@
                 <w:szCs w:val="20"/>
                 <w:rFonts w:ascii="Cambria" w:cs="Cambria" w:eastAsia="Cambria" w:hAnsi="Cambria"/>
               </w:rPr>
-              <w:t xml:space="preserve">221k</w:t>
+              <w:t xml:space="preserve">222k</w:t>
             </w:r>
           </w:p>
         </w:tc>
@@ -564,7 +564,7 @@
                 <w:szCs w:val="20"/>
                 <w:rFonts w:ascii="Cambria" w:cs="Cambria" w:eastAsia="Cambria" w:hAnsi="Cambria"/>
               </w:rPr>
-              <w:t xml:space="preserve">12,924</w:t>
+              <w:t xml:space="preserve">12,928</w:t>
             </w:r>
           </w:p>
         </w:tc>
@@ -774,7 +774,7 @@
                 <w:szCs w:val="20"/>
                 <w:rFonts w:ascii="Cambria" w:cs="Cambria" w:eastAsia="Cambria" w:hAnsi="Cambria"/>
               </w:rPr>
-              <w:t xml:space="preserve">$329M</w:t>
+              <w:t xml:space="preserve">$332M</w:t>
             </w:r>
           </w:p>
         </w:tc>
@@ -844,7 +844,7 @@
                 <w:szCs w:val="20"/>
                 <w:rFonts w:ascii="Cambria" w:cs="Cambria" w:eastAsia="Cambria" w:hAnsi="Cambria"/>
               </w:rPr>
-              <w:t xml:space="preserve">$1.31B</w:t>
+              <w:t xml:space="preserve">$1.33B</w:t>
             </w:r>
           </w:p>
         </w:tc>
@@ -29608,7 +29608,7 @@
           <w:szCs w:val="22"/>
           <w:rFonts w:ascii="Cambria" w:cs="Cambria" w:eastAsia="Cambria" w:hAnsi="Cambria"/>
         </w:rPr>
-        <w:t xml:space="preserve">The CPL Initiative has moved from pilot to scale, demonstrating measurable impact in student access, credit attainment, and system engagement. With 50,177 students served, 12,924 statewide credit recommendations, and 102 actively participating colleges, the initiative has surpassed most 2025–26 benchmarks ahead of schedule.</w:t>
+        <w:t xml:space="preserve">The CPL Initiative has moved from pilot to scale, demonstrating measurable impact in student access, credit attainment, and system engagement. With 50,240 students served, 12,928 statewide credit recommendations, and 102 actively participating colleges, the initiative has surpassed most 2025–26 benchmarks ahead of schedule.</w:t>
       </w:r>
     </w:p>
     <w:p>
@@ -29659,7 +29659,7 @@
           <w:szCs w:val="20"/>
           <w:rFonts w:ascii="Cambria" w:cs="Cambria" w:eastAsia="Cambria" w:hAnsi="Cambria"/>
         </w:rPr>
-        <w:t xml:space="preserve">August 18, 2026</w:t>
+        <w:t xml:space="preserve">August 19, 2026</w:t>
       </w:r>
     </w:p>
     <w:sectPr>
@@ -29696,7 +29696,7 @@
         <w:szCs w:val="14"/>
         <w:rFonts w:ascii="Cambria" w:cs="Cambria" w:eastAsia="Cambria" w:hAnsi="Cambria"/>
       </w:rPr>
-      <w:t xml:space="preserve">Generated August 18, 2026  |  California Community Colleges  |  CPL Initiative</w:t>
+      <w:t xml:space="preserve">Generated August 19, 2026  |  California Community Colleges  |  CPL Initiative</w:t>
     </w:r>
     <w:r>
       <w:rPr>

</xml_diff>

<commit_message>
Daily dashboard update — 2026-08-20
</commit_message>
<xml_diff>
--- a/reports/CPL_Master_Report.docx
+++ b/reports/CPL_Master_Report.docx
@@ -141,7 +141,7 @@
           <w:szCs w:val="22"/>
           <w:rFonts w:ascii="Cambria" w:cs="Cambria" w:eastAsia="Cambria" w:hAnsi="Cambria"/>
         </w:rPr>
-        <w:t xml:space="preserve">As of August 19, 2026, the CPL initiative is ahead of schedule, with most 2025–2026 targets met or exceeded and core infrastructure nearing completion. The work has expanded student access, increased transcripted units, and established the foundation for a permanent, statewide CPL service under Vision 2030.</w:t>
+        <w:t xml:space="preserve">As of August 20, 2026, the CPL initiative is ahead of schedule, with most 2025–2026 targets met or exceeded and core infrastructure nearing completion. The work has expanded student access, increased transcripted units, and established the foundation for a permanent, statewide CPL service under Vision 2030.</w:t>
       </w:r>
     </w:p>
     <w:p>
@@ -167,7 +167,7 @@
           <w:szCs w:val="21"/>
           <w:rFonts w:ascii="Cambria" w:cs="Cambria" w:eastAsia="Cambria" w:hAnsi="Cambria"/>
         </w:rPr>
-        <w:t xml:space="preserve">50,242 cumulative students served with CPL awards, surpassing annual targets.</w:t>
+        <w:t xml:space="preserve">50,621 cumulative students served with CPL awards, surpassing annual targets.</w:t>
       </w:r>
     </w:p>
     <w:p>
@@ -185,7 +185,7 @@
           <w:szCs w:val="21"/>
           <w:rFonts w:ascii="Cambria" w:cs="Cambria" w:eastAsia="Cambria" w:hAnsi="Cambria"/>
         </w:rPr>
-        <w:t xml:space="preserve">222k CPL units transcripted across the system.</w:t>
+        <w:t xml:space="preserve">223k CPL units transcripted across the system.</w:t>
       </w:r>
     </w:p>
     <w:p>
@@ -221,7 +221,7 @@
           <w:szCs w:val="21"/>
           <w:rFonts w:ascii="Cambria" w:cs="Cambria" w:eastAsia="Cambria" w:hAnsi="Cambria"/>
         </w:rPr>
-        <w:t xml:space="preserve">12,928 statewide credit recommendations, driven by faculty discipline workgroups spanning high-demand fields.</w:t>
+        <w:t xml:space="preserve">12,933 statewide credit recommendations, driven by faculty discipline workgroups spanning high-demand fields.</w:t>
       </w:r>
     </w:p>
     <w:p>
@@ -239,7 +239,7 @@
           <w:szCs w:val="21"/>
           <w:rFonts w:ascii="Cambria" w:cs="Cambria" w:eastAsia="Cambria" w:hAnsi="Cambria"/>
         </w:rPr>
-        <w:t xml:space="preserve">The Veteran Sprint has uploaded 56 JSTs to MAP, with estimated student savings of $332M and projected 20-year economic impact of $1.33B.</w:t>
+        <w:t xml:space="preserve">The Veteran Sprint has uploaded 57 JSTs to MAP, with estimated student savings of $334M and projected 20-year economic impact of $1.33B.</w:t>
       </w:r>
     </w:p>
     <w:p>
@@ -424,7 +424,7 @@
                 <w:szCs w:val="20"/>
                 <w:rFonts w:ascii="Cambria" w:cs="Cambria" w:eastAsia="Cambria" w:hAnsi="Cambria"/>
               </w:rPr>
-              <w:t xml:space="preserve">50,242</w:t>
+              <w:t xml:space="preserve">50,621</w:t>
             </w:r>
           </w:p>
         </w:tc>
@@ -494,7 +494,7 @@
                 <w:szCs w:val="20"/>
                 <w:rFonts w:ascii="Cambria" w:cs="Cambria" w:eastAsia="Cambria" w:hAnsi="Cambria"/>
               </w:rPr>
-              <w:t xml:space="preserve">222k</w:t>
+              <w:t xml:space="preserve">223k</w:t>
             </w:r>
           </w:p>
         </w:tc>
@@ -564,7 +564,7 @@
                 <w:szCs w:val="20"/>
                 <w:rFonts w:ascii="Cambria" w:cs="Cambria" w:eastAsia="Cambria" w:hAnsi="Cambria"/>
               </w:rPr>
-              <w:t xml:space="preserve">12,928</w:t>
+              <w:t xml:space="preserve">12,933</w:t>
             </w:r>
           </w:p>
         </w:tc>
@@ -704,7 +704,7 @@
                 <w:szCs w:val="20"/>
                 <w:rFonts w:ascii="Cambria" w:cs="Cambria" w:eastAsia="Cambria" w:hAnsi="Cambria"/>
               </w:rPr>
-              <w:t xml:space="preserve">56</w:t>
+              <w:t xml:space="preserve">57</w:t>
             </w:r>
           </w:p>
         </w:tc>
@@ -774,7 +774,7 @@
                 <w:szCs w:val="20"/>
                 <w:rFonts w:ascii="Cambria" w:cs="Cambria" w:eastAsia="Cambria" w:hAnsi="Cambria"/>
               </w:rPr>
-              <w:t xml:space="preserve">$332M</w:t>
+              <w:t xml:space="preserve">$334M</w:t>
             </w:r>
           </w:p>
         </w:tc>
@@ -29608,7 +29608,7 @@
           <w:szCs w:val="22"/>
           <w:rFonts w:ascii="Cambria" w:cs="Cambria" w:eastAsia="Cambria" w:hAnsi="Cambria"/>
         </w:rPr>
-        <w:t xml:space="preserve">The CPL Initiative has moved from pilot to scale, demonstrating measurable impact in student access, credit attainment, and system engagement. With 50,242 students served, 12,928 statewide credit recommendations, and 102 actively participating colleges, the initiative has surpassed most 2025–26 benchmarks ahead of schedule.</w:t>
+        <w:t xml:space="preserve">The CPL Initiative has moved from pilot to scale, demonstrating measurable impact in student access, credit attainment, and system engagement. With 50,621 students served, 12,933 statewide credit recommendations, and 102 actively participating colleges, the initiative has surpassed most 2025–26 benchmarks ahead of schedule.</w:t>
       </w:r>
     </w:p>
     <w:p>
@@ -29659,7 +29659,7 @@
           <w:szCs w:val="20"/>
           <w:rFonts w:ascii="Cambria" w:cs="Cambria" w:eastAsia="Cambria" w:hAnsi="Cambria"/>
         </w:rPr>
-        <w:t xml:space="preserve">August 19, 2026</w:t>
+        <w:t xml:space="preserve">August 20, 2026</w:t>
       </w:r>
     </w:p>
     <w:sectPr>
@@ -29696,7 +29696,7 @@
         <w:szCs w:val="14"/>
         <w:rFonts w:ascii="Cambria" w:cs="Cambria" w:eastAsia="Cambria" w:hAnsi="Cambria"/>
       </w:rPr>
-      <w:t xml:space="preserve">Generated August 19, 2026  |  California Community Colleges  |  CPL Initiative</w:t>
+      <w:t xml:space="preserve">Generated August 20, 2026  |  California Community Colleges  |  CPL Initiative</w:t>
     </w:r>
     <w:r>
       <w:rPr>

</xml_diff>

<commit_message>
Daily dashboard update — 2026-08-21
</commit_message>
<xml_diff>
--- a/reports/CPL_Master_Report.docx
+++ b/reports/CPL_Master_Report.docx
@@ -141,7 +141,7 @@
           <w:szCs w:val="22"/>
           <w:rFonts w:ascii="Cambria" w:cs="Cambria" w:eastAsia="Cambria" w:hAnsi="Cambria"/>
         </w:rPr>
-        <w:t xml:space="preserve">As of August 20, 2026, the CPL initiative is ahead of schedule, with most 2025–2026 targets met or exceeded and core infrastructure nearing completion. The work has expanded student access, increased transcripted units, and established the foundation for a permanent, statewide CPL service under Vision 2030.</w:t>
+        <w:t xml:space="preserve">As of August 21, 2026, the CPL initiative is ahead of schedule, with most 2025–2026 targets met or exceeded and core infrastructure nearing completion. The work has expanded student access, increased transcripted units, and established the foundation for a permanent, statewide CPL service under Vision 2030.</w:t>
       </w:r>
     </w:p>
     <w:p>
@@ -167,7 +167,7 @@
           <w:szCs w:val="21"/>
           <w:rFonts w:ascii="Cambria" w:cs="Cambria" w:eastAsia="Cambria" w:hAnsi="Cambria"/>
         </w:rPr>
-        <w:t xml:space="preserve">50,621 cumulative students served with CPL awards, surpassing annual targets.</w:t>
+        <w:t xml:space="preserve">50,635 cumulative students served with CPL awards, surpassing annual targets.</w:t>
       </w:r>
     </w:p>
     <w:p>
@@ -221,7 +221,7 @@
           <w:szCs w:val="21"/>
           <w:rFonts w:ascii="Cambria" w:cs="Cambria" w:eastAsia="Cambria" w:hAnsi="Cambria"/>
         </w:rPr>
-        <w:t xml:space="preserve">12,933 statewide credit recommendations, driven by faculty discipline workgroups spanning high-demand fields.</w:t>
+        <w:t xml:space="preserve">12,934 statewide credit recommendations, driven by faculty discipline workgroups spanning high-demand fields.</w:t>
       </w:r>
     </w:p>
     <w:p>
@@ -424,7 +424,7 @@
                 <w:szCs w:val="20"/>
                 <w:rFonts w:ascii="Cambria" w:cs="Cambria" w:eastAsia="Cambria" w:hAnsi="Cambria"/>
               </w:rPr>
-              <w:t xml:space="preserve">50,621</w:t>
+              <w:t xml:space="preserve">50,635</w:t>
             </w:r>
           </w:p>
         </w:tc>
@@ -564,7 +564,7 @@
                 <w:szCs w:val="20"/>
                 <w:rFonts w:ascii="Cambria" w:cs="Cambria" w:eastAsia="Cambria" w:hAnsi="Cambria"/>
               </w:rPr>
-              <w:t xml:space="preserve">12,933</w:t>
+              <w:t xml:space="preserve">12,934</w:t>
             </w:r>
           </w:p>
         </w:tc>
@@ -29608,7 +29608,7 @@
           <w:szCs w:val="22"/>
           <w:rFonts w:ascii="Cambria" w:cs="Cambria" w:eastAsia="Cambria" w:hAnsi="Cambria"/>
         </w:rPr>
-        <w:t xml:space="preserve">The CPL Initiative has moved from pilot to scale, demonstrating measurable impact in student access, credit attainment, and system engagement. With 50,621 students served, 12,933 statewide credit recommendations, and 102 actively participating colleges, the initiative has surpassed most 2025–26 benchmarks ahead of schedule.</w:t>
+        <w:t xml:space="preserve">The CPL Initiative has moved from pilot to scale, demonstrating measurable impact in student access, credit attainment, and system engagement. With 50,635 students served, 12,934 statewide credit recommendations, and 102 actively participating colleges, the initiative has surpassed most 2025–26 benchmarks ahead of schedule.</w:t>
       </w:r>
     </w:p>
     <w:p>
@@ -29659,7 +29659,7 @@
           <w:szCs w:val="20"/>
           <w:rFonts w:ascii="Cambria" w:cs="Cambria" w:eastAsia="Cambria" w:hAnsi="Cambria"/>
         </w:rPr>
-        <w:t xml:space="preserve">August 20, 2026</w:t>
+        <w:t xml:space="preserve">August 21, 2026</w:t>
       </w:r>
     </w:p>
     <w:sectPr>
@@ -29696,7 +29696,7 @@
         <w:szCs w:val="14"/>
         <w:rFonts w:ascii="Cambria" w:cs="Cambria" w:eastAsia="Cambria" w:hAnsi="Cambria"/>
       </w:rPr>
-      <w:t xml:space="preserve">Generated August 20, 2026  |  California Community Colleges  |  CPL Initiative</w:t>
+      <w:t xml:space="preserve">Generated August 21, 2026  |  California Community Colleges  |  CPL Initiative</w:t>
     </w:r>
     <w:r>
       <w:rPr>

</xml_diff>

<commit_message>
Daily dashboard update — 2026-08-22
</commit_message>
<xml_diff>
--- a/reports/CPL_Master_Report.docx
+++ b/reports/CPL_Master_Report.docx
@@ -141,7 +141,7 @@
           <w:szCs w:val="22"/>
           <w:rFonts w:ascii="Cambria" w:cs="Cambria" w:eastAsia="Cambria" w:hAnsi="Cambria"/>
         </w:rPr>
-        <w:t xml:space="preserve">As of August 21, 2026, the CPL initiative is ahead of schedule, with most 2025–2026 targets met or exceeded and core infrastructure nearing completion. The work has expanded student access, increased transcripted units, and established the foundation for a permanent, statewide CPL service under Vision 2030.</w:t>
+        <w:t xml:space="preserve">As of August 22, 2026, the CPL initiative is ahead of schedule, with most 2025–2026 targets met or exceeded and core infrastructure nearing completion. The work has expanded student access, increased transcripted units, and established the foundation for a permanent, statewide CPL service under Vision 2030.</w:t>
       </w:r>
     </w:p>
     <w:p>
@@ -167,7 +167,7 @@
           <w:szCs w:val="21"/>
           <w:rFonts w:ascii="Cambria" w:cs="Cambria" w:eastAsia="Cambria" w:hAnsi="Cambria"/>
         </w:rPr>
-        <w:t xml:space="preserve">50,635 cumulative students served with CPL awards, surpassing annual targets.</w:t>
+        <w:t xml:space="preserve">50,671 cumulative students served with CPL awards, surpassing annual targets.</w:t>
       </w:r>
     </w:p>
     <w:p>
@@ -221,7 +221,7 @@
           <w:szCs w:val="21"/>
           <w:rFonts w:ascii="Cambria" w:cs="Cambria" w:eastAsia="Cambria" w:hAnsi="Cambria"/>
         </w:rPr>
-        <w:t xml:space="preserve">12,934 statewide credit recommendations, driven by faculty discipline workgroups spanning high-demand fields.</w:t>
+        <w:t xml:space="preserve">12,947 statewide credit recommendations, driven by faculty discipline workgroups spanning high-demand fields.</w:t>
       </w:r>
     </w:p>
     <w:p>
@@ -424,7 +424,7 @@
                 <w:szCs w:val="20"/>
                 <w:rFonts w:ascii="Cambria" w:cs="Cambria" w:eastAsia="Cambria" w:hAnsi="Cambria"/>
               </w:rPr>
-              <w:t xml:space="preserve">50,635</w:t>
+              <w:t xml:space="preserve">50,671</w:t>
             </w:r>
           </w:p>
         </w:tc>
@@ -564,7 +564,7 @@
                 <w:szCs w:val="20"/>
                 <w:rFonts w:ascii="Cambria" w:cs="Cambria" w:eastAsia="Cambria" w:hAnsi="Cambria"/>
               </w:rPr>
-              <w:t xml:space="preserve">12,934</w:t>
+              <w:t xml:space="preserve">12,947</w:t>
             </w:r>
           </w:p>
         </w:tc>
@@ -29608,7 +29608,7 @@
           <w:szCs w:val="22"/>
           <w:rFonts w:ascii="Cambria" w:cs="Cambria" w:eastAsia="Cambria" w:hAnsi="Cambria"/>
         </w:rPr>
-        <w:t xml:space="preserve">The CPL Initiative has moved from pilot to scale, demonstrating measurable impact in student access, credit attainment, and system engagement. With 50,635 students served, 12,934 statewide credit recommendations, and 102 actively participating colleges, the initiative has surpassed most 2025–26 benchmarks ahead of schedule.</w:t>
+        <w:t xml:space="preserve">The CPL Initiative has moved from pilot to scale, demonstrating measurable impact in student access, credit attainment, and system engagement. With 50,671 students served, 12,947 statewide credit recommendations, and 102 actively participating colleges, the initiative has surpassed most 2025–26 benchmarks ahead of schedule.</w:t>
       </w:r>
     </w:p>
     <w:p>
@@ -29659,7 +29659,7 @@
           <w:szCs w:val="20"/>
           <w:rFonts w:ascii="Cambria" w:cs="Cambria" w:eastAsia="Cambria" w:hAnsi="Cambria"/>
         </w:rPr>
-        <w:t xml:space="preserve">August 21, 2026</w:t>
+        <w:t xml:space="preserve">August 22, 2026</w:t>
       </w:r>
     </w:p>
     <w:sectPr>
@@ -29696,7 +29696,7 @@
         <w:szCs w:val="14"/>
         <w:rFonts w:ascii="Cambria" w:cs="Cambria" w:eastAsia="Cambria" w:hAnsi="Cambria"/>
       </w:rPr>
-      <w:t xml:space="preserve">Generated August 21, 2026  |  California Community Colleges  |  CPL Initiative</w:t>
+      <w:t xml:space="preserve">Generated August 22, 2026  |  California Community Colleges  |  CPL Initiative</w:t>
     </w:r>
     <w:r>
       <w:rPr>

</xml_diff>

<commit_message>
Daily dashboard update — 2026-08-23
</commit_message>
<xml_diff>
--- a/reports/CPL_Master_Report.docx
+++ b/reports/CPL_Master_Report.docx
@@ -141,7 +141,7 @@
           <w:szCs w:val="22"/>
           <w:rFonts w:ascii="Cambria" w:cs="Cambria" w:eastAsia="Cambria" w:hAnsi="Cambria"/>
         </w:rPr>
-        <w:t xml:space="preserve">As of August 22, 2026, the CPL initiative is ahead of schedule, with most 2025–2026 targets met or exceeded and core infrastructure nearing completion. The work has expanded student access, increased transcripted units, and established the foundation for a permanent, statewide CPL service under Vision 2030.</w:t>
+        <w:t xml:space="preserve">As of August 23, 2026, the CPL initiative is ahead of schedule, with most 2025–2026 targets met or exceeded and core infrastructure nearing completion. The work has expanded student access, increased transcripted units, and established the foundation for a permanent, statewide CPL service under Vision 2030.</w:t>
       </w:r>
     </w:p>
     <w:p>
@@ -167,7 +167,7 @@
           <w:szCs w:val="21"/>
           <w:rFonts w:ascii="Cambria" w:cs="Cambria" w:eastAsia="Cambria" w:hAnsi="Cambria"/>
         </w:rPr>
-        <w:t xml:space="preserve">50,671 cumulative students served with CPL awards, surpassing annual targets.</w:t>
+        <w:t xml:space="preserve">50,665 cumulative students served with CPL awards, surpassing annual targets.</w:t>
       </w:r>
     </w:p>
     <w:p>
@@ -424,7 +424,7 @@
                 <w:szCs w:val="20"/>
                 <w:rFonts w:ascii="Cambria" w:cs="Cambria" w:eastAsia="Cambria" w:hAnsi="Cambria"/>
               </w:rPr>
-              <w:t xml:space="preserve">50,671</w:t>
+              <w:t xml:space="preserve">50,665</w:t>
             </w:r>
           </w:p>
         </w:tc>
@@ -29608,7 +29608,7 @@
           <w:szCs w:val="22"/>
           <w:rFonts w:ascii="Cambria" w:cs="Cambria" w:eastAsia="Cambria" w:hAnsi="Cambria"/>
         </w:rPr>
-        <w:t xml:space="preserve">The CPL Initiative has moved from pilot to scale, demonstrating measurable impact in student access, credit attainment, and system engagement. With 50,671 students served, 12,947 statewide credit recommendations, and 102 actively participating colleges, the initiative has surpassed most 2025–26 benchmarks ahead of schedule.</w:t>
+        <w:t xml:space="preserve">The CPL Initiative has moved from pilot to scale, demonstrating measurable impact in student access, credit attainment, and system engagement. With 50,665 students served, 12,947 statewide credit recommendations, and 102 actively participating colleges, the initiative has surpassed most 2025–26 benchmarks ahead of schedule.</w:t>
       </w:r>
     </w:p>
     <w:p>
@@ -29659,7 +29659,7 @@
           <w:szCs w:val="20"/>
           <w:rFonts w:ascii="Cambria" w:cs="Cambria" w:eastAsia="Cambria" w:hAnsi="Cambria"/>
         </w:rPr>
-        <w:t xml:space="preserve">August 22, 2026</w:t>
+        <w:t xml:space="preserve">August 23, 2026</w:t>
       </w:r>
     </w:p>
     <w:sectPr>
@@ -29696,7 +29696,7 @@
         <w:szCs w:val="14"/>
         <w:rFonts w:ascii="Cambria" w:cs="Cambria" w:eastAsia="Cambria" w:hAnsi="Cambria"/>
       </w:rPr>
-      <w:t xml:space="preserve">Generated August 22, 2026  |  California Community Colleges  |  CPL Initiative</w:t>
+      <w:t xml:space="preserve">Generated August 23, 2026  |  California Community Colleges  |  CPL Initiative</w:t>
     </w:r>
     <w:r>
       <w:rPr>

</xml_diff>

<commit_message>
Daily dashboard update — 2026-08-24
</commit_message>
<xml_diff>
--- a/reports/CPL_Master_Report.docx
+++ b/reports/CPL_Master_Report.docx
@@ -141,7 +141,7 @@
           <w:szCs w:val="22"/>
           <w:rFonts w:ascii="Cambria" w:cs="Cambria" w:eastAsia="Cambria" w:hAnsi="Cambria"/>
         </w:rPr>
-        <w:t xml:space="preserve">As of August 23, 2026, the CPL initiative is ahead of schedule, with most 2025–2026 targets met or exceeded and core infrastructure nearing completion. The work has expanded student access, increased transcripted units, and established the foundation for a permanent, statewide CPL service under Vision 2030.</w:t>
+        <w:t xml:space="preserve">As of August 24, 2026, the CPL initiative is ahead of schedule, with most 2025–2026 targets met or exceeded and core infrastructure nearing completion. The work has expanded student access, increased transcripted units, and established the foundation for a permanent, statewide CPL service under Vision 2030.</w:t>
       </w:r>
     </w:p>
     <w:p>
@@ -29659,7 +29659,7 @@
           <w:szCs w:val="20"/>
           <w:rFonts w:ascii="Cambria" w:cs="Cambria" w:eastAsia="Cambria" w:hAnsi="Cambria"/>
         </w:rPr>
-        <w:t xml:space="preserve">August 23, 2026</w:t>
+        <w:t xml:space="preserve">August 24, 2026</w:t>
       </w:r>
     </w:p>
     <w:sectPr>
@@ -29696,7 +29696,7 @@
         <w:szCs w:val="14"/>
         <w:rFonts w:ascii="Cambria" w:cs="Cambria" w:eastAsia="Cambria" w:hAnsi="Cambria"/>
       </w:rPr>
-      <w:t xml:space="preserve">Generated August 23, 2026  |  California Community Colleges  |  CPL Initiative</w:t>
+      <w:t xml:space="preserve">Generated August 24, 2026  |  California Community Colleges  |  CPL Initiative</w:t>
     </w:r>
     <w:r>
       <w:rPr>

</xml_diff>

<commit_message>
Daily dashboard update — 2026-08-25
</commit_message>
<xml_diff>
--- a/reports/CPL_Master_Report.docx
+++ b/reports/CPL_Master_Report.docx
@@ -141,7 +141,7 @@
           <w:szCs w:val="22"/>
           <w:rFonts w:ascii="Cambria" w:cs="Cambria" w:eastAsia="Cambria" w:hAnsi="Cambria"/>
         </w:rPr>
-        <w:t xml:space="preserve">As of August 24, 2026, the CPL initiative is ahead of schedule, with most 2025–2026 targets met or exceeded and core infrastructure nearing completion. The work has expanded student access, increased transcripted units, and established the foundation for a permanent, statewide CPL service under Vision 2030.</w:t>
+        <w:t xml:space="preserve">As of August 25, 2026, the CPL initiative is ahead of schedule, with most 2025–2026 targets met or exceeded and core infrastructure nearing completion. The work has expanded student access, increased transcripted units, and established the foundation for a permanent, statewide CPL service under Vision 2030.</w:t>
       </w:r>
     </w:p>
     <w:p>
@@ -167,7 +167,7 @@
           <w:szCs w:val="21"/>
           <w:rFonts w:ascii="Cambria" w:cs="Cambria" w:eastAsia="Cambria" w:hAnsi="Cambria"/>
         </w:rPr>
-        <w:t xml:space="preserve">50,666 cumulative students served with CPL awards, surpassing annual targets.</w:t>
+        <w:t xml:space="preserve">50,672 cumulative students served with CPL awards, surpassing annual targets.</w:t>
       </w:r>
     </w:p>
     <w:p>
@@ -221,7 +221,7 @@
           <w:szCs w:val="21"/>
           <w:rFonts w:ascii="Cambria" w:cs="Cambria" w:eastAsia="Cambria" w:hAnsi="Cambria"/>
         </w:rPr>
-        <w:t xml:space="preserve">12,947 statewide credit recommendations, driven by faculty discipline workgroups spanning high-demand fields.</w:t>
+        <w:t xml:space="preserve">12,948 statewide credit recommendations, driven by faculty discipline workgroups spanning high-demand fields.</w:t>
       </w:r>
     </w:p>
     <w:p>
@@ -424,7 +424,7 @@
                 <w:szCs w:val="20"/>
                 <w:rFonts w:ascii="Cambria" w:cs="Cambria" w:eastAsia="Cambria" w:hAnsi="Cambria"/>
               </w:rPr>
-              <w:t xml:space="preserve">50,666</w:t>
+              <w:t xml:space="preserve">50,672</w:t>
             </w:r>
           </w:p>
         </w:tc>
@@ -564,7 +564,7 @@
                 <w:szCs w:val="20"/>
                 <w:rFonts w:ascii="Cambria" w:cs="Cambria" w:eastAsia="Cambria" w:hAnsi="Cambria"/>
               </w:rPr>
-              <w:t xml:space="preserve">12,947</w:t>
+              <w:t xml:space="preserve">12,948</w:t>
             </w:r>
           </w:p>
         </w:tc>
@@ -29608,7 +29608,7 @@
           <w:szCs w:val="22"/>
           <w:rFonts w:ascii="Cambria" w:cs="Cambria" w:eastAsia="Cambria" w:hAnsi="Cambria"/>
         </w:rPr>
-        <w:t xml:space="preserve">The CPL Initiative has moved from pilot to scale, demonstrating measurable impact in student access, credit attainment, and system engagement. With 50,666 students served, 12,947 statewide credit recommendations, and 102 actively participating colleges, the initiative has surpassed most 2025–26 benchmarks ahead of schedule.</w:t>
+        <w:t xml:space="preserve">The CPL Initiative has moved from pilot to scale, demonstrating measurable impact in student access, credit attainment, and system engagement. With 50,672 students served, 12,948 statewide credit recommendations, and 102 actively participating colleges, the initiative has surpassed most 2025–26 benchmarks ahead of schedule.</w:t>
       </w:r>
     </w:p>
     <w:p>
@@ -29659,7 +29659,7 @@
           <w:szCs w:val="20"/>
           <w:rFonts w:ascii="Cambria" w:cs="Cambria" w:eastAsia="Cambria" w:hAnsi="Cambria"/>
         </w:rPr>
-        <w:t xml:space="preserve">August 24, 2026</w:t>
+        <w:t xml:space="preserve">August 25, 2026</w:t>
       </w:r>
     </w:p>
     <w:sectPr>
@@ -29696,7 +29696,7 @@
         <w:szCs w:val="14"/>
         <w:rFonts w:ascii="Cambria" w:cs="Cambria" w:eastAsia="Cambria" w:hAnsi="Cambria"/>
       </w:rPr>
-      <w:t xml:space="preserve">Generated August 24, 2026  |  California Community Colleges  |  CPL Initiative</w:t>
+      <w:t xml:space="preserve">Generated August 25, 2026  |  California Community Colleges  |  CPL Initiative</w:t>
     </w:r>
     <w:r>
       <w:rPr>

</xml_diff>

<commit_message>
Daily dashboard update — 2026-08-26
</commit_message>
<xml_diff>
--- a/reports/CPL_Master_Report.docx
+++ b/reports/CPL_Master_Report.docx
@@ -141,7 +141,7 @@
           <w:szCs w:val="22"/>
           <w:rFonts w:ascii="Cambria" w:cs="Cambria" w:eastAsia="Cambria" w:hAnsi="Cambria"/>
         </w:rPr>
-        <w:t xml:space="preserve">As of August 25, 2026, the CPL initiative is ahead of schedule, with most 2025–2026 targets met or exceeded and core infrastructure nearing completion. The work has expanded student access, increased transcripted units, and established the foundation for a permanent, statewide CPL service under Vision 2030.</w:t>
+        <w:t xml:space="preserve">As of August 26, 2026, the CPL initiative is ahead of schedule, with most 2025–2026 targets met or exceeded and core infrastructure nearing completion. The work has expanded student access, increased transcripted units, and established the foundation for a permanent, statewide CPL service under Vision 2030.</w:t>
       </w:r>
     </w:p>
     <w:p>
@@ -167,7 +167,7 @@
           <w:szCs w:val="21"/>
           <w:rFonts w:ascii="Cambria" w:cs="Cambria" w:eastAsia="Cambria" w:hAnsi="Cambria"/>
         </w:rPr>
-        <w:t xml:space="preserve">50,672 cumulative students served with CPL awards, surpassing annual targets.</w:t>
+        <w:t xml:space="preserve">50,742 cumulative students served with CPL awards, surpassing annual targets.</w:t>
       </w:r>
     </w:p>
     <w:p>
@@ -185,7 +185,7 @@
           <w:szCs w:val="21"/>
           <w:rFonts w:ascii="Cambria" w:cs="Cambria" w:eastAsia="Cambria" w:hAnsi="Cambria"/>
         </w:rPr>
-        <w:t xml:space="preserve">223k CPL units transcripted across the system.</w:t>
+        <w:t xml:space="preserve">224k CPL units transcripted across the system.</w:t>
       </w:r>
     </w:p>
     <w:p>
@@ -221,7 +221,7 @@
           <w:szCs w:val="21"/>
           <w:rFonts w:ascii="Cambria" w:cs="Cambria" w:eastAsia="Cambria" w:hAnsi="Cambria"/>
         </w:rPr>
-        <w:t xml:space="preserve">12,948 statewide credit recommendations, driven by faculty discipline workgroups spanning high-demand fields.</w:t>
+        <w:t xml:space="preserve">12,953 statewide credit recommendations, driven by faculty discipline workgroups spanning high-demand fields.</w:t>
       </w:r>
     </w:p>
     <w:p>
@@ -239,7 +239,7 @@
           <w:szCs w:val="21"/>
           <w:rFonts w:ascii="Cambria" w:cs="Cambria" w:eastAsia="Cambria" w:hAnsi="Cambria"/>
         </w:rPr>
-        <w:t xml:space="preserve">The Veteran Sprint has uploaded 57 JSTs to MAP, with estimated student savings of $334M and projected 20-year economic impact of $1.33B.</w:t>
+        <w:t xml:space="preserve">The Veteran Sprint has uploaded 57 JSTs to MAP, with estimated student savings of $335M and projected 20-year economic impact of $1.34B.</w:t>
       </w:r>
     </w:p>
     <w:p>
@@ -424,7 +424,7 @@
                 <w:szCs w:val="20"/>
                 <w:rFonts w:ascii="Cambria" w:cs="Cambria" w:eastAsia="Cambria" w:hAnsi="Cambria"/>
               </w:rPr>
-              <w:t xml:space="preserve">50,672</w:t>
+              <w:t xml:space="preserve">50,742</w:t>
             </w:r>
           </w:p>
         </w:tc>
@@ -494,7 +494,7 @@
                 <w:szCs w:val="20"/>
                 <w:rFonts w:ascii="Cambria" w:cs="Cambria" w:eastAsia="Cambria" w:hAnsi="Cambria"/>
               </w:rPr>
-              <w:t xml:space="preserve">223k</w:t>
+              <w:t xml:space="preserve">224k</w:t>
             </w:r>
           </w:p>
         </w:tc>
@@ -564,7 +564,7 @@
                 <w:szCs w:val="20"/>
                 <w:rFonts w:ascii="Cambria" w:cs="Cambria" w:eastAsia="Cambria" w:hAnsi="Cambria"/>
               </w:rPr>
-              <w:t xml:space="preserve">12,948</w:t>
+              <w:t xml:space="preserve">12,953</w:t>
             </w:r>
           </w:p>
         </w:tc>
@@ -774,7 +774,7 @@
                 <w:szCs w:val="20"/>
                 <w:rFonts w:ascii="Cambria" w:cs="Cambria" w:eastAsia="Cambria" w:hAnsi="Cambria"/>
               </w:rPr>
-              <w:t xml:space="preserve">$334M</w:t>
+              <w:t xml:space="preserve">$335M</w:t>
             </w:r>
           </w:p>
         </w:tc>
@@ -844,7 +844,7 @@
                 <w:szCs w:val="20"/>
                 <w:rFonts w:ascii="Cambria" w:cs="Cambria" w:eastAsia="Cambria" w:hAnsi="Cambria"/>
               </w:rPr>
-              <w:t xml:space="preserve">$1.33B</w:t>
+              <w:t xml:space="preserve">$1.34B</w:t>
             </w:r>
           </w:p>
         </w:tc>
@@ -29608,7 +29608,7 @@
           <w:szCs w:val="22"/>
           <w:rFonts w:ascii="Cambria" w:cs="Cambria" w:eastAsia="Cambria" w:hAnsi="Cambria"/>
         </w:rPr>
-        <w:t xml:space="preserve">The CPL Initiative has moved from pilot to scale, demonstrating measurable impact in student access, credit attainment, and system engagement. With 50,672 students served, 12,948 statewide credit recommendations, and 102 actively participating colleges, the initiative has surpassed most 2025–26 benchmarks ahead of schedule.</w:t>
+        <w:t xml:space="preserve">The CPL Initiative has moved from pilot to scale, demonstrating measurable impact in student access, credit attainment, and system engagement. With 50,742 students served, 12,953 statewide credit recommendations, and 102 actively participating colleges, the initiative has surpassed most 2025–26 benchmarks ahead of schedule.</w:t>
       </w:r>
     </w:p>
     <w:p>
@@ -29659,7 +29659,7 @@
           <w:szCs w:val="20"/>
           <w:rFonts w:ascii="Cambria" w:cs="Cambria" w:eastAsia="Cambria" w:hAnsi="Cambria"/>
         </w:rPr>
-        <w:t xml:space="preserve">August 25, 2026</w:t>
+        <w:t xml:space="preserve">August 26, 2026</w:t>
       </w:r>
     </w:p>
     <w:sectPr>
@@ -29696,7 +29696,7 @@
         <w:szCs w:val="14"/>
         <w:rFonts w:ascii="Cambria" w:cs="Cambria" w:eastAsia="Cambria" w:hAnsi="Cambria"/>
       </w:rPr>
-      <w:t xml:space="preserve">Generated August 25, 2026  |  California Community Colleges  |  CPL Initiative</w:t>
+      <w:t xml:space="preserve">Generated August 26, 2026  |  California Community Colleges  |  CPL Initiative</w:t>
     </w:r>
     <w:r>
       <w:rPr>

</xml_diff>

<commit_message>
Daily dashboard update — 2026-08-27
</commit_message>
<xml_diff>
--- a/reports/CPL_Master_Report.docx
+++ b/reports/CPL_Master_Report.docx
@@ -141,7 +141,7 @@
           <w:szCs w:val="22"/>
           <w:rFonts w:ascii="Cambria" w:cs="Cambria" w:eastAsia="Cambria" w:hAnsi="Cambria"/>
         </w:rPr>
-        <w:t xml:space="preserve">As of August 26, 2026, the CPL initiative is ahead of schedule, with most 2025–2026 targets met or exceeded and core infrastructure nearing completion. The work has expanded student access, increased transcripted units, and established the foundation for a permanent, statewide CPL service under Vision 2030.</w:t>
+        <w:t xml:space="preserve">As of August 27, 2026, the CPL initiative is ahead of schedule, with most 2025–2026 targets met or exceeded and core infrastructure nearing completion. The work has expanded student access, increased transcripted units, and established the foundation for a permanent, statewide CPL service under Vision 2030.</w:t>
       </w:r>
     </w:p>
     <w:p>
@@ -167,7 +167,7 @@
           <w:szCs w:val="21"/>
           <w:rFonts w:ascii="Cambria" w:cs="Cambria" w:eastAsia="Cambria" w:hAnsi="Cambria"/>
         </w:rPr>
-        <w:t xml:space="preserve">50,742 cumulative students served with CPL awards, surpassing annual targets.</w:t>
+        <w:t xml:space="preserve">50,805 cumulative students served with CPL awards, surpassing annual targets.</w:t>
       </w:r>
     </w:p>
     <w:p>
@@ -424,7 +424,7 @@
                 <w:szCs w:val="20"/>
                 <w:rFonts w:ascii="Cambria" w:cs="Cambria" w:eastAsia="Cambria" w:hAnsi="Cambria"/>
               </w:rPr>
-              <w:t xml:space="preserve">50,742</w:t>
+              <w:t xml:space="preserve">50,805</w:t>
             </w:r>
           </w:p>
         </w:tc>
@@ -29608,7 +29608,7 @@
           <w:szCs w:val="22"/>
           <w:rFonts w:ascii="Cambria" w:cs="Cambria" w:eastAsia="Cambria" w:hAnsi="Cambria"/>
         </w:rPr>
-        <w:t xml:space="preserve">The CPL Initiative has moved from pilot to scale, demonstrating measurable impact in student access, credit attainment, and system engagement. With 50,742 students served, 12,953 statewide credit recommendations, and 102 actively participating colleges, the initiative has surpassed most 2025–26 benchmarks ahead of schedule.</w:t>
+        <w:t xml:space="preserve">The CPL Initiative has moved from pilot to scale, demonstrating measurable impact in student access, credit attainment, and system engagement. With 50,805 students served, 12,953 statewide credit recommendations, and 102 actively participating colleges, the initiative has surpassed most 2025–26 benchmarks ahead of schedule.</w:t>
       </w:r>
     </w:p>
     <w:p>
@@ -29659,7 +29659,7 @@
           <w:szCs w:val="20"/>
           <w:rFonts w:ascii="Cambria" w:cs="Cambria" w:eastAsia="Cambria" w:hAnsi="Cambria"/>
         </w:rPr>
-        <w:t xml:space="preserve">August 26, 2026</w:t>
+        <w:t xml:space="preserve">August 27, 2026</w:t>
       </w:r>
     </w:p>
     <w:sectPr>
@@ -29696,7 +29696,7 @@
         <w:szCs w:val="14"/>
         <w:rFonts w:ascii="Cambria" w:cs="Cambria" w:eastAsia="Cambria" w:hAnsi="Cambria"/>
       </w:rPr>
-      <w:t xml:space="preserve">Generated August 26, 2026  |  California Community Colleges  |  CPL Initiative</w:t>
+      <w:t xml:space="preserve">Generated August 27, 2026  |  California Community Colleges  |  CPL Initiative</w:t>
     </w:r>
     <w:r>
       <w:rPr>

</xml_diff>

<commit_message>
Daily dashboard update — 2026-08-28
</commit_message>
<xml_diff>
--- a/reports/CPL_Master_Report.docx
+++ b/reports/CPL_Master_Report.docx
@@ -141,7 +141,7 @@
           <w:szCs w:val="22"/>
           <w:rFonts w:ascii="Cambria" w:cs="Cambria" w:eastAsia="Cambria" w:hAnsi="Cambria"/>
         </w:rPr>
-        <w:t xml:space="preserve">As of August 27, 2026, the CPL initiative is ahead of schedule, with most 2025–2026 targets met or exceeded and core infrastructure nearing completion. The work has expanded student access, increased transcripted units, and established the foundation for a permanent, statewide CPL service under Vision 2030.</w:t>
+        <w:t xml:space="preserve">As of August 28, 2026, the CPL initiative is ahead of schedule, with most 2025–2026 targets met or exceeded and core infrastructure nearing completion. The work has expanded student access, increased transcripted units, and established the foundation for a permanent, statewide CPL service under Vision 2030.</w:t>
       </w:r>
     </w:p>
     <w:p>
@@ -167,7 +167,7 @@
           <w:szCs w:val="21"/>
           <w:rFonts w:ascii="Cambria" w:cs="Cambria" w:eastAsia="Cambria" w:hAnsi="Cambria"/>
         </w:rPr>
-        <w:t xml:space="preserve">50,839 cumulative students served with CPL awards, surpassing annual targets.</w:t>
+        <w:t xml:space="preserve">50,843 cumulative students served with CPL awards, surpassing annual targets.</w:t>
       </w:r>
     </w:p>
     <w:p>
@@ -185,7 +185,7 @@
           <w:szCs w:val="21"/>
           <w:rFonts w:ascii="Cambria" w:cs="Cambria" w:eastAsia="Cambria" w:hAnsi="Cambria"/>
         </w:rPr>
-        <w:t xml:space="preserve">224k CPL units transcripted across the system.</w:t>
+        <w:t xml:space="preserve">217k CPL units transcripted across the system.</w:t>
       </w:r>
     </w:p>
     <w:p>
@@ -221,7 +221,7 @@
           <w:szCs w:val="21"/>
           <w:rFonts w:ascii="Cambria" w:cs="Cambria" w:eastAsia="Cambria" w:hAnsi="Cambria"/>
         </w:rPr>
-        <w:t xml:space="preserve">12,953 statewide credit recommendations, driven by faculty discipline workgroups spanning high-demand fields.</w:t>
+        <w:t xml:space="preserve">12,952 statewide credit recommendations, driven by faculty discipline workgroups spanning high-demand fields.</w:t>
       </w:r>
     </w:p>
     <w:p>
@@ -239,7 +239,7 @@
           <w:szCs w:val="21"/>
           <w:rFonts w:ascii="Cambria" w:cs="Cambria" w:eastAsia="Cambria" w:hAnsi="Cambria"/>
         </w:rPr>
-        <w:t xml:space="preserve">The Veteran Sprint has uploaded 57 JSTs to MAP, with estimated student savings of $336M and projected 20-year economic impact of $1.34B.</w:t>
+        <w:t xml:space="preserve">The Veteran Sprint has uploaded 57 JSTs to MAP, with estimated student savings of $324M and projected 20-year economic impact of $1.29B.</w:t>
       </w:r>
     </w:p>
     <w:p>
@@ -424,7 +424,7 @@
                 <w:szCs w:val="20"/>
                 <w:rFonts w:ascii="Cambria" w:cs="Cambria" w:eastAsia="Cambria" w:hAnsi="Cambria"/>
               </w:rPr>
-              <w:t xml:space="preserve">50,839</w:t>
+              <w:t xml:space="preserve">50,843</w:t>
             </w:r>
           </w:p>
         </w:tc>
@@ -494,7 +494,7 @@
                 <w:szCs w:val="20"/>
                 <w:rFonts w:ascii="Cambria" w:cs="Cambria" w:eastAsia="Cambria" w:hAnsi="Cambria"/>
               </w:rPr>
-              <w:t xml:space="preserve">224k</w:t>
+              <w:t xml:space="preserve">217k</w:t>
             </w:r>
           </w:p>
         </w:tc>
@@ -564,7 +564,7 @@
                 <w:szCs w:val="20"/>
                 <w:rFonts w:ascii="Cambria" w:cs="Cambria" w:eastAsia="Cambria" w:hAnsi="Cambria"/>
               </w:rPr>
-              <w:t xml:space="preserve">12,953</w:t>
+              <w:t xml:space="preserve">12,952</w:t>
             </w:r>
           </w:p>
         </w:tc>
@@ -774,7 +774,7 @@
                 <w:szCs w:val="20"/>
                 <w:rFonts w:ascii="Cambria" w:cs="Cambria" w:eastAsia="Cambria" w:hAnsi="Cambria"/>
               </w:rPr>
-              <w:t xml:space="preserve">$336M</w:t>
+              <w:t xml:space="preserve">$324M</w:t>
             </w:r>
           </w:p>
         </w:tc>
@@ -844,7 +844,7 @@
                 <w:szCs w:val="20"/>
                 <w:rFonts w:ascii="Cambria" w:cs="Cambria" w:eastAsia="Cambria" w:hAnsi="Cambria"/>
               </w:rPr>
-              <w:t xml:space="preserve">$1.34B</w:t>
+              <w:t xml:space="preserve">$1.29B</w:t>
             </w:r>
           </w:p>
         </w:tc>
@@ -29608,7 +29608,7 @@
           <w:szCs w:val="22"/>
           <w:rFonts w:ascii="Cambria" w:cs="Cambria" w:eastAsia="Cambria" w:hAnsi="Cambria"/>
         </w:rPr>
-        <w:t xml:space="preserve">The CPL Initiative has moved from pilot to scale, demonstrating measurable impact in student access, credit attainment, and system engagement. With 50,839 students served, 12,953 statewide credit recommendations, and 102 actively participating colleges, the initiative has surpassed most 2025–26 benchmarks ahead of schedule.</w:t>
+        <w:t xml:space="preserve">The CPL Initiative has moved from pilot to scale, demonstrating measurable impact in student access, credit attainment, and system engagement. With 50,843 students served, 12,952 statewide credit recommendations, and 102 actively participating colleges, the initiative has surpassed most 2025–26 benchmarks ahead of schedule.</w:t>
       </w:r>
     </w:p>
     <w:p>
@@ -29659,7 +29659,7 @@
           <w:szCs w:val="20"/>
           <w:rFonts w:ascii="Cambria" w:cs="Cambria" w:eastAsia="Cambria" w:hAnsi="Cambria"/>
         </w:rPr>
-        <w:t xml:space="preserve">August 27, 2026</w:t>
+        <w:t xml:space="preserve">August 28, 2026</w:t>
       </w:r>
     </w:p>
     <w:sectPr>
@@ -29696,7 +29696,7 @@
         <w:szCs w:val="14"/>
         <w:rFonts w:ascii="Cambria" w:cs="Cambria" w:eastAsia="Cambria" w:hAnsi="Cambria"/>
       </w:rPr>
-      <w:t xml:space="preserve">Generated August 27, 2026  |  California Community Colleges  |  CPL Initiative</w:t>
+      <w:t xml:space="preserve">Generated August 28, 2026  |  California Community Colleges  |  CPL Initiative</w:t>
     </w:r>
     <w:r>
       <w:rPr>

</xml_diff>

<commit_message>
Daily dashboard update — 2026-08-29
</commit_message>
<xml_diff>
--- a/reports/CPL_Master_Report.docx
+++ b/reports/CPL_Master_Report.docx
@@ -141,7 +141,7 @@
           <w:szCs w:val="22"/>
           <w:rFonts w:ascii="Cambria" w:cs="Cambria" w:eastAsia="Cambria" w:hAnsi="Cambria"/>
         </w:rPr>
-        <w:t xml:space="preserve">As of August 28, 2026, the CPL initiative is ahead of schedule, with most 2025–2026 targets met or exceeded and core infrastructure nearing completion. The work has expanded student access, increased transcripted units, and established the foundation for a permanent, statewide CPL service under Vision 2030.</w:t>
+        <w:t xml:space="preserve">As of August 29, 2026, the CPL initiative is ahead of schedule, with most 2025–2026 targets met or exceeded and core infrastructure nearing completion. The work has expanded student access, increased transcripted units, and established the foundation for a permanent, statewide CPL service under Vision 2030.</w:t>
       </w:r>
     </w:p>
     <w:p>
@@ -167,7 +167,7 @@
           <w:szCs w:val="21"/>
           <w:rFonts w:ascii="Cambria" w:cs="Cambria" w:eastAsia="Cambria" w:hAnsi="Cambria"/>
         </w:rPr>
-        <w:t xml:space="preserve">50,844 cumulative students served with CPL awards, surpassing annual targets.</w:t>
+        <w:t xml:space="preserve">50,874 cumulative students served with CPL awards, surpassing annual targets.</w:t>
       </w:r>
     </w:p>
     <w:p>
@@ -221,7 +221,7 @@
           <w:szCs w:val="21"/>
           <w:rFonts w:ascii="Cambria" w:cs="Cambria" w:eastAsia="Cambria" w:hAnsi="Cambria"/>
         </w:rPr>
-        <w:t xml:space="preserve">12,952 statewide credit recommendations, driven by faculty discipline workgroups spanning high-demand fields.</w:t>
+        <w:t xml:space="preserve">13,145 statewide credit recommendations, driven by faculty discipline workgroups spanning high-demand fields.</w:t>
       </w:r>
     </w:p>
     <w:p>
@@ -424,7 +424,7 @@
                 <w:szCs w:val="20"/>
                 <w:rFonts w:ascii="Cambria" w:cs="Cambria" w:eastAsia="Cambria" w:hAnsi="Cambria"/>
               </w:rPr>
-              <w:t xml:space="preserve">50,844</w:t>
+              <w:t xml:space="preserve">50,874</w:t>
             </w:r>
           </w:p>
         </w:tc>
@@ -564,7 +564,7 @@
                 <w:szCs w:val="20"/>
                 <w:rFonts w:ascii="Cambria" w:cs="Cambria" w:eastAsia="Cambria" w:hAnsi="Cambria"/>
               </w:rPr>
-              <w:t xml:space="preserve">12,952</w:t>
+              <w:t xml:space="preserve">13,145</w:t>
             </w:r>
           </w:p>
         </w:tc>
@@ -29608,7 +29608,7 @@
           <w:szCs w:val="22"/>
           <w:rFonts w:ascii="Cambria" w:cs="Cambria" w:eastAsia="Cambria" w:hAnsi="Cambria"/>
         </w:rPr>
-        <w:t xml:space="preserve">The CPL Initiative has moved from pilot to scale, demonstrating measurable impact in student access, credit attainment, and system engagement. With 50,844 students served, 12,952 statewide credit recommendations, and 102 actively participating colleges, the initiative has surpassed most 2025–26 benchmarks ahead of schedule.</w:t>
+        <w:t xml:space="preserve">The CPL Initiative has moved from pilot to scale, demonstrating measurable impact in student access, credit attainment, and system engagement. With 50,874 students served, 13,145 statewide credit recommendations, and 102 actively participating colleges, the initiative has surpassed most 2025–26 benchmarks ahead of schedule.</w:t>
       </w:r>
     </w:p>
     <w:p>
@@ -29659,7 +29659,7 @@
           <w:szCs w:val="20"/>
           <w:rFonts w:ascii="Cambria" w:cs="Cambria" w:eastAsia="Cambria" w:hAnsi="Cambria"/>
         </w:rPr>
-        <w:t xml:space="preserve">August 28, 2026</w:t>
+        <w:t xml:space="preserve">August 29, 2026</w:t>
       </w:r>
     </w:p>
     <w:sectPr>
@@ -29696,7 +29696,7 @@
         <w:szCs w:val="14"/>
         <w:rFonts w:ascii="Cambria" w:cs="Cambria" w:eastAsia="Cambria" w:hAnsi="Cambria"/>
       </w:rPr>
-      <w:t xml:space="preserve">Generated August 28, 2026  |  California Community Colleges  |  CPL Initiative</w:t>
+      <w:t xml:space="preserve">Generated August 29, 2026  |  California Community Colleges  |  CPL Initiative</w:t>
     </w:r>
     <w:r>
       <w:rPr>

</xml_diff>

<commit_message>
Daily dashboard update — 2026-08-30
</commit_message>
<xml_diff>
--- a/reports/CPL_Master_Report.docx
+++ b/reports/CPL_Master_Report.docx
@@ -141,7 +141,7 @@
           <w:szCs w:val="22"/>
           <w:rFonts w:ascii="Cambria" w:cs="Cambria" w:eastAsia="Cambria" w:hAnsi="Cambria"/>
         </w:rPr>
-        <w:t xml:space="preserve">As of August 29, 2026, the CPL initiative is ahead of schedule, with most 2025–2026 targets met or exceeded and core infrastructure nearing completion. The work has expanded student access, increased transcripted units, and established the foundation for a permanent, statewide CPL service under Vision 2030.</w:t>
+        <w:t xml:space="preserve">As of August 30, 2026, the CPL initiative is ahead of schedule, with most 2025–2026 targets met or exceeded and core infrastructure nearing completion. The work has expanded student access, increased transcripted units, and established the foundation for a permanent, statewide CPL service under Vision 2030.</w:t>
       </w:r>
     </w:p>
     <w:p>
@@ -29659,7 +29659,7 @@
           <w:szCs w:val="20"/>
           <w:rFonts w:ascii="Cambria" w:cs="Cambria" w:eastAsia="Cambria" w:hAnsi="Cambria"/>
         </w:rPr>
-        <w:t xml:space="preserve">August 29, 2026</w:t>
+        <w:t xml:space="preserve">August 30, 2026</w:t>
       </w:r>
     </w:p>
     <w:sectPr>
@@ -29696,7 +29696,7 @@
         <w:szCs w:val="14"/>
         <w:rFonts w:ascii="Cambria" w:cs="Cambria" w:eastAsia="Cambria" w:hAnsi="Cambria"/>
       </w:rPr>
-      <w:t xml:space="preserve">Generated August 29, 2026  |  California Community Colleges  |  CPL Initiative</w:t>
+      <w:t xml:space="preserve">Generated August 30, 2026  |  California Community Colleges  |  CPL Initiative</w:t>
     </w:r>
     <w:r>
       <w:rPr>

</xml_diff>

<commit_message>
Daily dashboard update — 2026-08-31
</commit_message>
<xml_diff>
--- a/reports/CPL_Master_Report.docx
+++ b/reports/CPL_Master_Report.docx
@@ -141,7 +141,7 @@
           <w:szCs w:val="22"/>
           <w:rFonts w:ascii="Cambria" w:cs="Cambria" w:eastAsia="Cambria" w:hAnsi="Cambria"/>
         </w:rPr>
-        <w:t xml:space="preserve">As of August 30, 2026, the CPL initiative is ahead of schedule, with most 2025–2026 targets met or exceeded and core infrastructure nearing completion. The work has expanded student access, increased transcripted units, and established the foundation for a permanent, statewide CPL service under Vision 2030.</w:t>
+        <w:t xml:space="preserve">As of August 31, 2026, the CPL initiative is ahead of schedule, with most 2025–2026 targets met or exceeded and core infrastructure nearing completion. The work has expanded student access, increased transcripted units, and established the foundation for a permanent, statewide CPL service under Vision 2030.</w:t>
       </w:r>
     </w:p>
     <w:p>
@@ -167,7 +167,7 @@
           <w:szCs w:val="21"/>
           <w:rFonts w:ascii="Cambria" w:cs="Cambria" w:eastAsia="Cambria" w:hAnsi="Cambria"/>
         </w:rPr>
-        <w:t xml:space="preserve">50,874 cumulative students served with CPL awards, surpassing annual targets.</w:t>
+        <w:t xml:space="preserve">50,878 cumulative students served with CPL awards, surpassing annual targets.</w:t>
       </w:r>
     </w:p>
     <w:p>
@@ -424,7 +424,7 @@
                 <w:szCs w:val="20"/>
                 <w:rFonts w:ascii="Cambria" w:cs="Cambria" w:eastAsia="Cambria" w:hAnsi="Cambria"/>
               </w:rPr>
-              <w:t xml:space="preserve">50,874</w:t>
+              <w:t xml:space="preserve">50,878</w:t>
             </w:r>
           </w:p>
         </w:tc>
@@ -29608,7 +29608,7 @@
           <w:szCs w:val="22"/>
           <w:rFonts w:ascii="Cambria" w:cs="Cambria" w:eastAsia="Cambria" w:hAnsi="Cambria"/>
         </w:rPr>
-        <w:t xml:space="preserve">The CPL Initiative has moved from pilot to scale, demonstrating measurable impact in student access, credit attainment, and system engagement. With 50,874 students served, 13,145 statewide credit recommendations, and 102 actively participating colleges, the initiative has surpassed most 2025–26 benchmarks ahead of schedule.</w:t>
+        <w:t xml:space="preserve">The CPL Initiative has moved from pilot to scale, demonstrating measurable impact in student access, credit attainment, and system engagement. With 50,878 students served, 13,145 statewide credit recommendations, and 102 actively participating colleges, the initiative has surpassed most 2025–26 benchmarks ahead of schedule.</w:t>
       </w:r>
     </w:p>
     <w:p>
@@ -29659,7 +29659,7 @@
           <w:szCs w:val="20"/>
           <w:rFonts w:ascii="Cambria" w:cs="Cambria" w:eastAsia="Cambria" w:hAnsi="Cambria"/>
         </w:rPr>
-        <w:t xml:space="preserve">August 30, 2026</w:t>
+        <w:t xml:space="preserve">August 31, 2026</w:t>
       </w:r>
     </w:p>
     <w:sectPr>
@@ -29696,7 +29696,7 @@
         <w:szCs w:val="14"/>
         <w:rFonts w:ascii="Cambria" w:cs="Cambria" w:eastAsia="Cambria" w:hAnsi="Cambria"/>
       </w:rPr>
-      <w:t xml:space="preserve">Generated August 30, 2026  |  California Community Colleges  |  CPL Initiative</w:t>
+      <w:t xml:space="preserve">Generated August 31, 2026  |  California Community Colleges  |  CPL Initiative</w:t>
     </w:r>
     <w:r>
       <w:rPr>

</xml_diff>

<commit_message>
Daily dashboard update — 2026-09-01
</commit_message>
<xml_diff>
--- a/reports/CPL_Master_Report.docx
+++ b/reports/CPL_Master_Report.docx
@@ -35,7 +35,7 @@
           <w:szCs w:val="36"/>
           <w:rFonts w:ascii="Cambria" w:cs="Cambria" w:eastAsia="Cambria" w:hAnsi="Cambria"/>
         </w:rPr>
-        <w:t xml:space="preserve">August 2026</w:t>
+        <w:t xml:space="preserve">September 2026</w:t>
       </w:r>
     </w:p>
     <w:p>
@@ -141,7 +141,7 @@
           <w:szCs w:val="22"/>
           <w:rFonts w:ascii="Cambria" w:cs="Cambria" w:eastAsia="Cambria" w:hAnsi="Cambria"/>
         </w:rPr>
-        <w:t xml:space="preserve">As of August 31, 2026, the CPL initiative is ahead of schedule, with most 2025–2026 targets met or exceeded and core infrastructure nearing completion. The work has expanded student access, increased transcripted units, and established the foundation for a permanent, statewide CPL service under Vision 2030.</w:t>
+        <w:t xml:space="preserve">As of September 1, 2026, the CPL initiative is ahead of schedule, with most 2025–2026 targets met or exceeded and core infrastructure nearing completion. The work has expanded student access, increased transcripted units, and established the foundation for a permanent, statewide CPL service under Vision 2030.</w:t>
       </w:r>
     </w:p>
     <w:p>
@@ -167,7 +167,7 @@
           <w:szCs w:val="21"/>
           <w:rFonts w:ascii="Cambria" w:cs="Cambria" w:eastAsia="Cambria" w:hAnsi="Cambria"/>
         </w:rPr>
-        <w:t xml:space="preserve">50,885 cumulative students served with CPL awards, surpassing annual targets.</w:t>
+        <w:t xml:space="preserve">50,890 cumulative students served with CPL awards, surpassing annual targets.</w:t>
       </w:r>
     </w:p>
     <w:p>
@@ -221,7 +221,7 @@
           <w:szCs w:val="21"/>
           <w:rFonts w:ascii="Cambria" w:cs="Cambria" w:eastAsia="Cambria" w:hAnsi="Cambria"/>
         </w:rPr>
-        <w:t xml:space="preserve">13,177 statewide credit recommendations, driven by faculty discipline workgroups spanning high-demand fields.</w:t>
+        <w:t xml:space="preserve">13,224 statewide credit recommendations, driven by faculty discipline workgroups spanning high-demand fields.</w:t>
       </w:r>
     </w:p>
     <w:p>
@@ -424,7 +424,7 @@
                 <w:szCs w:val="20"/>
                 <w:rFonts w:ascii="Cambria" w:cs="Cambria" w:eastAsia="Cambria" w:hAnsi="Cambria"/>
               </w:rPr>
-              <w:t xml:space="preserve">50,885</w:t>
+              <w:t xml:space="preserve">50,890</w:t>
             </w:r>
           </w:p>
         </w:tc>
@@ -564,7 +564,7 @@
                 <w:szCs w:val="20"/>
                 <w:rFonts w:ascii="Cambria" w:cs="Cambria" w:eastAsia="Cambria" w:hAnsi="Cambria"/>
               </w:rPr>
-              <w:t xml:space="preserve">13,177</w:t>
+              <w:t xml:space="preserve">13,224</w:t>
             </w:r>
           </w:p>
         </w:tc>
@@ -29608,7 +29608,7 @@
           <w:szCs w:val="22"/>
           <w:rFonts w:ascii="Cambria" w:cs="Cambria" w:eastAsia="Cambria" w:hAnsi="Cambria"/>
         </w:rPr>
-        <w:t xml:space="preserve">The CPL Initiative has moved from pilot to scale, demonstrating measurable impact in student access, credit attainment, and system engagement. With 50,885 students served, 13,177 statewide credit recommendations, and 102 actively participating colleges, the initiative has surpassed most 2025–26 benchmarks ahead of schedule.</w:t>
+        <w:t xml:space="preserve">The CPL Initiative has moved from pilot to scale, demonstrating measurable impact in student access, credit attainment, and system engagement. With 50,890 students served, 13,224 statewide credit recommendations, and 102 actively participating colleges, the initiative has surpassed most 2025–26 benchmarks ahead of schedule.</w:t>
       </w:r>
     </w:p>
     <w:p>
@@ -29659,7 +29659,7 @@
           <w:szCs w:val="20"/>
           <w:rFonts w:ascii="Cambria" w:cs="Cambria" w:eastAsia="Cambria" w:hAnsi="Cambria"/>
         </w:rPr>
-        <w:t xml:space="preserve">August 31, 2026</w:t>
+        <w:t xml:space="preserve">September 1, 2026</w:t>
       </w:r>
     </w:p>
     <w:sectPr>
@@ -29696,7 +29696,7 @@
         <w:szCs w:val="14"/>
         <w:rFonts w:ascii="Cambria" w:cs="Cambria" w:eastAsia="Cambria" w:hAnsi="Cambria"/>
       </w:rPr>
-      <w:t xml:space="preserve">Generated August 31, 2026  |  California Community Colleges  |  CPL Initiative</w:t>
+      <w:t xml:space="preserve">Generated September 1, 2026  |  California Community Colleges  |  CPL Initiative</w:t>
     </w:r>
     <w:r>
       <w:rPr>

</xml_diff>

<commit_message>
Daily dashboard update — 2026-09-02
</commit_message>
<xml_diff>
--- a/reports/CPL_Master_Report.docx
+++ b/reports/CPL_Master_Report.docx
@@ -141,7 +141,7 @@
           <w:szCs w:val="22"/>
           <w:rFonts w:ascii="Cambria" w:cs="Cambria" w:eastAsia="Cambria" w:hAnsi="Cambria"/>
         </w:rPr>
-        <w:t xml:space="preserve">As of September 1, 2026, the CPL initiative is ahead of schedule, with most 2025–2026 targets met or exceeded and core infrastructure nearing completion. The work has expanded student access, increased transcripted units, and established the foundation for a permanent, statewide CPL service under Vision 2030.</w:t>
+        <w:t xml:space="preserve">As of September 2, 2026, the CPL initiative is ahead of schedule, with most 2025–2026 targets met or exceeded and core infrastructure nearing completion. The work has expanded student access, increased transcripted units, and established the foundation for a permanent, statewide CPL service under Vision 2030.</w:t>
       </w:r>
     </w:p>
     <w:p>
@@ -167,7 +167,7 @@
           <w:szCs w:val="21"/>
           <w:rFonts w:ascii="Cambria" w:cs="Cambria" w:eastAsia="Cambria" w:hAnsi="Cambria"/>
         </w:rPr>
-        <w:t xml:space="preserve">50,896 cumulative students served with CPL awards, surpassing annual targets.</w:t>
+        <w:t xml:space="preserve">50,939 cumulative students served with CPL awards, surpassing annual targets.</w:t>
       </w:r>
     </w:p>
     <w:p>
@@ -221,7 +221,7 @@
           <w:szCs w:val="21"/>
           <w:rFonts w:ascii="Cambria" w:cs="Cambria" w:eastAsia="Cambria" w:hAnsi="Cambria"/>
         </w:rPr>
-        <w:t xml:space="preserve">13,224 statewide credit recommendations, driven by faculty discipline workgroups spanning high-demand fields.</w:t>
+        <w:t xml:space="preserve">13,227 statewide credit recommendations, driven by faculty discipline workgroups spanning high-demand fields.</w:t>
       </w:r>
     </w:p>
     <w:p>
@@ -424,7 +424,7 @@
                 <w:szCs w:val="20"/>
                 <w:rFonts w:ascii="Cambria" w:cs="Cambria" w:eastAsia="Cambria" w:hAnsi="Cambria"/>
               </w:rPr>
-              <w:t xml:space="preserve">50,896</w:t>
+              <w:t xml:space="preserve">50,939</w:t>
             </w:r>
           </w:p>
         </w:tc>
@@ -564,7 +564,7 @@
                 <w:szCs w:val="20"/>
                 <w:rFonts w:ascii="Cambria" w:cs="Cambria" w:eastAsia="Cambria" w:hAnsi="Cambria"/>
               </w:rPr>
-              <w:t xml:space="preserve">13,224</w:t>
+              <w:t xml:space="preserve">13,227</w:t>
             </w:r>
           </w:p>
         </w:tc>
@@ -29608,7 +29608,7 @@
           <w:szCs w:val="22"/>
           <w:rFonts w:ascii="Cambria" w:cs="Cambria" w:eastAsia="Cambria" w:hAnsi="Cambria"/>
         </w:rPr>
-        <w:t xml:space="preserve">The CPL Initiative has moved from pilot to scale, demonstrating measurable impact in student access, credit attainment, and system engagement. With 50,896 students served, 13,224 statewide credit recommendations, and 102 actively participating colleges, the initiative has surpassed most 2025–26 benchmarks ahead of schedule.</w:t>
+        <w:t xml:space="preserve">The CPL Initiative has moved from pilot to scale, demonstrating measurable impact in student access, credit attainment, and system engagement. With 50,939 students served, 13,227 statewide credit recommendations, and 102 actively participating colleges, the initiative has surpassed most 2025–26 benchmarks ahead of schedule.</w:t>
       </w:r>
     </w:p>
     <w:p>
@@ -29659,7 +29659,7 @@
           <w:szCs w:val="20"/>
           <w:rFonts w:ascii="Cambria" w:cs="Cambria" w:eastAsia="Cambria" w:hAnsi="Cambria"/>
         </w:rPr>
-        <w:t xml:space="preserve">September 1, 2026</w:t>
+        <w:t xml:space="preserve">September 2, 2026</w:t>
       </w:r>
     </w:p>
     <w:sectPr>
@@ -29696,7 +29696,7 @@
         <w:szCs w:val="14"/>
         <w:rFonts w:ascii="Cambria" w:cs="Cambria" w:eastAsia="Cambria" w:hAnsi="Cambria"/>
       </w:rPr>
-      <w:t xml:space="preserve">Generated September 1, 2026  |  California Community Colleges  |  CPL Initiative</w:t>
+      <w:t xml:space="preserve">Generated September 2, 2026  |  California Community Colleges  |  CPL Initiative</w:t>
     </w:r>
     <w:r>
       <w:rPr>

</xml_diff>

<commit_message>
Daily dashboard update — 2026-09-03
</commit_message>
<xml_diff>
--- a/reports/CPL_Master_Report.docx
+++ b/reports/CPL_Master_Report.docx
@@ -141,7 +141,7 @@
           <w:szCs w:val="22"/>
           <w:rFonts w:ascii="Cambria" w:cs="Cambria" w:eastAsia="Cambria" w:hAnsi="Cambria"/>
         </w:rPr>
-        <w:t xml:space="preserve">As of September 2, 2026, the CPL initiative is ahead of schedule, with most 2025–2026 targets met or exceeded and core infrastructure nearing completion. The work has expanded student access, increased transcripted units, and established the foundation for a permanent, statewide CPL service under Vision 2030.</w:t>
+        <w:t xml:space="preserve">As of September 3, 2026, the CPL initiative is ahead of schedule, with most 2025–2026 targets met or exceeded and core infrastructure nearing completion. The work has expanded student access, increased transcripted units, and established the foundation for a permanent, statewide CPL service under Vision 2030.</w:t>
       </w:r>
     </w:p>
     <w:p>
@@ -167,7 +167,7 @@
           <w:szCs w:val="21"/>
           <w:rFonts w:ascii="Cambria" w:cs="Cambria" w:eastAsia="Cambria" w:hAnsi="Cambria"/>
         </w:rPr>
-        <w:t xml:space="preserve">50,947 cumulative students served with CPL awards, surpassing annual targets.</w:t>
+        <w:t xml:space="preserve">50,968 cumulative students served with CPL awards, surpassing annual targets.</w:t>
       </w:r>
     </w:p>
     <w:p>
@@ -221,7 +221,7 @@
           <w:szCs w:val="21"/>
           <w:rFonts w:ascii="Cambria" w:cs="Cambria" w:eastAsia="Cambria" w:hAnsi="Cambria"/>
         </w:rPr>
-        <w:t xml:space="preserve">13,227 statewide credit recommendations, driven by faculty discipline workgroups spanning high-demand fields.</w:t>
+        <w:t xml:space="preserve">13,230 statewide credit recommendations, driven by faculty discipline workgroups spanning high-demand fields.</w:t>
       </w:r>
     </w:p>
     <w:p>
@@ -239,7 +239,7 @@
           <w:szCs w:val="21"/>
           <w:rFonts w:ascii="Cambria" w:cs="Cambria" w:eastAsia="Cambria" w:hAnsi="Cambria"/>
         </w:rPr>
-        <w:t xml:space="preserve">The Veteran Sprint has uploaded 57 JSTs to MAP, with estimated student savings of $324M and projected 20-year economic impact of $1.29B.</w:t>
+        <w:t xml:space="preserve">The Veteran Sprint has uploaded 57 JSTs to MAP, with estimated student savings of $325M and projected 20-year economic impact of $1.29B.</w:t>
       </w:r>
     </w:p>
     <w:p>
@@ -424,7 +424,7 @@
                 <w:szCs w:val="20"/>
                 <w:rFonts w:ascii="Cambria" w:cs="Cambria" w:eastAsia="Cambria" w:hAnsi="Cambria"/>
               </w:rPr>
-              <w:t xml:space="preserve">50,947</w:t>
+              <w:t xml:space="preserve">50,968</w:t>
             </w:r>
           </w:p>
         </w:tc>
@@ -564,7 +564,7 @@
                 <w:szCs w:val="20"/>
                 <w:rFonts w:ascii="Cambria" w:cs="Cambria" w:eastAsia="Cambria" w:hAnsi="Cambria"/>
               </w:rPr>
-              <w:t xml:space="preserve">13,227</w:t>
+              <w:t xml:space="preserve">13,230</w:t>
             </w:r>
           </w:p>
         </w:tc>
@@ -774,7 +774,7 @@
                 <w:szCs w:val="20"/>
                 <w:rFonts w:ascii="Cambria" w:cs="Cambria" w:eastAsia="Cambria" w:hAnsi="Cambria"/>
               </w:rPr>
-              <w:t xml:space="preserve">$324M</w:t>
+              <w:t xml:space="preserve">$325M</w:t>
             </w:r>
           </w:p>
         </w:tc>
@@ -29608,7 +29608,7 @@
           <w:szCs w:val="22"/>
           <w:rFonts w:ascii="Cambria" w:cs="Cambria" w:eastAsia="Cambria" w:hAnsi="Cambria"/>
         </w:rPr>
-        <w:t xml:space="preserve">The CPL Initiative has moved from pilot to scale, demonstrating measurable impact in student access, credit attainment, and system engagement. With 50,947 students served, 13,227 statewide credit recommendations, and 102 actively participating colleges, the initiative has surpassed most 2025–26 benchmarks ahead of schedule.</w:t>
+        <w:t xml:space="preserve">The CPL Initiative has moved from pilot to scale, demonstrating measurable impact in student access, credit attainment, and system engagement. With 50,968 students served, 13,230 statewide credit recommendations, and 102 actively participating colleges, the initiative has surpassed most 2025–26 benchmarks ahead of schedule.</w:t>
       </w:r>
     </w:p>
     <w:p>
@@ -29659,7 +29659,7 @@
           <w:szCs w:val="20"/>
           <w:rFonts w:ascii="Cambria" w:cs="Cambria" w:eastAsia="Cambria" w:hAnsi="Cambria"/>
         </w:rPr>
-        <w:t xml:space="preserve">September 2, 2026</w:t>
+        <w:t xml:space="preserve">September 3, 2026</w:t>
       </w:r>
     </w:p>
     <w:sectPr>
@@ -29696,7 +29696,7 @@
         <w:szCs w:val="14"/>
         <w:rFonts w:ascii="Cambria" w:cs="Cambria" w:eastAsia="Cambria" w:hAnsi="Cambria"/>
       </w:rPr>
-      <w:t xml:space="preserve">Generated September 2, 2026  |  California Community Colleges  |  CPL Initiative</w:t>
+      <w:t xml:space="preserve">Generated September 3, 2026  |  California Community Colleges  |  CPL Initiative</w:t>
     </w:r>
     <w:r>
       <w:rPr>

</xml_diff>

<commit_message>
Daily dashboard update — 2026-09-04
</commit_message>
<xml_diff>
--- a/reports/CPL_Master_Report.docx
+++ b/reports/CPL_Master_Report.docx
@@ -141,7 +141,7 @@
           <w:szCs w:val="22"/>
           <w:rFonts w:ascii="Cambria" w:cs="Cambria" w:eastAsia="Cambria" w:hAnsi="Cambria"/>
         </w:rPr>
-        <w:t xml:space="preserve">As of September 3, 2026, the CPL initiative is ahead of schedule, with most 2025–2026 targets met or exceeded and core infrastructure nearing completion. The work has expanded student access, increased transcripted units, and established the foundation for a permanent, statewide CPL service under Vision 2030.</w:t>
+        <w:t xml:space="preserve">As of September 4, 2026, the CPL initiative is ahead of schedule, with most 2025–2026 targets met or exceeded and core infrastructure nearing completion. The work has expanded student access, increased transcripted units, and established the foundation for a permanent, statewide CPL service under Vision 2030.</w:t>
       </w:r>
     </w:p>
     <w:p>
@@ -167,7 +167,7 @@
           <w:szCs w:val="21"/>
           <w:rFonts w:ascii="Cambria" w:cs="Cambria" w:eastAsia="Cambria" w:hAnsi="Cambria"/>
         </w:rPr>
-        <w:t xml:space="preserve">50,996 cumulative students served with CPL awards, surpassing annual targets.</w:t>
+        <w:t xml:space="preserve">50,995 cumulative students served with CPL awards, surpassing annual targets.</w:t>
       </w:r>
     </w:p>
     <w:p>
@@ -424,7 +424,7 @@
                 <w:szCs w:val="20"/>
                 <w:rFonts w:ascii="Cambria" w:cs="Cambria" w:eastAsia="Cambria" w:hAnsi="Cambria"/>
               </w:rPr>
-              <w:t xml:space="preserve">50,996</w:t>
+              <w:t xml:space="preserve">50,995</w:t>
             </w:r>
           </w:p>
         </w:tc>
@@ -29608,7 +29608,7 @@
           <w:szCs w:val="22"/>
           <w:rFonts w:ascii="Cambria" w:cs="Cambria" w:eastAsia="Cambria" w:hAnsi="Cambria"/>
         </w:rPr>
-        <w:t xml:space="preserve">The CPL Initiative has moved from pilot to scale, demonstrating measurable impact in student access, credit attainment, and system engagement. With 50,996 students served, 13,233 statewide credit recommendations, and 102 actively participating colleges, the initiative has surpassed most 2025–26 benchmarks ahead of schedule.</w:t>
+        <w:t xml:space="preserve">The CPL Initiative has moved from pilot to scale, demonstrating measurable impact in student access, credit attainment, and system engagement. With 50,995 students served, 13,233 statewide credit recommendations, and 102 actively participating colleges, the initiative has surpassed most 2025–26 benchmarks ahead of schedule.</w:t>
       </w:r>
     </w:p>
     <w:p>
@@ -29659,7 +29659,7 @@
           <w:szCs w:val="20"/>
           <w:rFonts w:ascii="Cambria" w:cs="Cambria" w:eastAsia="Cambria" w:hAnsi="Cambria"/>
         </w:rPr>
-        <w:t xml:space="preserve">September 3, 2026</w:t>
+        <w:t xml:space="preserve">September 4, 2026</w:t>
       </w:r>
     </w:p>
     <w:sectPr>
@@ -29696,7 +29696,7 @@
         <w:szCs w:val="14"/>
         <w:rFonts w:ascii="Cambria" w:cs="Cambria" w:eastAsia="Cambria" w:hAnsi="Cambria"/>
       </w:rPr>
-      <w:t xml:space="preserve">Generated September 3, 2026  |  California Community Colleges  |  CPL Initiative</w:t>
+      <w:t xml:space="preserve">Generated September 4, 2026  |  California Community Colleges  |  CPL Initiative</w:t>
     </w:r>
     <w:r>
       <w:rPr>

</xml_diff>

<commit_message>
Daily dashboard update — 2026-09-05
</commit_message>
<xml_diff>
--- a/reports/CPL_Master_Report.docx
+++ b/reports/CPL_Master_Report.docx
@@ -141,7 +141,7 @@
           <w:szCs w:val="22"/>
           <w:rFonts w:ascii="Cambria" w:cs="Cambria" w:eastAsia="Cambria" w:hAnsi="Cambria"/>
         </w:rPr>
-        <w:t xml:space="preserve">As of September 4, 2026, the CPL initiative is ahead of schedule, with most 2025–2026 targets met or exceeded and core infrastructure nearing completion. The work has expanded student access, increased transcripted units, and established the foundation for a permanent, statewide CPL service under Vision 2030.</w:t>
+        <w:t xml:space="preserve">As of September 5, 2026, the CPL initiative is ahead of schedule, with most 2025–2026 targets met or exceeded and core infrastructure nearing completion. The work has expanded student access, increased transcripted units, and established the foundation for a permanent, statewide CPL service under Vision 2030.</w:t>
       </w:r>
     </w:p>
     <w:p>
@@ -167,7 +167,7 @@
           <w:szCs w:val="21"/>
           <w:rFonts w:ascii="Cambria" w:cs="Cambria" w:eastAsia="Cambria" w:hAnsi="Cambria"/>
         </w:rPr>
-        <w:t xml:space="preserve">51,004 cumulative students served with CPL awards, surpassing annual targets.</w:t>
+        <w:t xml:space="preserve">51,041 cumulative students served with CPL awards, surpassing annual targets.</w:t>
       </w:r>
     </w:p>
     <w:p>
@@ -221,7 +221,7 @@
           <w:szCs w:val="21"/>
           <w:rFonts w:ascii="Cambria" w:cs="Cambria" w:eastAsia="Cambria" w:hAnsi="Cambria"/>
         </w:rPr>
-        <w:t xml:space="preserve">13,233 statewide credit recommendations, driven by faculty discipline workgroups spanning high-demand fields.</w:t>
+        <w:t xml:space="preserve">13,269 statewide credit recommendations, driven by faculty discipline workgroups spanning high-demand fields.</w:t>
       </w:r>
     </w:p>
     <w:p>
@@ -424,7 +424,7 @@
                 <w:szCs w:val="20"/>
                 <w:rFonts w:ascii="Cambria" w:cs="Cambria" w:eastAsia="Cambria" w:hAnsi="Cambria"/>
               </w:rPr>
-              <w:t xml:space="preserve">51,004</w:t>
+              <w:t xml:space="preserve">51,041</w:t>
             </w:r>
           </w:p>
         </w:tc>
@@ -564,7 +564,7 @@
                 <w:szCs w:val="20"/>
                 <w:rFonts w:ascii="Cambria" w:cs="Cambria" w:eastAsia="Cambria" w:hAnsi="Cambria"/>
               </w:rPr>
-              <w:t xml:space="preserve">13,233</w:t>
+              <w:t xml:space="preserve">13,269</w:t>
             </w:r>
           </w:p>
         </w:tc>
@@ -29608,7 +29608,7 @@
           <w:szCs w:val="22"/>
           <w:rFonts w:ascii="Cambria" w:cs="Cambria" w:eastAsia="Cambria" w:hAnsi="Cambria"/>
         </w:rPr>
-        <w:t xml:space="preserve">The CPL Initiative has moved from pilot to scale, demonstrating measurable impact in student access, credit attainment, and system engagement. With 51,004 students served, 13,233 statewide credit recommendations, and 102 actively participating colleges, the initiative has surpassed most 2025–26 benchmarks ahead of schedule.</w:t>
+        <w:t xml:space="preserve">The CPL Initiative has moved from pilot to scale, demonstrating measurable impact in student access, credit attainment, and system engagement. With 51,041 students served, 13,269 statewide credit recommendations, and 102 actively participating colleges, the initiative has surpassed most 2025–26 benchmarks ahead of schedule.</w:t>
       </w:r>
     </w:p>
     <w:p>
@@ -29659,7 +29659,7 @@
           <w:szCs w:val="20"/>
           <w:rFonts w:ascii="Cambria" w:cs="Cambria" w:eastAsia="Cambria" w:hAnsi="Cambria"/>
         </w:rPr>
-        <w:t xml:space="preserve">September 4, 2026</w:t>
+        <w:t xml:space="preserve">September 5, 2026</w:t>
       </w:r>
     </w:p>
     <w:sectPr>
@@ -29696,7 +29696,7 @@
         <w:szCs w:val="14"/>
         <w:rFonts w:ascii="Cambria" w:cs="Cambria" w:eastAsia="Cambria" w:hAnsi="Cambria"/>
       </w:rPr>
-      <w:t xml:space="preserve">Generated September 4, 2026  |  California Community Colleges  |  CPL Initiative</w:t>
+      <w:t xml:space="preserve">Generated September 5, 2026  |  California Community Colleges  |  CPL Initiative</w:t>
     </w:r>
     <w:r>
       <w:rPr>

</xml_diff>

<commit_message>
Daily dashboard update — 2026-09-06
</commit_message>
<xml_diff>
--- a/reports/CPL_Master_Report.docx
+++ b/reports/CPL_Master_Report.docx
@@ -141,7 +141,7 @@
           <w:szCs w:val="22"/>
           <w:rFonts w:ascii="Cambria" w:cs="Cambria" w:eastAsia="Cambria" w:hAnsi="Cambria"/>
         </w:rPr>
-        <w:t xml:space="preserve">As of September 5, 2026, the CPL initiative is ahead of schedule, with most 2025–2026 targets met or exceeded and core infrastructure nearing completion. The work has expanded student access, increased transcripted units, and established the foundation for a permanent, statewide CPL service under Vision 2030.</w:t>
+        <w:t xml:space="preserve">As of September 6, 2026, the CPL initiative is ahead of schedule, with most 2025–2026 targets met or exceeded and core infrastructure nearing completion. The work has expanded student access, increased transcripted units, and established the foundation for a permanent, statewide CPL service under Vision 2030.</w:t>
       </w:r>
     </w:p>
     <w:p>
@@ -29659,7 +29659,7 @@
           <w:szCs w:val="20"/>
           <w:rFonts w:ascii="Cambria" w:cs="Cambria" w:eastAsia="Cambria" w:hAnsi="Cambria"/>
         </w:rPr>
-        <w:t xml:space="preserve">September 5, 2026</w:t>
+        <w:t xml:space="preserve">September 6, 2026</w:t>
       </w:r>
     </w:p>
     <w:sectPr>
@@ -29696,7 +29696,7 @@
         <w:szCs w:val="14"/>
         <w:rFonts w:ascii="Cambria" w:cs="Cambria" w:eastAsia="Cambria" w:hAnsi="Cambria"/>
       </w:rPr>
-      <w:t xml:space="preserve">Generated September 5, 2026  |  California Community Colleges  |  CPL Initiative</w:t>
+      <w:t xml:space="preserve">Generated September 6, 2026  |  California Community Colleges  |  CPL Initiative</w:t>
     </w:r>
     <w:r>
       <w:rPr>

</xml_diff>

<commit_message>
Daily dashboard update — 2026-09-07
</commit_message>
<xml_diff>
--- a/reports/CPL_Master_Report.docx
+++ b/reports/CPL_Master_Report.docx
@@ -141,7 +141,7 @@
           <w:szCs w:val="22"/>
           <w:rFonts w:ascii="Cambria" w:cs="Cambria" w:eastAsia="Cambria" w:hAnsi="Cambria"/>
         </w:rPr>
-        <w:t xml:space="preserve">As of September 6, 2026, the CPL initiative is ahead of schedule, with most 2025–2026 targets met or exceeded and core infrastructure nearing completion. The work has expanded student access, increased transcripted units, and established the foundation for a permanent, statewide CPL service under Vision 2030.</w:t>
+        <w:t xml:space="preserve">As of September 7, 2026, the CPL initiative is ahead of schedule, with most 2025–2026 targets met or exceeded and core infrastructure nearing completion. The work has expanded student access, increased transcripted units, and established the foundation for a permanent, statewide CPL service under Vision 2030.</w:t>
       </w:r>
     </w:p>
     <w:p>
@@ -29659,7 +29659,7 @@
           <w:szCs w:val="20"/>
           <w:rFonts w:ascii="Cambria" w:cs="Cambria" w:eastAsia="Cambria" w:hAnsi="Cambria"/>
         </w:rPr>
-        <w:t xml:space="preserve">September 6, 2026</w:t>
+        <w:t xml:space="preserve">September 7, 2026</w:t>
       </w:r>
     </w:p>
     <w:sectPr>
@@ -29696,7 +29696,7 @@
         <w:szCs w:val="14"/>
         <w:rFonts w:ascii="Cambria" w:cs="Cambria" w:eastAsia="Cambria" w:hAnsi="Cambria"/>
       </w:rPr>
-      <w:t xml:space="preserve">Generated September 6, 2026  |  California Community Colleges  |  CPL Initiative</w:t>
+      <w:t xml:space="preserve">Generated September 7, 2026  |  California Community Colleges  |  CPL Initiative</w:t>
     </w:r>
     <w:r>
       <w:rPr>

</xml_diff>

<commit_message>
Daily dashboard update — 2026-09-08
</commit_message>
<xml_diff>
--- a/reports/CPL_Master_Report.docx
+++ b/reports/CPL_Master_Report.docx
@@ -141,7 +141,7 @@
           <w:szCs w:val="22"/>
           <w:rFonts w:ascii="Cambria" w:cs="Cambria" w:eastAsia="Cambria" w:hAnsi="Cambria"/>
         </w:rPr>
-        <w:t xml:space="preserve">As of September 7, 2026, the CPL initiative is ahead of schedule, with most 2025–2026 targets met or exceeded and core infrastructure nearing completion. The work has expanded student access, increased transcripted units, and established the foundation for a permanent, statewide CPL service under Vision 2030.</w:t>
+        <w:t xml:space="preserve">As of September 8, 2026, the CPL initiative is ahead of schedule, with most 2025–2026 targets met or exceeded and core infrastructure nearing completion. The work has expanded student access, increased transcripted units, and established the foundation for a permanent, statewide CPL service under Vision 2030.</w:t>
       </w:r>
     </w:p>
     <w:p>
@@ -167,7 +167,7 @@
           <w:szCs w:val="21"/>
           <w:rFonts w:ascii="Cambria" w:cs="Cambria" w:eastAsia="Cambria" w:hAnsi="Cambria"/>
         </w:rPr>
-        <w:t xml:space="preserve">51,057 cumulative students served with CPL awards, surpassing annual targets.</w:t>
+        <w:t xml:space="preserve">51,059 cumulative students served with CPL awards, surpassing annual targets.</w:t>
       </w:r>
     </w:p>
     <w:p>
@@ -424,7 +424,7 @@
                 <w:szCs w:val="20"/>
                 <w:rFonts w:ascii="Cambria" w:cs="Cambria" w:eastAsia="Cambria" w:hAnsi="Cambria"/>
               </w:rPr>
-              <w:t xml:space="preserve">51,057</w:t>
+              <w:t xml:space="preserve">51,059</w:t>
             </w:r>
           </w:p>
         </w:tc>
@@ -29608,7 +29608,7 @@
           <w:szCs w:val="22"/>
           <w:rFonts w:ascii="Cambria" w:cs="Cambria" w:eastAsia="Cambria" w:hAnsi="Cambria"/>
         </w:rPr>
-        <w:t xml:space="preserve">The CPL Initiative has moved from pilot to scale, demonstrating measurable impact in student access, credit attainment, and system engagement. With 51,057 students served, 13,269 statewide credit recommendations, and 102 actively participating colleges, the initiative has surpassed most 2025–26 benchmarks ahead of schedule.</w:t>
+        <w:t xml:space="preserve">The CPL Initiative has moved from pilot to scale, demonstrating measurable impact in student access, credit attainment, and system engagement. With 51,059 students served, 13,269 statewide credit recommendations, and 102 actively participating colleges, the initiative has surpassed most 2025–26 benchmarks ahead of schedule.</w:t>
       </w:r>
     </w:p>
     <w:p>
@@ -29659,7 +29659,7 @@
           <w:szCs w:val="20"/>
           <w:rFonts w:ascii="Cambria" w:cs="Cambria" w:eastAsia="Cambria" w:hAnsi="Cambria"/>
         </w:rPr>
-        <w:t xml:space="preserve">September 7, 2026</w:t>
+        <w:t xml:space="preserve">September 8, 2026</w:t>
       </w:r>
     </w:p>
     <w:sectPr>
@@ -29696,7 +29696,7 @@
         <w:szCs w:val="14"/>
         <w:rFonts w:ascii="Cambria" w:cs="Cambria" w:eastAsia="Cambria" w:hAnsi="Cambria"/>
       </w:rPr>
-      <w:t xml:space="preserve">Generated September 7, 2026  |  California Community Colleges  |  CPL Initiative</w:t>
+      <w:t xml:space="preserve">Generated September 8, 2026  |  California Community Colleges  |  CPL Initiative</w:t>
     </w:r>
     <w:r>
       <w:rPr>

</xml_diff>

<commit_message>
Daily dashboard update — 2026-09-10
</commit_message>
<xml_diff>
--- a/reports/CPL_Master_Report.docx
+++ b/reports/CPL_Master_Report.docx
@@ -141,7 +141,7 @@
           <w:szCs w:val="22"/>
           <w:rFonts w:ascii="Cambria" w:cs="Cambria" w:eastAsia="Cambria" w:hAnsi="Cambria"/>
         </w:rPr>
-        <w:t xml:space="preserve">As of September 8, 2026, the CPL initiative is ahead of schedule, with most 2025–2026 targets met or exceeded and core infrastructure nearing completion. The work has expanded student access, increased transcripted units, and established the foundation for a permanent, statewide CPL service under Vision 2030.</w:t>
+        <w:t xml:space="preserve">As of September 10, 2026, the CPL initiative is ahead of schedule, with most 2025–2026 targets met or exceeded and core infrastructure nearing completion. The work has expanded student access, increased transcripted units, and established the foundation for a permanent, statewide CPL service under Vision 2030.</w:t>
       </w:r>
     </w:p>
     <w:p>
@@ -167,7 +167,7 @@
           <w:szCs w:val="21"/>
           <w:rFonts w:ascii="Cambria" w:cs="Cambria" w:eastAsia="Cambria" w:hAnsi="Cambria"/>
         </w:rPr>
-        <w:t xml:space="preserve">51,059 cumulative students served with CPL awards, surpassing annual targets.</w:t>
+        <w:t xml:space="preserve">51,263 cumulative students served with CPL awards, surpassing annual targets.</w:t>
       </w:r>
     </w:p>
     <w:p>
@@ -185,7 +185,7 @@
           <w:szCs w:val="21"/>
           <w:rFonts w:ascii="Cambria" w:cs="Cambria" w:eastAsia="Cambria" w:hAnsi="Cambria"/>
         </w:rPr>
-        <w:t xml:space="preserve">218k CPL units transcripted across the system.</w:t>
+        <w:t xml:space="preserve">219k CPL units transcripted across the system.</w:t>
       </w:r>
     </w:p>
     <w:p>
@@ -221,7 +221,7 @@
           <w:szCs w:val="21"/>
           <w:rFonts w:ascii="Cambria" w:cs="Cambria" w:eastAsia="Cambria" w:hAnsi="Cambria"/>
         </w:rPr>
-        <w:t xml:space="preserve">13,269 statewide credit recommendations, driven by faculty discipline workgroups spanning high-demand fields.</w:t>
+        <w:t xml:space="preserve">13,277 statewide credit recommendations, driven by faculty discipline workgroups spanning high-demand fields.</w:t>
       </w:r>
     </w:p>
     <w:p>
@@ -239,7 +239,7 @@
           <w:szCs w:val="21"/>
           <w:rFonts w:ascii="Cambria" w:cs="Cambria" w:eastAsia="Cambria" w:hAnsi="Cambria"/>
         </w:rPr>
-        <w:t xml:space="preserve">The Veteran Sprint has uploaded 57 JSTs to MAP, with estimated student savings of $325M and projected 20-year economic impact of $1.29B.</w:t>
+        <w:t xml:space="preserve">The Veteran Sprint has uploaded 57 JSTs to MAP, with estimated student savings of $327M and projected 20-year economic impact of $1.3B.</w:t>
       </w:r>
     </w:p>
     <w:p>
@@ -424,7 +424,7 @@
                 <w:szCs w:val="20"/>
                 <w:rFonts w:ascii="Cambria" w:cs="Cambria" w:eastAsia="Cambria" w:hAnsi="Cambria"/>
               </w:rPr>
-              <w:t xml:space="preserve">51,059</w:t>
+              <w:t xml:space="preserve">51,263</w:t>
             </w:r>
           </w:p>
         </w:tc>
@@ -494,7 +494,7 @@
                 <w:szCs w:val="20"/>
                 <w:rFonts w:ascii="Cambria" w:cs="Cambria" w:eastAsia="Cambria" w:hAnsi="Cambria"/>
               </w:rPr>
-              <w:t xml:space="preserve">218k</w:t>
+              <w:t xml:space="preserve">219k</w:t>
             </w:r>
           </w:p>
         </w:tc>
@@ -564,7 +564,7 @@
                 <w:szCs w:val="20"/>
                 <w:rFonts w:ascii="Cambria" w:cs="Cambria" w:eastAsia="Cambria" w:hAnsi="Cambria"/>
               </w:rPr>
-              <w:t xml:space="preserve">13,269</w:t>
+              <w:t xml:space="preserve">13,277</w:t>
             </w:r>
           </w:p>
         </w:tc>
@@ -774,7 +774,7 @@
                 <w:szCs w:val="20"/>
                 <w:rFonts w:ascii="Cambria" w:cs="Cambria" w:eastAsia="Cambria" w:hAnsi="Cambria"/>
               </w:rPr>
-              <w:t xml:space="preserve">$325M</w:t>
+              <w:t xml:space="preserve">$327M</w:t>
             </w:r>
           </w:p>
         </w:tc>
@@ -844,7 +844,7 @@
                 <w:szCs w:val="20"/>
                 <w:rFonts w:ascii="Cambria" w:cs="Cambria" w:eastAsia="Cambria" w:hAnsi="Cambria"/>
               </w:rPr>
-              <w:t xml:space="preserve">$1.29B</w:t>
+              <w:t xml:space="preserve">$1.3B</w:t>
             </w:r>
           </w:p>
         </w:tc>
@@ -29608,7 +29608,7 @@
           <w:szCs w:val="22"/>
           <w:rFonts w:ascii="Cambria" w:cs="Cambria" w:eastAsia="Cambria" w:hAnsi="Cambria"/>
         </w:rPr>
-        <w:t xml:space="preserve">The CPL Initiative has moved from pilot to scale, demonstrating measurable impact in student access, credit attainment, and system engagement. With 51,059 students served, 13,269 statewide credit recommendations, and 102 actively participating colleges, the initiative has surpassed most 2025–26 benchmarks ahead of schedule.</w:t>
+        <w:t xml:space="preserve">The CPL Initiative has moved from pilot to scale, demonstrating measurable impact in student access, credit attainment, and system engagement. With 51,263 students served, 13,277 statewide credit recommendations, and 102 actively participating colleges, the initiative has surpassed most 2025–26 benchmarks ahead of schedule.</w:t>
       </w:r>
     </w:p>
     <w:p>
@@ -29659,7 +29659,7 @@
           <w:szCs w:val="20"/>
           <w:rFonts w:ascii="Cambria" w:cs="Cambria" w:eastAsia="Cambria" w:hAnsi="Cambria"/>
         </w:rPr>
-        <w:t xml:space="preserve">September 8, 2026</w:t>
+        <w:t xml:space="preserve">September 10, 2026</w:t>
       </w:r>
     </w:p>
     <w:sectPr>
@@ -29696,7 +29696,7 @@
         <w:szCs w:val="14"/>
         <w:rFonts w:ascii="Cambria" w:cs="Cambria" w:eastAsia="Cambria" w:hAnsi="Cambria"/>
       </w:rPr>
-      <w:t xml:space="preserve">Generated September 8, 2026  |  California Community Colleges  |  CPL Initiative</w:t>
+      <w:t xml:space="preserve">Generated September 10, 2026  |  California Community Colleges  |  CPL Initiative</w:t>
     </w:r>
     <w:r>
       <w:rPr>

</xml_diff>

<commit_message>
Daily dashboard update — 2026-09-11
</commit_message>
<xml_diff>
--- a/reports/CPL_Master_Report.docx
+++ b/reports/CPL_Master_Report.docx
@@ -141,7 +141,7 @@
           <w:szCs w:val="22"/>
           <w:rFonts w:ascii="Cambria" w:cs="Cambria" w:eastAsia="Cambria" w:hAnsi="Cambria"/>
         </w:rPr>
-        <w:t xml:space="preserve">As of September 10, 2026, the CPL initiative is ahead of schedule, with most 2025–2026 targets met or exceeded and core infrastructure nearing completion. The work has expanded student access, increased transcripted units, and established the foundation for a permanent, statewide CPL service under Vision 2030.</w:t>
+        <w:t xml:space="preserve">As of September 11, 2026, the CPL initiative is ahead of schedule, with most 2025–2026 targets met or exceeded and core infrastructure nearing completion. The work has expanded student access, increased transcripted units, and established the foundation for a permanent, statewide CPL service under Vision 2030.</w:t>
       </w:r>
     </w:p>
     <w:p>
@@ -167,7 +167,7 @@
           <w:szCs w:val="21"/>
           <w:rFonts w:ascii="Cambria" w:cs="Cambria" w:eastAsia="Cambria" w:hAnsi="Cambria"/>
         </w:rPr>
-        <w:t xml:space="preserve">51,265 cumulative students served with CPL awards, surpassing annual targets.</w:t>
+        <w:t xml:space="preserve">51,383 cumulative students served with CPL awards, surpassing annual targets.</w:t>
       </w:r>
     </w:p>
     <w:p>
@@ -221,7 +221,7 @@
           <w:szCs w:val="21"/>
           <w:rFonts w:ascii="Cambria" w:cs="Cambria" w:eastAsia="Cambria" w:hAnsi="Cambria"/>
         </w:rPr>
-        <w:t xml:space="preserve">13,293 statewide credit recommendations, driven by faculty discipline workgroups spanning high-demand fields.</w:t>
+        <w:t xml:space="preserve">13,298 statewide credit recommendations, driven by faculty discipline workgroups spanning high-demand fields.</w:t>
       </w:r>
     </w:p>
     <w:p>
@@ -239,7 +239,7 @@
           <w:szCs w:val="21"/>
           <w:rFonts w:ascii="Cambria" w:cs="Cambria" w:eastAsia="Cambria" w:hAnsi="Cambria"/>
         </w:rPr>
-        <w:t xml:space="preserve">The Veteran Sprint has uploaded 57 JSTs to MAP, with estimated student savings of $327M and projected 20-year economic impact of $1.3B.</w:t>
+        <w:t xml:space="preserve">The Veteran Sprint has uploaded 57 JSTs to MAP, with estimated student savings of $329M and projected 20-year economic impact of $1.3B.</w:t>
       </w:r>
     </w:p>
     <w:p>
@@ -424,7 +424,7 @@
                 <w:szCs w:val="20"/>
                 <w:rFonts w:ascii="Cambria" w:cs="Cambria" w:eastAsia="Cambria" w:hAnsi="Cambria"/>
               </w:rPr>
-              <w:t xml:space="preserve">51,265</w:t>
+              <w:t xml:space="preserve">51,383</w:t>
             </w:r>
           </w:p>
         </w:tc>
@@ -564,7 +564,7 @@
                 <w:szCs w:val="20"/>
                 <w:rFonts w:ascii="Cambria" w:cs="Cambria" w:eastAsia="Cambria" w:hAnsi="Cambria"/>
               </w:rPr>
-              <w:t xml:space="preserve">13,293</w:t>
+              <w:t xml:space="preserve">13,298</w:t>
             </w:r>
           </w:p>
         </w:tc>
@@ -774,7 +774,7 @@
                 <w:szCs w:val="20"/>
                 <w:rFonts w:ascii="Cambria" w:cs="Cambria" w:eastAsia="Cambria" w:hAnsi="Cambria"/>
               </w:rPr>
-              <w:t xml:space="preserve">$327M</w:t>
+              <w:t xml:space="preserve">$329M</w:t>
             </w:r>
           </w:p>
         </w:tc>
@@ -29608,7 +29608,7 @@
           <w:szCs w:val="22"/>
           <w:rFonts w:ascii="Cambria" w:cs="Cambria" w:eastAsia="Cambria" w:hAnsi="Cambria"/>
         </w:rPr>
-        <w:t xml:space="preserve">The CPL Initiative has moved from pilot to scale, demonstrating measurable impact in student access, credit attainment, and system engagement. With 51,265 students served, 13,293 statewide credit recommendations, and 102 actively participating colleges, the initiative has surpassed most 2025–26 benchmarks ahead of schedule.</w:t>
+        <w:t xml:space="preserve">The CPL Initiative has moved from pilot to scale, demonstrating measurable impact in student access, credit attainment, and system engagement. With 51,383 students served, 13,298 statewide credit recommendations, and 102 actively participating colleges, the initiative has surpassed most 2025–26 benchmarks ahead of schedule.</w:t>
       </w:r>
     </w:p>
     <w:p>
@@ -29659,7 +29659,7 @@
           <w:szCs w:val="20"/>
           <w:rFonts w:ascii="Cambria" w:cs="Cambria" w:eastAsia="Cambria" w:hAnsi="Cambria"/>
         </w:rPr>
-        <w:t xml:space="preserve">September 10, 2026</w:t>
+        <w:t xml:space="preserve">September 11, 2026</w:t>
       </w:r>
     </w:p>
     <w:sectPr>
@@ -29696,7 +29696,7 @@
         <w:szCs w:val="14"/>
         <w:rFonts w:ascii="Cambria" w:cs="Cambria" w:eastAsia="Cambria" w:hAnsi="Cambria"/>
       </w:rPr>
-      <w:t xml:space="preserve">Generated September 10, 2026  |  California Community Colleges  |  CPL Initiative</w:t>
+      <w:t xml:space="preserve">Generated September 11, 2026  |  California Community Colleges  |  CPL Initiative</w:t>
     </w:r>
     <w:r>
       <w:rPr>

</xml_diff>

<commit_message>
Daily dashboard update — 2026-09-12
</commit_message>
<xml_diff>
--- a/reports/CPL_Master_Report.docx
+++ b/reports/CPL_Master_Report.docx
@@ -141,7 +141,7 @@
           <w:szCs w:val="22"/>
           <w:rFonts w:ascii="Cambria" w:cs="Cambria" w:eastAsia="Cambria" w:hAnsi="Cambria"/>
         </w:rPr>
-        <w:t xml:space="preserve">As of September 11, 2026, the CPL initiative is ahead of schedule, with most 2025–2026 targets met or exceeded and core infrastructure nearing completion. The work has expanded student access, increased transcripted units, and established the foundation for a permanent, statewide CPL service under Vision 2030.</w:t>
+        <w:t xml:space="preserve">As of September 12, 2026, the CPL initiative is ahead of schedule, with most 2025–2026 targets met or exceeded and core infrastructure nearing completion. The work has expanded student access, increased transcripted units, and established the foundation for a permanent, statewide CPL service under Vision 2030.</w:t>
       </w:r>
     </w:p>
     <w:p>
@@ -167,7 +167,7 @@
           <w:szCs w:val="21"/>
           <w:rFonts w:ascii="Cambria" w:cs="Cambria" w:eastAsia="Cambria" w:hAnsi="Cambria"/>
         </w:rPr>
-        <w:t xml:space="preserve">51,387 cumulative students served with CPL awards, surpassing annual targets.</w:t>
+        <w:t xml:space="preserve">51,472 cumulative students served with CPL awards, surpassing annual targets.</w:t>
       </w:r>
     </w:p>
     <w:p>
@@ -185,7 +185,7 @@
           <w:szCs w:val="21"/>
           <w:rFonts w:ascii="Cambria" w:cs="Cambria" w:eastAsia="Cambria" w:hAnsi="Cambria"/>
         </w:rPr>
-        <w:t xml:space="preserve">219k CPL units transcripted across the system.</w:t>
+        <w:t xml:space="preserve">220k CPL units transcripted across the system.</w:t>
       </w:r>
     </w:p>
     <w:p>
@@ -203,7 +203,7 @@
           <w:szCs w:val="21"/>
           <w:rFonts w:ascii="Cambria" w:cs="Cambria" w:eastAsia="Cambria" w:hAnsi="Cambria"/>
         </w:rPr>
-        <w:t xml:space="preserve">102 colleges meeting active participation thresholds, exceeding the goal of 50.</w:t>
+        <w:t xml:space="preserve">103 colleges meeting active participation thresholds, exceeding the goal of 50.</w:t>
       </w:r>
     </w:p>
     <w:p>
@@ -221,7 +221,7 @@
           <w:szCs w:val="21"/>
           <w:rFonts w:ascii="Cambria" w:cs="Cambria" w:eastAsia="Cambria" w:hAnsi="Cambria"/>
         </w:rPr>
-        <w:t xml:space="preserve">13,298 statewide credit recommendations, driven by faculty discipline workgroups spanning high-demand fields.</w:t>
+        <w:t xml:space="preserve">13,299 statewide credit recommendations, driven by faculty discipline workgroups spanning high-demand fields.</w:t>
       </w:r>
     </w:p>
     <w:p>
@@ -239,7 +239,7 @@
           <w:szCs w:val="21"/>
           <w:rFonts w:ascii="Cambria" w:cs="Cambria" w:eastAsia="Cambria" w:hAnsi="Cambria"/>
         </w:rPr>
-        <w:t xml:space="preserve">The Veteran Sprint has uploaded 57 JSTs to MAP, with estimated student savings of $329M and projected 20-year economic impact of $1.3B.</w:t>
+        <w:t xml:space="preserve">The Veteran Sprint has uploaded 57 JSTs to MAP, with estimated student savings of $329M and projected 20-year economic impact of $1.31B.</w:t>
       </w:r>
     </w:p>
     <w:p>
@@ -424,7 +424,7 @@
                 <w:szCs w:val="20"/>
                 <w:rFonts w:ascii="Cambria" w:cs="Cambria" w:eastAsia="Cambria" w:hAnsi="Cambria"/>
               </w:rPr>
-              <w:t xml:space="preserve">51,387</w:t>
+              <w:t xml:space="preserve">51,472</w:t>
             </w:r>
           </w:p>
         </w:tc>
@@ -494,7 +494,7 @@
                 <w:szCs w:val="20"/>
                 <w:rFonts w:ascii="Cambria" w:cs="Cambria" w:eastAsia="Cambria" w:hAnsi="Cambria"/>
               </w:rPr>
-              <w:t xml:space="preserve">219k</w:t>
+              <w:t xml:space="preserve">220k</w:t>
             </w:r>
           </w:p>
         </w:tc>
@@ -564,7 +564,7 @@
                 <w:szCs w:val="20"/>
                 <w:rFonts w:ascii="Cambria" w:cs="Cambria" w:eastAsia="Cambria" w:hAnsi="Cambria"/>
               </w:rPr>
-              <w:t xml:space="preserve">13,298</w:t>
+              <w:t xml:space="preserve">13,299</w:t>
             </w:r>
           </w:p>
         </w:tc>
@@ -634,7 +634,7 @@
                 <w:szCs w:val="20"/>
                 <w:rFonts w:ascii="Cambria" w:cs="Cambria" w:eastAsia="Cambria" w:hAnsi="Cambria"/>
               </w:rPr>
-              <w:t xml:space="preserve">102</w:t>
+              <w:t xml:space="preserve">103</w:t>
             </w:r>
           </w:p>
         </w:tc>
@@ -844,7 +844,7 @@
                 <w:szCs w:val="20"/>
                 <w:rFonts w:ascii="Cambria" w:cs="Cambria" w:eastAsia="Cambria" w:hAnsi="Cambria"/>
               </w:rPr>
-              <w:t xml:space="preserve">$1.3B</w:t>
+              <w:t xml:space="preserve">$1.31B</w:t>
             </w:r>
           </w:p>
         </w:tc>
@@ -29608,7 +29608,7 @@
           <w:szCs w:val="22"/>
           <w:rFonts w:ascii="Cambria" w:cs="Cambria" w:eastAsia="Cambria" w:hAnsi="Cambria"/>
         </w:rPr>
-        <w:t xml:space="preserve">The CPL Initiative has moved from pilot to scale, demonstrating measurable impact in student access, credit attainment, and system engagement. With 51,387 students served, 13,298 statewide credit recommendations, and 102 actively participating colleges, the initiative has surpassed most 2025–26 benchmarks ahead of schedule.</w:t>
+        <w:t xml:space="preserve">The CPL Initiative has moved from pilot to scale, demonstrating measurable impact in student access, credit attainment, and system engagement. With 51,472 students served, 13,299 statewide credit recommendations, and 103 actively participating colleges, the initiative has surpassed most 2025–26 benchmarks ahead of schedule.</w:t>
       </w:r>
     </w:p>
     <w:p>
@@ -29659,7 +29659,7 @@
           <w:szCs w:val="20"/>
           <w:rFonts w:ascii="Cambria" w:cs="Cambria" w:eastAsia="Cambria" w:hAnsi="Cambria"/>
         </w:rPr>
-        <w:t xml:space="preserve">September 11, 2026</w:t>
+        <w:t xml:space="preserve">September 12, 2026</w:t>
       </w:r>
     </w:p>
     <w:sectPr>
@@ -29696,7 +29696,7 @@
         <w:szCs w:val="14"/>
         <w:rFonts w:ascii="Cambria" w:cs="Cambria" w:eastAsia="Cambria" w:hAnsi="Cambria"/>
       </w:rPr>
-      <w:t xml:space="preserve">Generated September 11, 2026  |  California Community Colleges  |  CPL Initiative</w:t>
+      <w:t xml:space="preserve">Generated September 12, 2026  |  California Community Colleges  |  CPL Initiative</w:t>
     </w:r>
     <w:r>
       <w:rPr>

</xml_diff>